<commit_message>
fix: update Dockerfile comparison details for clarity and accuracy
</commit_message>
<xml_diff>
--- a/docs/manuales-sena/Taller-Docker-Linux-CodeByMike.docx
+++ b/docs/manuales-sena/Taller-Docker-Linux-CodeByMike.docx
@@ -43,7 +43,7 @@
           <w:i w:val="0"/>
           <w:sz w:val="24"/>
         </w:rPr>
-        <w:t>Instalación, configuración y uso de Docker en GNU/Linux</w:t>
+        <w:t>Instalación y uso de Docker en Linux</w:t>
       </w:r>
     </w:p>
     <w:p>
@@ -59,7 +59,7 @@
           <w:i w:val="0"/>
           <w:sz w:val="24"/>
         </w:rPr>
-        <w:t>Adaptación de la guía del SENA a un entorno Ubuntu 24.04 LTS y aplicación al proyecto CodeByMike</w:t>
+        <w:t>Taller resuelto en Ubuntu 24.04 sobre el proyecto CodeByMike</w:t>
       </w:r>
     </w:p>
     <w:p>
@@ -82,7 +82,7 @@
           <w:i w:val="0"/>
           <w:sz w:val="24"/>
         </w:rPr>
-        <w:t>Michael David Rodriguez Beltran</w:t>
+        <w:t>Michael David Rodríguez Beltran</w:t>
       </w:r>
     </w:p>
     <w:p>
@@ -98,7 +98,7 @@
           <w:i w:val="0"/>
           <w:sz w:val="24"/>
         </w:rPr>
-        <w:t>Servicio Nacional de Aprendizaje (SENA), Centro de Servicios Financieros, Regional Distrito Capital</w:t>
+        <w:t>Servicio Nacional de Aprendizaje (SENA), Centro de Servicios Financieros</w:t>
       </w:r>
     </w:p>
     <w:p>
@@ -130,7 +130,7 @@
           <w:i w:val="0"/>
           <w:sz w:val="24"/>
         </w:rPr>
-        <w:t>Instructor(a): [NOMBRE DE LA DOCENTE]</w:t>
+        <w:t>Instructora: [NOMBRE DE LA DOCENTE]</w:t>
       </w:r>
     </w:p>
     <w:p>
@@ -216,7 +216,7 @@
           <w:i w:val="0"/>
           <w:sz w:val="24"/>
         </w:rPr>
-        <w:t>El presente informe documenta el desarrollo del taller de instalación y uso de Docker propuesto por el SENA, ejecutado sobre un entorno GNU/Linux (Ubuntu 24.04.4 LTS) en lugar del entorno Windows con Docker Desktop y WSL 2 descrito en la guía. Se justifica técnicamente cada desviación del procedimiento original, se establece una tabla de equivalencias entre la interfaz gráfica de Docker Desktop y la interfaz de línea de comandos de Docker Engine, y se resuelven los seis ejercicios prácticos de la sección 16 de la guía utilizando la infraestructura de contenedores real del proyecto CodeByMike (codebymike.tech) en sustitución de la aplicación de ejemplo Dino Run. Los conceptos evaluados (imagen, contenedor, Dockerfile, contexto de construcción, publicación de puertos, variables de entorno, bind mount, persistencia, registros y Docker Compose) se demuestran integros; únicamente cambia la aplicación sobre la cual se ejercitan y la vía de acceso al motor.</w:t>
+        <w:t>Este informe recoge el taller de Docker resuelto en un computador con Ubuntu 24.04 y no en Windows con Docker Desktop, que es el entorno de la guía. Explico qué pasos de la guía no aplican en Linux y por qué, y dejo una tabla que empareja cada pantalla de Docker Desktop con el comando que hace lo mismo en la terminal. Los seis ejercicios de la página 27 los desarrollé sobre mi propio proyecto, CodeByMike, que ya usa Docker para levantar sus bases de datos de desarrollo, en lugar de la aplicación de ejemplo Dino Run. Los temas que evalúa la guía siguen siendo los mismos: imagen, contenedor, Dockerfile, puertos, variables de entorno, bind mount, persistencia, logs y Compose.</w:t>
       </w:r>
     </w:p>
     <w:p>
@@ -244,7 +244,7 @@
           <w:b w:val="0"/>
           <w:i w:val="0"/>
         </w:rPr>
-        <w:t>Docker, contenedores, GNU/Linux, Docker Compose, bind mount, reproducibilidad, integración continua</w:t>
+        <w:t>Docker, contenedores, Linux, Docker Compose, bind mount</w:t>
       </w:r>
     </w:p>
     <w:p>
@@ -273,7 +273,7 @@
           <w:i w:val="0"/>
           <w:sz w:val="24"/>
         </w:rPr>
-        <w:t>Docker es una plataforma de virtualización a nivel de sistema operativo que permite empaquetar una aplicación junto con sus dependencias, su configuración y su comando de arranque en una unidad denominada imagen, a partir de la cual se ejecutan procesos aislados llamados contenedores (Docker Inc., 2026a). A diferencia de una máquina virtual, un contenedor no incorpora un sistema operativo completo: comparte el núcleo del sistema anfitrión y ejecuta únicamente los procesos de la aplicación, lo que reduce el consumo de recursos y acelera el arranque.</w:t>
+        <w:t>Docker sirve para empaquetar una aplicación con todo lo que necesita para correr y ejecutarla como un proceso aislado, al que se le llama contenedor. La diferencia con una máquina virtual es que el contenedor no trae un sistema operativo completo: usa el núcleo del computador donde corre y solo ejecuta lo suyo. Por eso arranca rápido y pesa mucho menos (Docker Inc., 2026a).</w:t>
       </w:r>
     </w:p>
     <w:p>
@@ -289,7 +289,7 @@
           <w:i w:val="0"/>
           <w:sz w:val="24"/>
         </w:rPr>
-        <w:t>La guía de formación Instalación y uso de Docker desarrolla este contenido sobre un entorno Windows, apoyandose en Docker Desktop, en el Subsistema de Windows para Linux en su versión 2 (WSL 2) y en el asistente Gordon. El equipo de trabajo del autor opera bajo Ubuntu 24.04.4 LTS, razón por la cual una parte sustancial del procedimiento de instalación descrito no resulta aplicable: no por dificultad técnica, sino porque el problema que dicho procedimiento resuelve no se presenta en este entorno.</w:t>
+        <w:t>La guía del curso enseña todo esto en Windows, con Docker Desktop, WSL 2 y el asistente Gordon. Mi computador tiene Ubuntu 24.04 y ahí buena parte de esa instalación no se puede hacer. No porque sea difícil, sino porque el problema que esos pasos resuelven no existe en Linux.</w:t>
       </w:r>
     </w:p>
     <w:p>
@@ -305,7 +305,7 @@
           <w:i w:val="0"/>
           <w:sz w:val="24"/>
         </w:rPr>
-        <w:t>Este informe no omite contenido de la guía. Documenta, para cada paso del procedimiento original, su equivalente en GNU/Linux o la razón técnica por la cual no aplica, y desarrolla los seis ejercicios prácticos propuestos en la sección 16 sobre la infraestructura de contenedores del proyecto CodeByMike, un portafolio profesional con panel de control y portal de clientes construido con Astro, Turso/libSQL y desplegado en Vercel.</w:t>
+        <w:t>Para no entregar un trabajo incompleto, lo que hice fue ir paso por paso de la guía y responder dos cosas: si el paso aplica en Linux, cómo se hace; y si no aplica, por qué no. Los ejercicios prácticos los desarrollé sobre mi proyecto de portafolio, que ya tenía Docker configurado desde antes del curso. Es una aplicación web hecha con Astro y con base de datos Turso, y usa contenedores para levantar las bases de datos mientras programo.</w:t>
       </w:r>
     </w:p>
     <w:p>
@@ -318,7 +318,7 @@
         <w:pStyle w:val="Heading1"/>
       </w:pPr>
       <w:r>
-        <w:t>Justificación de la Adaptación al Entorno GNU/Linux</w:t>
+        <w:t>Por Qué Mi Instalación Se Ve Distinta a la de la Guía</w:t>
       </w:r>
     </w:p>
     <w:p>
@@ -334,7 +334,7 @@
           <w:i w:val="0"/>
           <w:sz w:val="24"/>
         </w:rPr>
-        <w:t>Docker se concibió originalmente como una herramienta de GNU/Linux y su motor se apoya en dos mecanismos propios del núcleo de ese sistema: los espacios de nombres (namespaces), que aislan la vista que un proceso tiene del sistema, y los grupos de control (cgroups), que limitan los recursos que puede consumir (Docker Inc., 2026a). En consecuencia, para ejecutar contenedores Linux se requiere un núcleo Linux.</w:t>
+        <w:t>Docker nació en Linux. El motor se apoya en dos cosas del núcleo de Linux: los namespaces, que hacen que un proceso solo vea lo que le corresponde, y los cgroups, que le limitan cuánta memoria y cuánto procesador puede gastar (Docker Inc., 2026a). Entonces, para correr contenedores de Linux hace falta un núcleo de Linux.</w:t>
       </w:r>
     </w:p>
     <w:p>
@@ -350,7 +350,7 @@
           <w:i w:val="0"/>
           <w:sz w:val="24"/>
         </w:rPr>
-        <w:t>WSL 2 es precisamente el mecanismo mediante el cual Windows obtiene ese núcleo: una máquina virtual ligera y gestionada que ejecuta un núcleo Linux real, sobre la cual Docker Desktop arranca el motor (Docker Inc., 2026b). Este es el punto central de la adaptación y conviene enunciarlo con precisión: en el procedimiento descrito por la guía, la aplicación tampoco se ejecuta sobre Windows, sino sobre una distribución de Linux alojada en WSL 2. Docker Desktop constituye la capa de integración que oculta ese hecho al usuario.</w:t>
+        <w:t>Ahí es donde entra WSL 2. Windows no tiene ese núcleo, así que instala una máquina virtual pequeña con un Linux real adentro, y sobre esa máquina Docker Desktop levanta el motor (Docker Inc., 2026b). Esto me parece lo más importante de toda la adaptación: cuando alguien sigue la guía en Windows, la aplicación tampoco está corriendo en Windows. Está corriendo en un Linux escondido dentro de WSL 2. Docker Desktop es la capa que hace que uno no se dé cuenta.</w:t>
       </w:r>
     </w:p>
     <w:p>
@@ -366,7 +366,7 @@
           <w:i w:val="0"/>
           <w:sz w:val="24"/>
         </w:rPr>
-        <w:t>Al trabajar directamente sobre Ubuntu, el núcleo requerido es el del propio sistema. Desaparecen por tanto la instalación de WSL 2, la habilitación de la virtualización por hardware en BIOS/UEFI y la capa de virtualización intermedia. El motor se instala como un servicio del sistema administrado por systemd y se opera mediante la interfaz de línea de comandos. La Tabla 1 detalla la correspondencia completa.</w:t>
+        <w:t>En mi caso el núcleo ya es el del sistema, así que no hay nada que instalar por debajo. No hay WSL, no hay que habilitar virtualización en la BIOS y no hay máquina virtual intermedia. Docker queda como un servicio del sistema y se maneja desde la terminal. En la Tabla 1 dejo la comparación completa.</w:t>
       </w:r>
     </w:p>
     <w:p>
@@ -400,7 +400,7 @@
           <w:i/>
           <w:sz w:val="24"/>
         </w:rPr>
-        <w:t>Correspondencia entre el procedimiento de la guía (Windows) y el entorno GNU/Linux</w:t>
+        <w:t>Comparación entre lo que pide la guía y lo que hice en Linux</w:t>
       </w:r>
     </w:p>
     <w:tbl>
@@ -466,7 +466,7 @@
                 <w:b/>
                 <w:sz w:val="20"/>
               </w:rPr>
-              <w:t>Situación en GNU/Linux</w:t>
+              <w:t>Qué pasa en mi equipo</w:t>
             </w:r>
           </w:p>
         </w:tc>
@@ -489,7 +489,7 @@
                 <w:b/>
                 <w:sz w:val="20"/>
               </w:rPr>
-              <w:t>Evidencia sustitutiva</w:t>
+              <w:t>Con qué lo reemplacé</w:t>
             </w:r>
           </w:p>
         </w:tc>
@@ -529,7 +529,7 @@
                 <w:rFonts w:ascii="Times New Roman" w:hAnsi="Times New Roman"/>
                 <w:sz w:val="20"/>
               </w:rPr>
-              <w:t>No aplica. En Linux, Docker Desktop es opcional y solo agrega una interfaz gráfica y una máquina virtual intermedia. Se emplea Docker Engine nativo.</w:t>
+              <w:t>En Linux, Docker Desktop es opcional. Solo agrega una interfaz gráfica y una máquina virtual que no necesito. Uso Docker Engine directo.</w:t>
             </w:r>
           </w:p>
         </w:tc>
@@ -548,7 +548,7 @@
                 <w:rFonts w:ascii="Times New Roman" w:hAnsi="Times New Roman"/>
                 <w:sz w:val="20"/>
               </w:rPr>
-              <w:t>docker --version, docker info con el motor nativo</w:t>
+              <w:t>docker --version y docker info mostrando el motor</w:t>
             </w:r>
           </w:p>
         </w:tc>
@@ -569,7 +569,7 @@
                 <w:rFonts w:ascii="Times New Roman" w:hAnsi="Times New Roman"/>
                 <w:sz w:val="20"/>
               </w:rPr>
-              <w:t>Activar WSL 2 (sección 5.1)</w:t>
+              <w:t>Instalar WSL 2 (sección 5.1)</w:t>
             </w:r>
           </w:p>
         </w:tc>
@@ -588,7 +588,7 @@
                 <w:rFonts w:ascii="Times New Roman" w:hAnsi="Times New Roman"/>
                 <w:sz w:val="20"/>
               </w:rPr>
-              <w:t>No existe. El núcleo Linux es el del propio sistema operativo.</w:t>
+              <w:t>No existe en Linux. El núcleo ya es el del sistema.</w:t>
             </w:r>
           </w:p>
         </w:tc>
@@ -607,7 +607,7 @@
                 <w:rFonts w:ascii="Times New Roman" w:hAnsi="Times New Roman"/>
                 <w:sz w:val="20"/>
               </w:rPr>
-              <w:t>uname -r, que identifica el núcleo compartido con los contenedores</w:t>
+              <w:t>uname -r, que muestra el núcleo que comparten los contenedores</w:t>
             </w:r>
           </w:p>
         </w:tc>
@@ -628,7 +628,7 @@
                 <w:rFonts w:ascii="Times New Roman" w:hAnsi="Times New Roman"/>
                 <w:sz w:val="20"/>
               </w:rPr>
-              <w:t>Habilitar virtualización en BIOS/UEFI (sección 5.2)</w:t>
+              <w:t>Habilitar virtualización en BIOS (sección 5.2)</w:t>
             </w:r>
           </w:p>
         </w:tc>
@@ -647,7 +647,7 @@
                 <w:rFonts w:ascii="Times New Roman" w:hAnsi="Times New Roman"/>
                 <w:sz w:val="20"/>
               </w:rPr>
-              <w:t>No se requiere. Los contenedores son procesos aislados mediante namespaces y cgroups, no máquinas virtuales.</w:t>
+              <w:t>No se necesita. Los contenedores no son máquinas virtuales, son procesos aislados.</w:t>
             </w:r>
           </w:p>
         </w:tc>
@@ -666,7 +666,7 @@
                 <w:rFonts w:ascii="Times New Roman" w:hAnsi="Times New Roman"/>
                 <w:sz w:val="20"/>
               </w:rPr>
-              <w:t>docker info mostrando apparmor, seccomp y cgroupns</w:t>
+              <w:t>docker info, donde aparecen apparmor, seccomp y cgroupns</w:t>
             </w:r>
           </w:p>
         </w:tc>
@@ -687,7 +687,7 @@
                 <w:rFonts w:ascii="Times New Roman" w:hAnsi="Times New Roman"/>
                 <w:sz w:val="20"/>
               </w:rPr>
-              <w:t>Panel con estado Engine running (sección 5.3)</w:t>
+              <w:t>Esperar el estado Engine running (sección 5.3)</w:t>
             </w:r>
           </w:p>
         </w:tc>
@@ -706,7 +706,7 @@
                 <w:rFonts w:ascii="Times New Roman" w:hAnsi="Times New Roman"/>
                 <w:sz w:val="20"/>
               </w:rPr>
-              <w:t>El motor es un servicio de systemd; el estado se consulta con el gestor de servicios.</w:t>
+              <w:t>El motor es un servicio de systemd, no una aplicación que uno abre.</w:t>
             </w:r>
           </w:p>
         </w:tc>
@@ -746,7 +746,7 @@
                 <w:rFonts w:ascii="Times New Roman" w:hAnsi="Times New Roman"/>
                 <w:sz w:val="20"/>
               </w:rPr>
-              <w:t>Vistas gráficas Builds, Images, Containers, Logs y Bind mounts</w:t>
+              <w:t>Pantallas Builds, Images, Containers, Logs y Bind mounts</w:t>
             </w:r>
           </w:p>
         </w:tc>
@@ -765,7 +765,7 @@
                 <w:rFonts w:ascii="Times New Roman" w:hAnsi="Times New Roman"/>
                 <w:sz w:val="20"/>
               </w:rPr>
-              <w:t>No hay interfaz gráfica, pero cada vista tiene un comando equivalente que entrega igual o mayor detalle.</w:t>
+              <w:t>No tengo interfaz gráfica, pero cada pantalla tiene su comando.</w:t>
             </w:r>
           </w:p>
         </w:tc>
@@ -784,7 +784,7 @@
                 <w:rFonts w:ascii="Times New Roman" w:hAnsi="Times New Roman"/>
                 <w:sz w:val="20"/>
               </w:rPr>
-              <w:t>Tabla 3 de equivalencias entre interfaz gráfica y línea de comandos</w:t>
+              <w:t>Tabla 2, con la lista completa</w:t>
             </w:r>
           </w:p>
         </w:tc>
@@ -805,7 +805,7 @@
                 <w:rFonts w:ascii="Times New Roman" w:hAnsi="Times New Roman"/>
                 <w:sz w:val="20"/>
               </w:rPr>
-              <w:t>Asistente Gordon (secciones 8.1 y siguientes)</w:t>
+              <w:t>Usar Gordon</w:t>
             </w:r>
           </w:p>
         </w:tc>
@@ -824,7 +824,7 @@
                 <w:rFonts w:ascii="Times New Roman" w:hAnsi="Times New Roman"/>
                 <w:sz w:val="20"/>
               </w:rPr>
-              <w:t>No disponible sin Docker Desktop. La propia guía documenta los comandos que Gordon ejecuta internamente.</w:t>
+              <w:t>Gordon viene con Docker Desktop, así que no lo tengo.</w:t>
             </w:r>
           </w:p>
         </w:tc>
@@ -843,7 +843,7 @@
                 <w:rFonts w:ascii="Times New Roman" w:hAnsi="Times New Roman"/>
                 <w:sz w:val="20"/>
               </w:rPr>
-              <w:t>docker compose up -d --build y equivalentes, escritos de forma explicita</w:t>
+              <w:t>Los comandos que Gordon ejecuta por dentro. La misma guía los menciona</w:t>
             </w:r>
           </w:p>
         </w:tc>
@@ -883,7 +883,7 @@
                 <w:rFonts w:ascii="Times New Roman" w:hAnsi="Times New Roman"/>
                 <w:sz w:val="20"/>
               </w:rPr>
-              <w:t>Archivo por lotes propio de Windows; no aplica.</w:t>
+              <w:t>Es un archivo de Windows.</w:t>
             </w:r>
           </w:p>
         </w:tc>
@@ -902,7 +902,7 @@
                 <w:rFonts w:ascii="Times New Roman" w:hAnsi="Times New Roman"/>
                 <w:sz w:val="20"/>
               </w:rPr>
-              <w:t>Scripts npm run db:up, db:seed y db:reset definidos en package.json</w:t>
+              <w:t>Los scripts npm run db:up y npm run db:seed de mi proyecto</w:t>
             </w:r>
           </w:p>
         </w:tc>
@@ -930,25 +930,7 @@
           <w:i w:val="0"/>
           <w:sz w:val="20"/>
         </w:rPr>
-        <w:t xml:space="preserve">Elaboración propia a partir de la guía </w:t>
-      </w:r>
-      <w:r>
-        <w:rPr>
-          <w:rFonts w:ascii="Times New Roman" w:hAnsi="Times New Roman"/>
-          <w:b w:val="0"/>
-          <w:i/>
-          <w:sz w:val="20"/>
-        </w:rPr>
-        <w:t>Instalación y uso de Docker</w:t>
-      </w:r>
-      <w:r>
-        <w:rPr>
-          <w:rFonts w:ascii="Times New Roman" w:hAnsi="Times New Roman"/>
-          <w:b w:val="0"/>
-          <w:i w:val="0"/>
-          <w:sz w:val="20"/>
-        </w:rPr>
-        <w:t xml:space="preserve"> (SENA, 2026) y de la documentación oficial de Docker.</w:t>
+        <w:t>Elaboración propia a partir de la guía del SENA.</w:t>
       </w:r>
     </w:p>
     <w:p>
@@ -957,14 +939,6 @@
         <w:ind w:firstLine="720"/>
         <w:jc w:val="left"/>
       </w:pPr>
-    </w:p>
-    <w:p>
-      <w:pPr>
-        <w:pStyle w:val="Heading2"/>
-      </w:pPr>
-      <w:r>
-        <w:t>Entorno de Trabajo Verificado</w:t>
-      </w:r>
     </w:p>
     <w:p>
       <w:pPr>
@@ -979,516 +953,8 @@
           <w:i w:val="0"/>
           <w:sz w:val="24"/>
         </w:rPr>
-        <w:t>La totalidad de los comandos y resultados consignados en este informe se ejecutaron y verificaron en el entorno descrito en la Tabla 2.</w:t>
+        <w:t>Todo lo que aparece en este informe lo corrí en un computador con Ubuntu 24.04.4 LTS, núcleo 7.0.0-28-generic, Docker Engine 29.6.2 y Docker Compose v5.3.1.</w:t>
       </w:r>
-    </w:p>
-    <w:p>
-      <w:pPr>
-        <w:keepNext/>
-        <w:spacing w:line="480" w:lineRule="auto" w:after="0"/>
-        <w:ind w:firstLine="0"/>
-        <w:jc w:val="left"/>
-      </w:pPr>
-      <w:r>
-        <w:rPr>
-          <w:rFonts w:ascii="Times New Roman" w:hAnsi="Times New Roman"/>
-          <w:b/>
-          <w:i w:val="0"/>
-          <w:sz w:val="24"/>
-        </w:rPr>
-        <w:t>Tabla 2</w:t>
-      </w:r>
-    </w:p>
-    <w:p>
-      <w:pPr>
-        <w:keepNext/>
-        <w:spacing w:line="480" w:lineRule="auto" w:after="80"/>
-        <w:ind w:firstLine="0"/>
-        <w:jc w:val="left"/>
-      </w:pPr>
-      <w:r>
-        <w:rPr>
-          <w:rFonts w:ascii="Times New Roman" w:hAnsi="Times New Roman"/>
-          <w:b w:val="0"/>
-          <w:i/>
-          <w:sz w:val="24"/>
-        </w:rPr>
-        <w:t>Especificación del entorno de trabajo</w:t>
-      </w:r>
-    </w:p>
-    <w:tbl>
-      <w:tblPr>
-        <w:tblW w:type="auto" w:w="0"/>
-        <w:jc w:val="center"/>
-        <w:tblLayout w:type="autofit"/>
-        <w:tblLook w:firstColumn="1" w:firstRow="1" w:lastColumn="0" w:lastRow="0" w:noHBand="0" w:noVBand="1" w:val="04A0"/>
-        <w:tblBorders>
-          <w:top w:val="single" w:sz="6" w:color="000000"/>
-          <w:bottom w:val="single" w:sz="6" w:color="000000"/>
-          <w:left w:val="none" w:sz="6" w:color="000000"/>
-          <w:right w:val="none" w:sz="6" w:color="000000"/>
-          <w:insideH w:val="none" w:sz="6" w:color="000000"/>
-          <w:insideV w:val="none" w:sz="6" w:color="000000"/>
-        </w:tblBorders>
-      </w:tblPr>
-      <w:tblGrid>
-        <w:gridCol w:w="4680"/>
-        <w:gridCol w:w="4680"/>
-      </w:tblGrid>
-      <w:tr>
-        <w:tc>
-          <w:tcPr>
-            <w:tcW w:type="dxa" w:w="2835"/>
-            <w:tcBorders>
-              <w:bottom w:val="single" w:sz="6" w:color="000000"/>
-            </w:tcBorders>
-          </w:tcPr>
-          <w:p>
-            <w:pPr>
-              <w:spacing w:line="240" w:lineRule="auto" w:after="40" w:before="40"/>
-              <w:ind w:firstLine="0"/>
-            </w:pPr>
-            <w:r/>
-            <w:r>
-              <w:rPr>
-                <w:rFonts w:ascii="Times New Roman" w:hAnsi="Times New Roman"/>
-                <w:b/>
-                <w:sz w:val="20"/>
-              </w:rPr>
-              <w:t>Componente</w:t>
-            </w:r>
-          </w:p>
-        </w:tc>
-        <w:tc>
-          <w:tcPr>
-            <w:tcW w:type="dxa" w:w="6236"/>
-            <w:tcBorders>
-              <w:bottom w:val="single" w:sz="6" w:color="000000"/>
-            </w:tcBorders>
-          </w:tcPr>
-          <w:p>
-            <w:pPr>
-              <w:spacing w:line="240" w:lineRule="auto" w:after="40" w:before="40"/>
-              <w:ind w:firstLine="0"/>
-            </w:pPr>
-            <w:r/>
-            <w:r>
-              <w:rPr>
-                <w:rFonts w:ascii="Times New Roman" w:hAnsi="Times New Roman"/>
-                <w:b/>
-                <w:sz w:val="20"/>
-              </w:rPr>
-              <w:t>Versión o estado verificado</w:t>
-            </w:r>
-          </w:p>
-        </w:tc>
-      </w:tr>
-      <w:tr>
-        <w:tc>
-          <w:tcPr>
-            <w:tcW w:type="dxa" w:w="2835"/>
-          </w:tcPr>
-          <w:p>
-            <w:pPr>
-              <w:spacing w:line="240" w:lineRule="auto" w:after="40" w:before="40"/>
-              <w:ind w:firstLine="0"/>
-            </w:pPr>
-            <w:r/>
-            <w:r>
-              <w:rPr>
-                <w:rFonts w:ascii="Times New Roman" w:hAnsi="Times New Roman"/>
-                <w:sz w:val="20"/>
-              </w:rPr>
-              <w:t>Sistema operativo</w:t>
-            </w:r>
-          </w:p>
-        </w:tc>
-        <w:tc>
-          <w:tcPr>
-            <w:tcW w:type="dxa" w:w="6236"/>
-          </w:tcPr>
-          <w:p>
-            <w:pPr>
-              <w:spacing w:line="240" w:lineRule="auto" w:after="40" w:before="40"/>
-              <w:ind w:firstLine="0"/>
-            </w:pPr>
-            <w:r/>
-            <w:r>
-              <w:rPr>
-                <w:rFonts w:ascii="Times New Roman" w:hAnsi="Times New Roman"/>
-                <w:sz w:val="20"/>
-              </w:rPr>
-              <w:t>Ubuntu 24.04.4 LTS</w:t>
-            </w:r>
-          </w:p>
-        </w:tc>
-      </w:tr>
-      <w:tr>
-        <w:tc>
-          <w:tcPr>
-            <w:tcW w:type="dxa" w:w="2835"/>
-          </w:tcPr>
-          <w:p>
-            <w:pPr>
-              <w:spacing w:line="240" w:lineRule="auto" w:after="40" w:before="40"/>
-              <w:ind w:firstLine="0"/>
-            </w:pPr>
-            <w:r/>
-            <w:r>
-              <w:rPr>
-                <w:rFonts w:ascii="Times New Roman" w:hAnsi="Times New Roman"/>
-                <w:sz w:val="20"/>
-              </w:rPr>
-              <w:t>Núcleo (kernel)</w:t>
-            </w:r>
-          </w:p>
-        </w:tc>
-        <w:tc>
-          <w:tcPr>
-            <w:tcW w:type="dxa" w:w="6236"/>
-          </w:tcPr>
-          <w:p>
-            <w:pPr>
-              <w:spacing w:line="240" w:lineRule="auto" w:after="40" w:before="40"/>
-              <w:ind w:firstLine="0"/>
-            </w:pPr>
-            <w:r/>
-            <w:r>
-              <w:rPr>
-                <w:rFonts w:ascii="Times New Roman" w:hAnsi="Times New Roman"/>
-                <w:sz w:val="20"/>
-              </w:rPr>
-              <w:t>7.0.0-28-generic</w:t>
-            </w:r>
-          </w:p>
-        </w:tc>
-      </w:tr>
-      <w:tr>
-        <w:tc>
-          <w:tcPr>
-            <w:tcW w:type="dxa" w:w="2835"/>
-          </w:tcPr>
-          <w:p>
-            <w:pPr>
-              <w:spacing w:line="240" w:lineRule="auto" w:after="40" w:before="40"/>
-              <w:ind w:firstLine="0"/>
-            </w:pPr>
-            <w:r/>
-            <w:r>
-              <w:rPr>
-                <w:rFonts w:ascii="Times New Roman" w:hAnsi="Times New Roman"/>
-                <w:sz w:val="20"/>
-              </w:rPr>
-              <w:t>Docker Engine</w:t>
-            </w:r>
-          </w:p>
-        </w:tc>
-        <w:tc>
-          <w:tcPr>
-            <w:tcW w:type="dxa" w:w="6236"/>
-          </w:tcPr>
-          <w:p>
-            <w:pPr>
-              <w:spacing w:line="240" w:lineRule="auto" w:after="40" w:before="40"/>
-              <w:ind w:firstLine="0"/>
-            </w:pPr>
-            <w:r/>
-            <w:r>
-              <w:rPr>
-                <w:rFonts w:ascii="Times New Roman" w:hAnsi="Times New Roman"/>
-                <w:sz w:val="20"/>
-              </w:rPr>
-              <w:t>29.6.2, build dfc4efb</w:t>
-            </w:r>
-          </w:p>
-        </w:tc>
-      </w:tr>
-      <w:tr>
-        <w:tc>
-          <w:tcPr>
-            <w:tcW w:type="dxa" w:w="2835"/>
-          </w:tcPr>
-          <w:p>
-            <w:pPr>
-              <w:spacing w:line="240" w:lineRule="auto" w:after="40" w:before="40"/>
-              <w:ind w:firstLine="0"/>
-            </w:pPr>
-            <w:r/>
-            <w:r>
-              <w:rPr>
-                <w:rFonts w:ascii="Times New Roman" w:hAnsi="Times New Roman"/>
-                <w:sz w:val="20"/>
-              </w:rPr>
-              <w:t>Docker Compose</w:t>
-            </w:r>
-          </w:p>
-        </w:tc>
-        <w:tc>
-          <w:tcPr>
-            <w:tcW w:type="dxa" w:w="6236"/>
-          </w:tcPr>
-          <w:p>
-            <w:pPr>
-              <w:spacing w:line="240" w:lineRule="auto" w:after="40" w:before="40"/>
-              <w:ind w:firstLine="0"/>
-            </w:pPr>
-            <w:r/>
-            <w:r>
-              <w:rPr>
-                <w:rFonts w:ascii="Times New Roman" w:hAnsi="Times New Roman"/>
-                <w:sz w:val="20"/>
-              </w:rPr>
-              <w:t>v5.3.1 (complemento CLI, no docker-compose de Python)</w:t>
-            </w:r>
-          </w:p>
-        </w:tc>
-      </w:tr>
-      <w:tr>
-        <w:tc>
-          <w:tcPr>
-            <w:tcW w:type="dxa" w:w="2835"/>
-          </w:tcPr>
-          <w:p>
-            <w:pPr>
-              <w:spacing w:line="240" w:lineRule="auto" w:after="40" w:before="40"/>
-              <w:ind w:firstLine="0"/>
-            </w:pPr>
-            <w:r/>
-            <w:r>
-              <w:rPr>
-                <w:rFonts w:ascii="Times New Roman" w:hAnsi="Times New Roman"/>
-                <w:sz w:val="20"/>
-              </w:rPr>
-              <w:t>Estado del servicio</w:t>
-            </w:r>
-          </w:p>
-        </w:tc>
-        <w:tc>
-          <w:tcPr>
-            <w:tcW w:type="dxa" w:w="6236"/>
-          </w:tcPr>
-          <w:p>
-            <w:pPr>
-              <w:spacing w:line="240" w:lineRule="auto" w:after="40" w:before="40"/>
-              <w:ind w:firstLine="0"/>
-            </w:pPr>
-            <w:r/>
-            <w:r>
-              <w:rPr>
-                <w:rFonts w:ascii="Times New Roman" w:hAnsi="Times New Roman"/>
-                <w:sz w:val="20"/>
-              </w:rPr>
-              <w:t>active (en ejecución) y enabled (arranque automático)</w:t>
-            </w:r>
-          </w:p>
-        </w:tc>
-      </w:tr>
-      <w:tr>
-        <w:tc>
-          <w:tcPr>
-            <w:tcW w:type="dxa" w:w="2835"/>
-          </w:tcPr>
-          <w:p>
-            <w:pPr>
-              <w:spacing w:line="240" w:lineRule="auto" w:after="40" w:before="40"/>
-              <w:ind w:firstLine="0"/>
-            </w:pPr>
-            <w:r/>
-            <w:r>
-              <w:rPr>
-                <w:rFonts w:ascii="Times New Roman" w:hAnsi="Times New Roman"/>
-                <w:sz w:val="20"/>
-              </w:rPr>
-              <w:t>Acceso sin privilegios</w:t>
-            </w:r>
-          </w:p>
-        </w:tc>
-        <w:tc>
-          <w:tcPr>
-            <w:tcW w:type="dxa" w:w="6236"/>
-          </w:tcPr>
-          <w:p>
-            <w:pPr>
-              <w:spacing w:line="240" w:lineRule="auto" w:after="40" w:before="40"/>
-              <w:ind w:firstLine="0"/>
-            </w:pPr>
-            <w:r/>
-            <w:r>
-              <w:rPr>
-                <w:rFonts w:ascii="Times New Roman" w:hAnsi="Times New Roman"/>
-                <w:sz w:val="20"/>
-              </w:rPr>
-              <w:t>Usuario perteneciente al grupo docker</w:t>
-            </w:r>
-          </w:p>
-        </w:tc>
-      </w:tr>
-      <w:tr>
-        <w:tc>
-          <w:tcPr>
-            <w:tcW w:type="dxa" w:w="2835"/>
-          </w:tcPr>
-          <w:p>
-            <w:pPr>
-              <w:spacing w:line="240" w:lineRule="auto" w:after="40" w:before="40"/>
-              <w:ind w:firstLine="0"/>
-            </w:pPr>
-            <w:r/>
-            <w:r>
-              <w:rPr>
-                <w:rFonts w:ascii="Times New Roman" w:hAnsi="Times New Roman"/>
-                <w:sz w:val="20"/>
-              </w:rPr>
-              <w:t>Opciones de seguridad</w:t>
-            </w:r>
-          </w:p>
-        </w:tc>
-        <w:tc>
-          <w:tcPr>
-            <w:tcW w:type="dxa" w:w="6236"/>
-          </w:tcPr>
-          <w:p>
-            <w:pPr>
-              <w:spacing w:line="240" w:lineRule="auto" w:after="40" w:before="40"/>
-              <w:ind w:firstLine="0"/>
-            </w:pPr>
-            <w:r/>
-            <w:r>
-              <w:rPr>
-                <w:rFonts w:ascii="Times New Roman" w:hAnsi="Times New Roman"/>
-                <w:sz w:val="20"/>
-              </w:rPr>
-              <w:t>apparmor, seccomp con perfil incorporado, cgroupns</w:t>
-            </w:r>
-          </w:p>
-        </w:tc>
-      </w:tr>
-      <w:tr>
-        <w:tc>
-          <w:tcPr>
-            <w:tcW w:type="dxa" w:w="2835"/>
-          </w:tcPr>
-          <w:p>
-            <w:pPr>
-              <w:spacing w:line="240" w:lineRule="auto" w:after="40" w:before="40"/>
-              <w:ind w:firstLine="0"/>
-            </w:pPr>
-            <w:r/>
-            <w:r>
-              <w:rPr>
-                <w:rFonts w:ascii="Times New Roman" w:hAnsi="Times New Roman"/>
-                <w:sz w:val="20"/>
-              </w:rPr>
-              <w:t>Proyecto de aplicación</w:t>
-            </w:r>
-          </w:p>
-        </w:tc>
-        <w:tc>
-          <w:tcPr>
-            <w:tcW w:type="dxa" w:w="6236"/>
-          </w:tcPr>
-          <w:p>
-            <w:pPr>
-              <w:spacing w:line="240" w:lineRule="auto" w:after="40" w:before="40"/>
-              <w:ind w:firstLine="0"/>
-            </w:pPr>
-            <w:r/>
-            <w:r>
-              <w:rPr>
-                <w:rFonts w:ascii="Times New Roman" w:hAnsi="Times New Roman"/>
-                <w:sz w:val="20"/>
-              </w:rPr>
-              <w:t>CodeByMike: Astro 7 (SSR), Turso/libSQL, Drizzle, Tailwind 4, desplegado en Vercel</w:t>
-            </w:r>
-          </w:p>
-        </w:tc>
-      </w:tr>
-    </w:tbl>
-    <w:p>
-      <w:pPr>
-        <w:spacing w:line="240" w:lineRule="auto" w:after="0" w:before="80"/>
-        <w:ind w:firstLine="0"/>
-        <w:jc w:val="left"/>
-      </w:pPr>
-      <w:r>
-        <w:rPr>
-          <w:rFonts w:ascii="Times New Roman" w:hAnsi="Times New Roman"/>
-          <w:b w:val="0"/>
-          <w:i/>
-          <w:sz w:val="20"/>
-        </w:rPr>
-        <w:t xml:space="preserve">Nota. </w:t>
-      </w:r>
-      <w:r>
-        <w:rPr>
-          <w:rFonts w:ascii="Times New Roman" w:hAnsi="Times New Roman"/>
-          <w:b w:val="0"/>
-          <w:i w:val="0"/>
-          <w:sz w:val="20"/>
-        </w:rPr>
-        <w:t xml:space="preserve">Datos obtenidos mediante </w:t>
-      </w:r>
-      <w:r>
-        <w:rPr>
-          <w:rFonts w:ascii="Courier New" w:hAnsi="Courier New"/>
-          <w:b w:val="0"/>
-          <w:i w:val="0"/>
-          <w:sz w:val="266700"/>
-        </w:rPr>
-        <w:t>docker info</w:t>
-      </w:r>
-      <w:r>
-        <w:rPr>
-          <w:rFonts w:ascii="Times New Roman" w:hAnsi="Times New Roman"/>
-          <w:b w:val="0"/>
-          <w:i w:val="0"/>
-          <w:sz w:val="20"/>
-        </w:rPr>
-        <w:t xml:space="preserve">, </w:t>
-      </w:r>
-      <w:r>
-        <w:rPr>
-          <w:rFonts w:ascii="Courier New" w:hAnsi="Courier New"/>
-          <w:b w:val="0"/>
-          <w:i w:val="0"/>
-          <w:sz w:val="266700"/>
-        </w:rPr>
-        <w:t>systemctl</w:t>
-      </w:r>
-      <w:r>
-        <w:rPr>
-          <w:rFonts w:ascii="Times New Roman" w:hAnsi="Times New Roman"/>
-          <w:b w:val="0"/>
-          <w:i w:val="0"/>
-          <w:sz w:val="20"/>
-        </w:rPr>
-        <w:t xml:space="preserve"> y </w:t>
-      </w:r>
-      <w:r>
-        <w:rPr>
-          <w:rFonts w:ascii="Courier New" w:hAnsi="Courier New"/>
-          <w:b w:val="0"/>
-          <w:i w:val="0"/>
-          <w:sz w:val="266700"/>
-        </w:rPr>
-        <w:t>uname -r</w:t>
-      </w:r>
-      <w:r>
-        <w:rPr>
-          <w:rFonts w:ascii="Times New Roman" w:hAnsi="Times New Roman"/>
-          <w:b w:val="0"/>
-          <w:i w:val="0"/>
-          <w:sz w:val="20"/>
-        </w:rPr>
-        <w:t>. Elaboración propia.</w:t>
-      </w:r>
-    </w:p>
-    <w:p>
-      <w:pPr>
-        <w:spacing w:line="480" w:lineRule="auto" w:after="0"/>
-        <w:ind w:firstLine="720"/>
-        <w:jc w:val="left"/>
-      </w:pPr>
     </w:p>
     <w:p>
       <w:r>
@@ -1500,7 +966,7 @@
         <w:pStyle w:val="Heading1"/>
       </w:pPr>
       <w:r>
-        <w:t>Instalación y Configuración de Docker en Ubuntu</w:t>
+        <w:t>Dejar Docker Funcionando en Ubuntu</w:t>
       </w:r>
     </w:p>
     <w:p>
@@ -1516,7 +982,7 @@
           <w:i w:val="0"/>
           <w:sz w:val="24"/>
         </w:rPr>
-        <w:t>Esta sección sustituye a las secciones 4, 5 y 15.1 de la guía. Comprende los pasos que si corresponden a un entorno GNU/Linux, en el orden en que deben ejecutarse.</w:t>
+        <w:t>Esta parte reemplaza las secciones 4, 5 y 15.1 de la guía.</w:t>
       </w:r>
     </w:p>
     <w:p>
@@ -1524,7 +990,7 @@
         <w:pStyle w:val="Heading2"/>
       </w:pPr>
       <w:r>
-        <w:t>Instalación desde el Repositorio Oficial</w:t>
+        <w:t>Instalación</w:t>
       </w:r>
     </w:p>
     <w:p>
@@ -1540,7 +1006,7 @@
           <w:i w:val="0"/>
           <w:sz w:val="24"/>
         </w:rPr>
-        <w:t>Los paquetes de Docker incluidos en los repositorios de la distribución suelen corresponder a versiones antiguas y no incorporan el complemento de Compose en su versión 2. Por ello, la instalación se realiza desde el repositorio oficial de Docker, conforme a la documentación del fabricante (Docker Inc., 2026c).</w:t>
+        <w:t>Ubuntu trae Docker en sus repositorios, pero casi siempre es una versión vieja y además no incluye Compose v2. Por eso se instala desde el repositorio oficial de Docker (Docker Inc., 2026c). Estos son los comandos:</w:t>
       </w:r>
     </w:p>
     <w:tbl>
@@ -1576,7 +1042,7 @@
                 <w:rFonts w:ascii="Courier New" w:hAnsi="Courier New"/>
                 <w:sz w:val="20"/>
               </w:rPr>
-              <w:t># 1. Retirar paquetes antiguos provenientes de la distribución</w:t>
+              <w:t># quitar los paquetes viejos que trae la distribución</w:t>
             </w:r>
           </w:p>
           <w:p>
@@ -1614,7 +1080,7 @@
                 <w:rFonts w:ascii="Courier New" w:hAnsi="Courier New"/>
                 <w:sz w:val="20"/>
               </w:rPr>
-              <w:t># 2. Registrar la clave GPG y el repositorio oficial</w:t>
+              <w:t># agregar la llave y el repositorio oficial</w:t>
             </w:r>
           </w:p>
           <w:p>
@@ -1769,7 +1235,7 @@
                 <w:rFonts w:ascii="Courier New" w:hAnsi="Courier New"/>
                 <w:sz w:val="20"/>
               </w:rPr>
-              <w:t># 3. Instalar motor, CLI, containerd y los complementos buildx y compose</w:t>
+              <w:t># instalar el motor, el cliente y los complementos</w:t>
             </w:r>
           </w:p>
           <w:p>
@@ -1834,7 +1300,7 @@
           <w:i w:val="0"/>
           <w:sz w:val="24"/>
         </w:rPr>
-        <w:t>La verificación de la clave GPG no es un formalismo administrativo: garantiza que los paquetes descargados fueron firmados por Docker y no sustituidos en transito, lo cual constituye una medida elemental de seguridad de la cadena de suministro.</w:t>
+        <w:t>Lo de la llave GPG no es puro trámite. Sirve para que apt verifique que los paquetes vienen firmados por Docker y no los cambió alguien en el camino.</w:t>
       </w:r>
     </w:p>
     <w:p>
@@ -1842,7 +1308,7 @@
         <w:pStyle w:val="Heading2"/>
       </w:pPr>
       <w:r>
-        <w:t>Configuración Posterior a la Instalación</w:t>
+        <w:t>Los Dos Pasos que Sí Son Propios de Linux</w:t>
       </w:r>
     </w:p>
     <w:p>
@@ -1858,7 +1324,7 @@
           <w:i w:val="0"/>
           <w:sz w:val="24"/>
         </w:rPr>
-        <w:t>Dos ajustes son específicos de GNU/Linux y constituyen el equivalente funcional de esperar a que Docker Desktop informe el estado Running.</w:t>
+        <w:t>Después de instalar quedan dos ajustes. Estos son el equivalente de esperar a que Docker Desktop diga Running.</w:t>
       </w:r>
     </w:p>
     <w:p>
@@ -1869,49 +1335,12 @@
       </w:pPr>
       <w:r>
         <w:rPr>
-          <w:b/>
-          <w:i w:val="0"/>
-        </w:rPr>
-        <w:t xml:space="preserve">Habilitación del servicio. </w:t>
-      </w:r>
-      <w:r>
-        <w:rPr>
+          <w:rFonts w:ascii="Times New Roman" w:hAnsi="Times New Roman"/>
           <w:b w:val="0"/>
           <w:i w:val="0"/>
+          <w:sz w:val="24"/>
         </w:rPr>
-        <w:t xml:space="preserve">El motor se ejecuta como un demonio administrado por systemd. Debe distinguirse entre dos estados que la guía trata como uno solo: </w:t>
-      </w:r>
-      <w:r>
-        <w:rPr>
-          <w:rFonts w:ascii="Courier New" w:hAnsi="Courier New"/>
-          <w:b w:val="0"/>
-          <w:i w:val="0"/>
-          <w:sz w:val="21"/>
-        </w:rPr>
-        <w:t>active</w:t>
-      </w:r>
-      <w:r>
-        <w:rPr>
-          <w:b w:val="0"/>
-          <w:i w:val="0"/>
-        </w:rPr>
-        <w:t xml:space="preserve"> indica que el motor está en ejecución en este momento, mientras que </w:t>
-      </w:r>
-      <w:r>
-        <w:rPr>
-          <w:rFonts w:ascii="Courier New" w:hAnsi="Courier New"/>
-          <w:b w:val="0"/>
-          <w:i w:val="0"/>
-          <w:sz w:val="21"/>
-        </w:rPr>
-        <w:t>enabled</w:t>
-      </w:r>
-      <w:r>
-        <w:rPr>
-          <w:b w:val="0"/>
-          <w:i w:val="0"/>
-        </w:rPr>
-        <w:t xml:space="preserve"> indica que volverá a iniciarse automáticamente tras reiniciar el equipo. La evidencia debe mostrar ambos.</w:t>
+        <w:t>El primero es dejar el servicio andando y que arranque solo con el computador. Vale la pena separar las dos cosas, porque no son lo mismo: active quiere decir que está corriendo ahorita, y enabled quiere decir que vuelve a arrancar cuando reinicie el equipo. En las evidencias muestro las dos.</w:t>
       </w:r>
     </w:p>
     <w:tbl>
@@ -1994,65 +1423,12 @@
       </w:pPr>
       <w:r>
         <w:rPr>
-          <w:b/>
-          <w:i w:val="0"/>
-        </w:rPr>
-        <w:t xml:space="preserve">Acceso sin privilegios de superusuario. </w:t>
-      </w:r>
-      <w:r>
-        <w:rPr>
+          <w:rFonts w:ascii="Times New Roman" w:hAnsi="Times New Roman"/>
           <w:b w:val="0"/>
           <w:i w:val="0"/>
+          <w:sz w:val="24"/>
         </w:rPr>
-        <w:t xml:space="preserve">El demonio expone un socket en </w:t>
-      </w:r>
-      <w:r>
-        <w:rPr>
-          <w:rFonts w:ascii="Courier New" w:hAnsi="Courier New"/>
-          <w:b w:val="0"/>
-          <w:i w:val="0"/>
-          <w:sz w:val="21"/>
-        </w:rPr>
-        <w:t>/var/run/docker.sock</w:t>
-      </w:r>
-      <w:r>
-        <w:rPr>
-          <w:b w:val="0"/>
-          <w:i w:val="0"/>
-        </w:rPr>
-        <w:t xml:space="preserve">, cuyo grupo propietario es </w:t>
-      </w:r>
-      <w:r>
-        <w:rPr>
-          <w:rFonts w:ascii="Courier New" w:hAnsi="Courier New"/>
-          <w:b w:val="0"/>
-          <w:i w:val="0"/>
-          <w:sz w:val="21"/>
-        </w:rPr>
-        <w:t>docker</w:t>
-      </w:r>
-      <w:r>
-        <w:rPr>
-          <w:b w:val="0"/>
-          <w:i w:val="0"/>
-        </w:rPr>
-        <w:t xml:space="preserve">. Sin pertenecer a dicho grupo, cada invocación del cliente exigiría </w:t>
-      </w:r>
-      <w:r>
-        <w:rPr>
-          <w:rFonts w:ascii="Courier New" w:hAnsi="Courier New"/>
-          <w:b w:val="0"/>
-          <w:i w:val="0"/>
-          <w:sz w:val="21"/>
-        </w:rPr>
-        <w:t>sudo</w:t>
-      </w:r>
-      <w:r>
-        <w:rPr>
-          <w:b w:val="0"/>
-          <w:i w:val="0"/>
-        </w:rPr>
-        <w:t>.</w:t>
+        <w:t>El segundo es poder usar Docker sin escribir sudo cada vez. El demonio atiende en un socket, /var/run/docker.sock, que pertenece al grupo docker. Si mi usuario no está en ese grupo, todos los comandos piden contraseña.</w:t>
       </w:r>
     </w:p>
     <w:tbl>
@@ -2101,7 +1477,7 @@
                 <w:rFonts w:ascii="Courier New" w:hAnsi="Courier New"/>
                 <w:sz w:val="20"/>
               </w:rPr>
-              <w:t>newgrp docker            # o cerrar sesión y volver a iniciarla</w:t>
+              <w:t>newgrp docker            # o cerrar sesión y volver a entrar</w:t>
             </w:r>
           </w:p>
           <w:p>
@@ -2140,7 +1516,7 @@
           <w:i w:val="0"/>
           <w:sz w:val="24"/>
         </w:rPr>
-        <w:t>Resulta pertinente advertir, en términos de seguridad, que la pertenencia al grupo docker equivale en la práctica a disponer de privilegios de superusuario, dado que cualquier usuario capaz de comunicarse con el socket puede montar el sistema de archivos raíz dentro de un contenedor privilegiado. No se trata de un error de configuración, sino de una consecuencia del modelo de arquitectura del demonio. La alternativa endurecida es el modo sin raíz (rootless), que ejecuta el motor con el identificador del usuario. Este matiz queda encapsulado tras Docker Desktop en el procedimiento original y solo se hace visible al operar el motor de forma directa.</w:t>
+        <w:t>Sobre esto hay algo que aprendí leyendo la documentación y que me parece importante anotar: estar en el grupo docker es casi lo mismo que ser administrador del equipo. Quien pueda hablarle al socket puede montar todo el disco dentro de un contenedor y hacer lo que quiera. No es un error de configuración, es como está hecho Docker. Si uno necesita algo más cerrado existe el modo rootless, que corre el motor con el usuario normal (Docker Inc., 2026j). En Windows uno nunca ve este detalle porque Docker Desktop lo tapa.</w:t>
       </w:r>
     </w:p>
     <w:p>
@@ -2174,7 +1550,7 @@
           <w:i/>
           <w:sz w:val="24"/>
         </w:rPr>
-        <w:t>Versiones instaladas y estado del servicio Docker</w:t>
+        <w:t>Versiones instaladas y estado del servicio</w:t>
       </w:r>
     </w:p>
     <w:tbl>
@@ -2237,7 +1613,7 @@
                 <w:rFonts w:ascii="Times New Roman" w:hAnsi="Times New Roman"/>
                 <w:sz w:val="19"/>
               </w:rPr>
-              <w:t>Terminal (GNOME Terminal), en cualquier directorio.</w:t>
+              <w:t>Terminal, en cualquier carpeta.</w:t>
             </w:r>
           </w:p>
           <w:p>
@@ -2343,7 +1719,7 @@
                 <w:rFonts w:ascii="Times New Roman" w:hAnsi="Times New Roman"/>
                 <w:sz w:val="19"/>
               </w:rPr>
-              <w:t>Las cinco salidas en una sola terminal: versión 29.6.2 del motor, v5.3.1 de Compose, active, enabled y el núcleo 7.0.0-28-generic. Esta figura sustituye a la captura del panel de Docker Desktop con el estado Engine running.</w:t>
+              <w:t>Las cinco salidas seguidas en la misma terminal. Esta captura reemplaza la del panel de Docker Desktop con el letrero Engine running.</w:t>
             </w:r>
           </w:p>
         </w:tc>
@@ -2412,7 +1788,7 @@
           <w:i/>
           <w:sz w:val="24"/>
         </w:rPr>
-        <w:t>Acceso al motor sin privilegios de superusuario</w:t>
+        <w:t>Docker funcionando sin sudo</w:t>
       </w:r>
     </w:p>
     <w:tbl>
@@ -2475,7 +1851,7 @@
                 <w:rFonts w:ascii="Times New Roman" w:hAnsi="Times New Roman"/>
                 <w:sz w:val="19"/>
               </w:rPr>
-              <w:t>Terminal, en cualquier directorio.</w:t>
+              <w:t>Terminal, en cualquier carpeta.</w:t>
             </w:r>
           </w:p>
           <w:p>
@@ -2539,7 +1915,7 @@
                 <w:rFonts w:ascii="Times New Roman" w:hAnsi="Times New Roman"/>
                 <w:sz w:val="19"/>
               </w:rPr>
-              <w:t>La palabra docker como resultado de la primera instrucción y, a continuación, la tabla de contenedores obtenida sin anteponer sudo. Demuestra que la configuración posterior a la instalación se completo.</w:t>
+              <w:t>La palabra docker como respuesta del primer comando y enseguida la lista de contenedores, sin haber escrito sudo.</w:t>
             </w:r>
           </w:p>
         </w:tc>
@@ -2582,7 +1958,7 @@
         <w:pStyle w:val="Heading2"/>
       </w:pPr>
       <w:r>
-        <w:t>Verificación del Motor</w:t>
+        <w:t>Comprobar que el Motor Responde</w:t>
       </w:r>
     </w:p>
     <w:p>
@@ -2598,7 +1974,7 @@
           <w:i w:val="0"/>
           <w:sz w:val="24"/>
         </w:rPr>
-        <w:t>Los cuatro comandos de verificación propuestos en la sección 5.3 de la guía operan de manera idéntica en GNU/Linux, ya que corresponden al cliente y no a la interfaz gráfica.</w:t>
+        <w:t>Los cuatro comandos que pide la sección 5.3 de la guía funcionan igual en Linux, porque son del cliente y no de la interfaz gráfica:</w:t>
       </w:r>
     </w:p>
     <w:tbl>
@@ -2699,7 +2075,7 @@
           <w:i w:val="0"/>
           <w:sz w:val="24"/>
         </w:rPr>
-        <w:t>A ellos se suman comprobaciones propias del entorno nativo, que en Windows carecerían de sentido por estar mediadas por la máquina virtual de WSL 2:</w:t>
+        <w:t>Aparte de esos revisé un par de cosas que solo tienen sentido en Linux:</w:t>
       </w:r>
     </w:p>
     <w:tbl>
@@ -2761,7 +2137,7 @@
                 <w:rFonts w:ascii="Courier New" w:hAnsi="Courier New"/>
                 <w:sz w:val="20"/>
               </w:rPr>
-              <w:t>docker info --format 'Servidor: {{.ServerVersion}} | Raíz: {{.DockerRootDir}}'</w:t>
+              <w:t>docker info --format 'Motor: {{.ServerVersion}} | Datos: {{.DockerRootDir}}'</w:t>
             </w:r>
           </w:p>
           <w:p>
@@ -2786,6 +2162,22 @@
         <w:ind w:firstLine="720"/>
         <w:jc w:val="left"/>
       </w:pPr>
+    </w:p>
+    <w:p>
+      <w:pPr>
+        <w:spacing w:line="480" w:lineRule="auto" w:after="0"/>
+        <w:ind w:firstLine="720"/>
+        <w:jc w:val="left"/>
+      </w:pPr>
+      <w:r>
+        <w:rPr>
+          <w:rFonts w:ascii="Times New Roman" w:hAnsi="Times New Roman"/>
+          <w:b w:val="0"/>
+          <w:i w:val="0"/>
+          <w:sz w:val="24"/>
+        </w:rPr>
+        <w:t>Ahí me encontré un detalle curioso. Al correr docker context ls me aparecen dos contextos: default, que es el que uso, y desktop-linux, que quedó de una prueba vieja de Docker Desktop. Vale la pena mirarlo antes de empezar, porque si uno está en el contexto equivocado los contenedores parecen desaparecer y en realidad están en el otro motor.</w:t>
+      </w:r>
     </w:p>
     <w:p>
       <w:pPr>
@@ -2818,7 +2210,7 @@
           <w:i/>
           <w:sz w:val="24"/>
         </w:rPr>
-        <w:t>Salida del comando docker info</w:t>
+        <w:t>Salida de docker info</w:t>
       </w:r>
     </w:p>
     <w:tbl>
@@ -2881,7 +2273,7 @@
                 <w:rFonts w:ascii="Times New Roman" w:hAnsi="Times New Roman"/>
                 <w:sz w:val="19"/>
               </w:rPr>
-              <w:t>Terminal, en cualquier directorio.</w:t>
+              <w:t>Terminal, en cualquier carpeta.</w:t>
             </w:r>
           </w:p>
           <w:p>
@@ -2915,6 +2307,20 @@
           </w:p>
           <w:p>
             <w:pPr>
+              <w:keepNext/>
+              <w:spacing w:line="240" w:lineRule="auto" w:after="0"/>
+              <w:ind w:firstLine="0" w:left="340"/>
+            </w:pPr>
+            <w:r>
+              <w:rPr>
+                <w:rFonts w:ascii="Courier New" w:hAnsi="Courier New"/>
+                <w:sz w:val="18"/>
+              </w:rPr>
+              <w:t>docker context ls</w:t>
+            </w:r>
+          </w:p>
+          <w:p>
+            <w:pPr>
               <w:spacing w:line="240" w:lineRule="auto" w:before="80" w:after="200"/>
               <w:ind w:firstLine="0"/>
             </w:pPr>
@@ -2931,7 +2337,7 @@
                 <w:rFonts w:ascii="Times New Roman" w:hAnsi="Times New Roman"/>
                 <w:sz w:val="19"/>
               </w:rPr>
-              <w:t>El bloque Server con la versión del motor, el controlador de almacenamiento, el directorio raíz de datos y, en Security Options, los valores apparmor, seccomp y cgroupns. Estos últimos evidencian los mecanismos de aislamiento del núcleo y sustituyen a la captura de virtualización habilitada en BIOS/UEFI de la sección 5.2.</w:t>
+              <w:t>El bloque Server con la versión del motor y la carpeta de datos, y en Security Options los valores apparmor, seccomp y cgroupns, que son los mecanismos de aislamiento del núcleo. Esta captura hace las veces de la de virtualización habilitada en BIOS que pide la sección 5.2.</w:t>
             </w:r>
           </w:p>
         </w:tc>
@@ -2974,7 +2380,7 @@
         <w:pStyle w:val="Heading2"/>
       </w:pPr>
       <w:r>
-        <w:t>Equivalencias entre la Interfaz Gráfica y la Línea de Comandos</w:t>
+        <w:t>Cada Pantalla de Docker Desktop y su Comando</w:t>
       </w:r>
     </w:p>
     <w:p>
@@ -2990,7 +2396,7 @@
           <w:i w:val="0"/>
           <w:sz w:val="24"/>
         </w:rPr>
-        <w:t>La Tabla 3 constituye el núcleo metodológico de esta adaptación: acredita que ninguna de las verificaciones solicitadas por la guía se omitio, sino que se practicó por una vía distinta. En varios casos, la salida en línea de comandos entrega mayor detalle que la pantalla correspondiente.</w:t>
+        <w:t>Esta tabla es la que más me sirvió mientras hacía el taller, porque con ella pude seguir la guía sin saltarme nada. En varios casos el comando muestra más información que la pantalla.</w:t>
       </w:r>
     </w:p>
     <w:p>
@@ -3007,7 +2413,7 @@
           <w:i w:val="0"/>
           <w:sz w:val="24"/>
         </w:rPr>
-        <w:t>Tabla 3</w:t>
+        <w:t>Tabla 2</w:t>
       </w:r>
     </w:p>
     <w:p>
@@ -3024,7 +2430,7 @@
           <w:i/>
           <w:sz w:val="24"/>
         </w:rPr>
-        <w:t>Equivalencia entre las vistas de Docker Desktop y los comandos de Docker Engine</w:t>
+        <w:t>Equivalencia entre las pantallas de Docker Desktop y los comandos</w:t>
       </w:r>
     </w:p>
     <w:tbl>
@@ -3066,7 +2472,7 @@
                 <w:b/>
                 <w:sz w:val="20"/>
               </w:rPr>
-              <w:t>Vista en Docker Desktop</w:t>
+              <w:t>Pantalla en Docker Desktop</w:t>
             </w:r>
           </w:p>
         </w:tc>
@@ -3089,7 +2495,7 @@
                 <w:b/>
                 <w:sz w:val="20"/>
               </w:rPr>
-              <w:t>Comando equivalente en GNU/Linux</w:t>
+              <w:t>Comando en Linux</w:t>
             </w:r>
           </w:p>
         </w:tc>
@@ -3110,7 +2516,7 @@
                 <w:rFonts w:ascii="Times New Roman" w:hAnsi="Times New Roman"/>
                 <w:sz w:val="20"/>
               </w:rPr>
-              <w:t>Panel principal, estado Engine running</w:t>
+              <w:t>Panel principal, Engine running</w:t>
             </w:r>
           </w:p>
         </w:tc>
@@ -3385,24 +2791,6 @@
               </w:rPr>
               <w:t>docker logs &lt;nombre&gt;</w:t>
             </w:r>
-            <w:r>
-              <w:rPr>
-                <w:rFonts w:ascii="Times New Roman" w:hAnsi="Times New Roman"/>
-                <w:b w:val="0"/>
-                <w:i w:val="0"/>
-                <w:sz w:val="20"/>
-              </w:rPr>
-              <w:t xml:space="preserve">  /  </w:t>
-            </w:r>
-            <w:r>
-              <w:rPr>
-                <w:rFonts w:ascii="Courier New" w:hAnsi="Courier New"/>
-                <w:b w:val="0"/>
-                <w:i w:val="0"/>
-                <w:sz w:val="19"/>
-              </w:rPr>
-              <w:t>docker compose logs -f</w:t>
-            </w:r>
           </w:p>
         </w:tc>
       </w:tr>
@@ -3613,24 +3001,6 @@
               </w:rPr>
               <w:t>docker volume ls</w:t>
             </w:r>
-            <w:r>
-              <w:rPr>
-                <w:rFonts w:ascii="Times New Roman" w:hAnsi="Times New Roman"/>
-                <w:b w:val="0"/>
-                <w:i w:val="0"/>
-                <w:sz w:val="20"/>
-              </w:rPr>
-              <w:t xml:space="preserve">  /  </w:t>
-            </w:r>
-            <w:r>
-              <w:rPr>
-                <w:rFonts w:ascii="Courier New" w:hAnsi="Courier New"/>
-                <w:b w:val="0"/>
-                <w:i w:val="0"/>
-                <w:sz w:val="19"/>
-              </w:rPr>
-              <w:t>docker volume inspect</w:t>
-            </w:r>
           </w:p>
         </w:tc>
       </w:tr>
@@ -3692,7 +3062,7 @@
                 <w:rFonts w:ascii="Times New Roman" w:hAnsi="Times New Roman"/>
                 <w:sz w:val="20"/>
               </w:rPr>
-              <w:t>Agrupación de un proyecto de Compose</w:t>
+              <w:t>Grupo de un proyecto de Compose</w:t>
             </w:r>
           </w:p>
         </w:tc>
@@ -3741,25 +3111,7 @@
           <w:i w:val="0"/>
           <w:sz w:val="20"/>
         </w:rPr>
-        <w:t xml:space="preserve">Elaboración propia. Los subcomandos </w:t>
-      </w:r>
-      <w:r>
-        <w:rPr>
-          <w:rFonts w:ascii="Courier New" w:hAnsi="Courier New"/>
-          <w:b w:val="0"/>
-          <w:i w:val="0"/>
-          <w:sz w:val="266700"/>
-        </w:rPr>
-        <w:t>buildx history</w:t>
-      </w:r>
-      <w:r>
-        <w:rPr>
-          <w:rFonts w:ascii="Times New Roman" w:hAnsi="Times New Roman"/>
-          <w:b w:val="0"/>
-          <w:i w:val="0"/>
-          <w:sz w:val="20"/>
-        </w:rPr>
-        <w:t xml:space="preserve"> fueron verificados en Docker Engine 29.6.2.</w:t>
+        <w:t>Elaboración propia. Probé todos los comandos en Docker Engine 29.6.2.</w:t>
       </w:r>
     </w:p>
     <w:p>
@@ -3779,7 +3131,7 @@
         <w:pStyle w:val="Heading1"/>
       </w:pPr>
       <w:r>
-        <w:t>Sustitución de la Aplicación de Ejemplo</w:t>
+        <w:t>Qué Aplicación Usé en Lugar de Dino Run</w:t>
       </w:r>
     </w:p>
     <w:p>
@@ -3795,13 +3147,13 @@
           <w:i w:val="0"/>
           <w:sz w:val="24"/>
         </w:rPr>
-        <w:t>La guía emplea Dino Run, una aplicación desarrollada con Flask y SQLite, por cuanto requiere algún artefacto que contenerizar. El proyecto CodeByMike ya utiliza Docker en producción de su ciclo de desarrollo, y lo hace con una decisión de arquitectura explícitamente documentada en el archivo compose.yaml del repositorio:</w:t>
+        <w:t>La guía usa Dino Run porque necesita alguna aplicación para meter en un contenedor. Yo aproveché mi proyecto de portafolio, CodeByMike, que ya venía usando Docker antes del curso. Eso me obligó a explicar algo que al principio pensé que era una falla del proyecto y resultó ser una decisión: mi aplicación no se despliega en contenedores. La publica Vercel. Si la metiera en un contenedor para producción perdería los despliegues de prueba por cada cambio y la reversión automática, y no ganaría nada.</w:t>
       </w:r>
     </w:p>
     <w:p>
       <w:pPr>
         <w:spacing w:line="480" w:lineRule="auto" w:after="0"/>
-        <w:ind w:firstLine="0" w:left="720"/>
+        <w:ind w:firstLine="720"/>
         <w:jc w:val="left"/>
       </w:pPr>
       <w:r>
@@ -3811,14 +3163,14 @@
           <w:i w:val="0"/>
           <w:sz w:val="24"/>
         </w:rPr>
-        <w:t>Docker no es el runtime de producción de este proyecto y no debe llegar a serlo. El sitio lo construye y ejecuta Vercel (SSR sobre Fluid Compute); contenerizar la aplicación Astro para desplegarla perdería edge, despliegues de vista previa por solicitud de incorporación de cambios y la reversión automática de ci.yml, a cambió de nada.</w:t>
+        <w:t>Entonces, ¿dónde uso Docker? En dos cosas, y las dos me sirvieron para el taller:</w:t>
       </w:r>
     </w:p>
     <w:p>
       <w:pPr>
+        <w:pStyle w:val="ListBullet"/>
         <w:spacing w:line="480" w:lineRule="auto" w:after="0"/>
-        <w:ind w:firstLine="720"/>
-        <w:jc w:val="left"/>
+        <w:ind w:left="720"/>
       </w:pPr>
       <w:r>
         <w:rPr>
@@ -3827,15 +3179,8 @@
           <w:i w:val="0"/>
           <w:sz w:val="24"/>
         </w:rPr>
-        <w:t>Delimitar el ámbito de aplicación de una herramienta forma parte del criterio profesional que la formación busca desarrollar. Lo que si se encuentra contenerizado, y constituye el uso serio de la tecnología en este proyecto, comprende dos artefactos:</w:t>
+        <w:t xml:space="preserve">El archivo </w:t>
       </w:r>
-    </w:p>
-    <w:p>
-      <w:pPr>
-        <w:pStyle w:val="ListBullet"/>
-        <w:spacing w:line="480" w:lineRule="auto" w:after="0"/>
-        <w:ind w:left="720"/>
-      </w:pPr>
       <w:r>
         <w:rPr>
           <w:rFonts w:ascii="Courier New" w:hAnsi="Courier New"/>
@@ -3852,7 +3197,7 @@
           <w:i w:val="0"/>
           <w:sz w:val="24"/>
         </w:rPr>
-        <w:t xml:space="preserve"> declara dos servidores libSQL (sqld), el mismo motor de base de datos que opera en producción a través de Turso. Permite ejercitar transacciones, restricciones UNIQUE y concurrencia contra el protocolo real y no contra un archivo local.</w:t>
+        <w:t xml:space="preserve"> levanta dos servidores de base de datos libSQL, que es el mismo motor que uso en producción. Antes hacía las pruebas contra un archivo local y no era lo mismo: los errores de concurrencia y de claves repetidas solo aparecen contra el servidor de verdad.</w:t>
       </w:r>
     </w:p>
     <w:p>
@@ -3861,6 +3206,15 @@
         <w:spacing w:line="480" w:lineRule="auto" w:after="0"/>
         <w:ind w:left="720"/>
       </w:pPr>
+      <w:r>
+        <w:rPr>
+          <w:rFonts w:ascii="Times New Roman" w:hAnsi="Times New Roman"/>
+          <w:b w:val="0"/>
+          <w:i w:val="0"/>
+          <w:sz w:val="24"/>
+        </w:rPr>
+        <w:t xml:space="preserve">El archivo </w:t>
+      </w:r>
       <w:r>
         <w:rPr>
           <w:rFonts w:ascii="Courier New" w:hAnsi="Courier New"/>
@@ -3877,7 +3231,7 @@
           <w:i w:val="0"/>
           <w:sz w:val="24"/>
         </w:rPr>
-        <w:t xml:space="preserve"> fija el entorno de desarrollo con Node 22.12 exacto y el navegador Chromium de Playwright, resolviendo un defecto real y documentado: la presencia de Node 20 en la ruta de ejecución interrumpe la compilación con astro build.</w:t>
+        <w:t xml:space="preserve"> fija la versión de Node en 22.12 y trae el navegador de las pruebas automatizadas. Esto salió de un problema real: si la terminal abre con Node 20, el comando de compilación falla. Dentro del contenedor eso ya no pasa.</w:t>
       </w:r>
     </w:p>
     <w:p>
@@ -3893,7 +3247,7 @@
           <w:i w:val="0"/>
           <w:sz w:val="24"/>
         </w:rPr>
-        <w:t>Los seis ejercicios se desarrollan sobre estos artefactos. La correspondencia conceptual es directa, según se detalla en la Tabla 4.</w:t>
+        <w:t>La Tabla 3 muestra que los conceptos son los mismos, solo cambia la aplicación.</w:t>
       </w:r>
     </w:p>
     <w:p>
@@ -3910,7 +3264,7 @@
           <w:i w:val="0"/>
           <w:sz w:val="24"/>
         </w:rPr>
-        <w:t>Tabla 4</w:t>
+        <w:t>Tabla 3</w:t>
       </w:r>
     </w:p>
     <w:p>
@@ -3927,7 +3281,7 @@
           <w:i/>
           <w:sz w:val="24"/>
         </w:rPr>
-        <w:t>Correspondencia conceptual entre la aplicación de la guía y el proyecto CodeByMike</w:t>
+        <w:t>Los mismos conceptos en la aplicación de la guía y en la mía</w:t>
       </w:r>
     </w:p>
     <w:tbl>
@@ -3993,7 +3347,7 @@
                 <w:b/>
                 <w:sz w:val="20"/>
               </w:rPr>
-              <w:t>En Dino Run (guía)</w:t>
+              <w:t>En Dino Run</w:t>
             </w:r>
           </w:p>
         </w:tc>
@@ -4016,7 +3370,7 @@
                 <w:b/>
                 <w:sz w:val="20"/>
               </w:rPr>
-              <w:t>En CodeByMike</w:t>
+              <w:t>En mi proyecto</w:t>
             </w:r>
           </w:p>
         </w:tc>
@@ -4056,7 +3410,7 @@
                 <w:rFonts w:ascii="Times New Roman" w:hAnsi="Times New Roman"/>
                 <w:sz w:val="20"/>
               </w:rPr>
-              <w:t>sena-docker-flask-app-app:latest</w:t>
+              <w:t>sena-docker-flask-app-app</w:t>
             </w:r>
           </w:p>
         </w:tc>
@@ -4075,7 +3429,7 @@
                 <w:rFonts w:ascii="Times New Roman" w:hAnsi="Times New Roman"/>
                 <w:sz w:val="20"/>
               </w:rPr>
-              <w:t>ghcr.io/tursodatabase/libsql-server, fijada por digest, y la imagen del entorno de desarrollo</w:t>
+              <w:t>libsql-server y la imagen del entorno de desarrollo</w:t>
             </w:r>
           </w:p>
         </w:tc>
@@ -4174,7 +3528,7 @@
                 <w:rFonts w:ascii="Times New Roman" w:hAnsi="Times New Roman"/>
                 <w:sz w:val="20"/>
               </w:rPr>
-              <w:t>Python 3.12, Flask</w:t>
+              <w:t>Python 3.12 con Flask</w:t>
             </w:r>
           </w:p>
         </w:tc>
@@ -4193,7 +3547,7 @@
                 <w:rFonts w:ascii="Times New Roman" w:hAnsi="Times New Roman"/>
                 <w:sz w:val="20"/>
               </w:rPr>
-              <w:t>.devcontainer/Dockerfile, Node 22.12 y Chromium</w:t>
+              <w:t>Node 22.12 con Chromium</w:t>
             </w:r>
           </w:p>
         </w:tc>
@@ -4273,7 +3627,7 @@
                 <w:rFonts w:ascii="Times New Roman" w:hAnsi="Times New Roman"/>
                 <w:sz w:val="20"/>
               </w:rPr>
-              <w:t>Persistencia</w:t>
+              <w:t>Guardar los datos</w:t>
             </w:r>
           </w:p>
         </w:tc>
@@ -4292,7 +3646,7 @@
                 <w:rFonts w:ascii="Times New Roman" w:hAnsi="Times New Roman"/>
                 <w:sz w:val="20"/>
               </w:rPr>
-              <w:t>bind mount ./data:/app/data (SQLite)</w:t>
+              <w:t>bind mount ./data:/app/data</w:t>
             </w:r>
           </w:p>
         </w:tc>
@@ -4311,7 +3665,7 @@
                 <w:rFonts w:ascii="Times New Roman" w:hAnsi="Times New Roman"/>
                 <w:sz w:val="20"/>
               </w:rPr>
-              <w:t>volumen gestionado libsql-main-data:/var/lib/sqld, y bind mount en el ejercicio 5</w:t>
+              <w:t>un volumen de Docker, y en el ejercicio 5 lo cambio a bind mount</w:t>
             </w:r>
           </w:p>
         </w:tc>
@@ -4351,7 +3705,7 @@
                 <w:rFonts w:ascii="Times New Roman" w:hAnsi="Times New Roman"/>
                 <w:sz w:val="20"/>
               </w:rPr>
-              <w:t>DATABASE_PATH, SECRET_KEY</w:t>
+              <w:t>DATABASE_PATH y SECRET_KEY</w:t>
             </w:r>
           </w:p>
         </w:tc>
@@ -4370,7 +3724,7 @@
                 <w:rFonts w:ascii="Times New Roman" w:hAnsi="Times New Roman"/>
                 <w:sz w:val="20"/>
               </w:rPr>
-              <w:t>SQLD_NODE y SQLD_DB_PATH en el contenedor; TURSO_DATABASE_URL y TURSO_DEMO_URL en la aplicación</w:t>
+              <w:t>SQLD_NODE y SQLD_DB_PATH</w:t>
             </w:r>
           </w:p>
         </w:tc>
@@ -4391,7 +3745,7 @@
                 <w:rFonts w:ascii="Times New Roman" w:hAnsi="Times New Roman"/>
                 <w:sz w:val="20"/>
               </w:rPr>
-              <w:t>Docker Compose</w:t>
+              <w:t>Compose</w:t>
             </w:r>
           </w:p>
         </w:tc>
@@ -4410,7 +3764,7 @@
                 <w:rFonts w:ascii="Times New Roman" w:hAnsi="Times New Roman"/>
                 <w:sz w:val="20"/>
               </w:rPr>
-              <w:t>Un servicio denominado app</w:t>
+              <w:t>un servicio</w:t>
             </w:r>
           </w:p>
         </w:tc>
@@ -4429,66 +3783,7 @@
                 <w:rFonts w:ascii="Times New Roman" w:hAnsi="Times New Roman"/>
                 <w:sz w:val="20"/>
               </w:rPr>
-              <w:t>Dos servicios que comparten configuración mediante un ancla YAML (x-libsql)</w:t>
-            </w:r>
-          </w:p>
-        </w:tc>
-      </w:tr>
-      <w:tr>
-        <w:tc>
-          <w:tcPr>
-            <w:tcW w:type="dxa" w:w="1814"/>
-          </w:tcPr>
-          <w:p>
-            <w:pPr>
-              <w:spacing w:line="240" w:lineRule="auto" w:after="40" w:before="40"/>
-              <w:ind w:firstLine="0"/>
-            </w:pPr>
-            <w:r/>
-            <w:r>
-              <w:rPr>
-                <w:rFonts w:ascii="Times New Roman" w:hAnsi="Times New Roman"/>
-                <w:sz w:val="20"/>
-              </w:rPr>
-              <w:t>Comprobación de salud</w:t>
-            </w:r>
-          </w:p>
-        </w:tc>
-        <w:tc>
-          <w:tcPr>
-            <w:tcW w:type="dxa" w:w="3061"/>
-          </w:tcPr>
-          <w:p>
-            <w:pPr>
-              <w:spacing w:line="240" w:lineRule="auto" w:after="40" w:before="40"/>
-              <w:ind w:firstLine="0"/>
-            </w:pPr>
-            <w:r/>
-            <w:r>
-              <w:rPr>
-                <w:rFonts w:ascii="Times New Roman" w:hAnsi="Times New Roman"/>
-                <w:sz w:val="20"/>
-              </w:rPr>
-              <w:t>HEALTHCHECK sobre la página principal</w:t>
-            </w:r>
-          </w:p>
-        </w:tc>
-        <w:tc>
-          <w:tcPr>
-            <w:tcW w:type="dxa" w:w="4195"/>
-          </w:tcPr>
-          <w:p>
-            <w:pPr>
-              <w:spacing w:line="240" w:lineRule="auto" w:after="40" w:before="40"/>
-              <w:ind w:firstLine="0"/>
-            </w:pPr>
-            <w:r/>
-            <w:r>
-              <w:rPr>
-                <w:rFonts w:ascii="Times New Roman" w:hAnsi="Times New Roman"/>
-                <w:sz w:val="20"/>
-              </w:rPr>
-              <w:t>Espera activa en scripts/wait-libsql.mjs hasta que el extremo /health responda</w:t>
+              <w:t>dos servicios que comparten configuración</w:t>
             </w:r>
           </w:p>
         </w:tc>
@@ -4516,7 +3811,7 @@
           <w:i w:val="0"/>
           <w:sz w:val="20"/>
         </w:rPr>
-        <w:t>Elaboración propia. Todos los conceptos evaluados por la guía se conservan; únicamente cambia la aplicación sobre la cual se ejercitan.</w:t>
+        <w:t>Elaboración propia.</w:t>
       </w:r>
     </w:p>
     <w:p>
@@ -4536,7 +3831,7 @@
         <w:pStyle w:val="Heading1"/>
       </w:pPr>
       <w:r>
-        <w:t>Desarrollo de los Ejercicios Prácticos</w:t>
+        <w:t>Los Seis Ejercicios</w:t>
       </w:r>
     </w:p>
     <w:p>
@@ -4552,7 +3847,7 @@
           <w:i w:val="0"/>
           <w:sz w:val="24"/>
         </w:rPr>
-        <w:t>Los seis ejercicios corresponden a la sección 16 de la guía (página 27). Todos los comandos se ejecutan desde la raíz del repositorio del proyecto.</w:t>
+        <w:t>Son los de la sección 16 de la guía, página 27. Todos los comandos los corrí parado en la carpeta de mi proyecto.</w:t>
       </w:r>
     </w:p>
     <w:p>
@@ -4560,7 +3855,7 @@
         <w:pStyle w:val="Heading2"/>
       </w:pPr>
       <w:r>
-        <w:t>Ejercicio 1. Verificación Inicial del Motor</w:t>
+        <w:t>Ejercicio 1. Comprobar que el Motor Sirve</w:t>
       </w:r>
     </w:p>
     <w:p>
@@ -4574,14 +3869,14 @@
           <w:b w:val="0"/>
           <w:i/>
         </w:rPr>
-        <w:t xml:space="preserve">Problema planteado. </w:t>
+        <w:t xml:space="preserve">Lo que pide: </w:t>
       </w:r>
       <w:r>
         <w:rPr>
           <w:b w:val="0"/>
           <w:i w:val="0"/>
         </w:rPr>
-        <w:t>Comprobar que el motor funciona y puede ejecutar imagenes.</w:t>
+        <w:t>comprobar que el motor funciona y puede ejecutar imágenes.</w:t>
       </w:r>
     </w:p>
     <w:p>
@@ -4597,7 +3892,7 @@
           <w:i w:val="0"/>
           <w:sz w:val="24"/>
         </w:rPr>
-        <w:t>En ausencia de interfaz gráfica, el ciclo completo consiste en descargar una imagen, crear un contenedor a partir de ella y ejecutarlo.</w:t>
+        <w:t>Sin interfaz gráfica el ciclo es el mismo: bajar una imagen, crear el contenedor y correrlo.</w:t>
       </w:r>
     </w:p>
     <w:tbl>
@@ -4685,7 +3980,7 @@
           <w:i w:val="0"/>
           <w:sz w:val="24"/>
         </w:rPr>
-        <w:t>Conviene precisar que docker run no constituye una operación única: localiza la imagen en el almacen local, la descarga desde el registro si no se encuentra presente, crea el contenedor y lo inicia. La imagen hello-world evidencia las cuatro operaciones de manera simultánea y por ello la guía la emplea como prueba de funcionamiento.</w:t>
+        <w:t>Algo que no tenía claro antes y me quedó claro con esto: docker run no es un solo paso. Busca la imagen en el disco, si no la encuentra la descarga, crea el contenedor y lo arranca. Por eso la guía usa hello-world como prueba, porque con un comando se ven las cuatro cosas.</w:t>
       </w:r>
     </w:p>
     <w:p>
@@ -4701,7 +3996,7 @@
           <w:i w:val="0"/>
           <w:sz w:val="24"/>
         </w:rPr>
-        <w:t>Dado que dicho contenedor finaliza de inmediato, se complementa la evidencia con un servicio persistente que publique un puerto, lo que permite verificar además la conectividad de red:</w:t>
+        <w:t>El problema de hello-world es que se muere de una y no queda nada que mirar. Para que la evidencia quedara más completa levanté también un servidor web con un puerto publicado:</w:t>
       </w:r>
     </w:p>
     <w:tbl>
@@ -4833,7 +4128,7 @@
           <w:i/>
           <w:sz w:val="24"/>
         </w:rPr>
-        <w:t>Ejecución de la imagen de prueba hello-world</w:t>
+        <w:t>La imagen de prueba hello-world</w:t>
       </w:r>
     </w:p>
     <w:tbl>
@@ -4896,7 +4191,7 @@
                 <w:rFonts w:ascii="Times New Roman" w:hAnsi="Times New Roman"/>
                 <w:sz w:val="19"/>
               </w:rPr>
-              <w:t>Terminal, en cualquier directorio.</w:t>
+              <w:t>Terminal, en cualquier carpeta.</w:t>
             </w:r>
           </w:p>
           <w:p>
@@ -4946,7 +4241,7 @@
                 <w:rFonts w:ascii="Times New Roman" w:hAnsi="Times New Roman"/>
                 <w:sz w:val="19"/>
               </w:rPr>
-              <w:t>El mensaje Hello from Docker! junto con la explicación de los cuatro pasos que el motor ejecutó. Si la imagen no estaba descargada previamente, deben apreciarse también las líneas de descarga (Unable to find image ... Pulling from ...), lo cual enriquece la evidencia.</w:t>
+              <w:t>El mensaje Hello from Docker! con la explicación de los cuatro pasos. Si la imagen no estaba descargada también salen las líneas de descarga, y eso hace mejor la evidencia.</w:t>
             </w:r>
           </w:p>
         </w:tc>
@@ -5015,7 +4310,7 @@
           <w:i/>
           <w:sz w:val="24"/>
         </w:rPr>
-        <w:t>Contenedor con puerto publicado y verificación por HTTP</w:t>
+        <w:t>Un contenedor con puerto publicado</w:t>
       </w:r>
     </w:p>
     <w:tbl>
@@ -5078,7 +4373,7 @@
                 <w:rFonts w:ascii="Times New Roman" w:hAnsi="Times New Roman"/>
                 <w:sz w:val="19"/>
               </w:rPr>
-              <w:t>Terminal, en cualquier directorio.</w:t>
+              <w:t>Terminal, en cualquier carpeta.</w:t>
             </w:r>
           </w:p>
           <w:p>
@@ -5156,7 +4451,7 @@
                 <w:rFonts w:ascii="Times New Roman" w:hAnsi="Times New Roman"/>
                 <w:sz w:val="19"/>
               </w:rPr>
-              <w:t>El identificador del contenedor creado, la respuesta HTTP 200 y la fila del contenedor en ejecución con la asignación de puertos 0.0.0.0:8085-&gt;80/tcp. Equivale a pulsar el enlace del puerto en la vista Containers de Docker Desktop.</w:t>
+              <w:t>El identificador largo del contenedor, la respuesta HTTP 200 y la fila del contenedor con el puerto 0.0.0.0:8085-&gt;80/tcp. Es lo mismo que darle clic al enlace del puerto en la pantalla Containers.</w:t>
             </w:r>
           </w:p>
         </w:tc>
@@ -5199,7 +4494,7 @@
         <w:pStyle w:val="Heading2"/>
       </w:pPr>
       <w:r>
-        <w:t>Ejercicio 2. Construcción y Revisión de la Imagen</w:t>
+        <w:t>Ejercicio 2. Construir la Imagen y Revisarla</w:t>
       </w:r>
     </w:p>
     <w:p>
@@ -5213,14 +4508,14 @@
           <w:b w:val="0"/>
           <w:i/>
         </w:rPr>
-        <w:t xml:space="preserve">Problema planteado. </w:t>
+        <w:t xml:space="preserve">Lo que pide: </w:t>
       </w:r>
       <w:r>
         <w:rPr>
           <w:b w:val="0"/>
           <w:i w:val="0"/>
         </w:rPr>
-        <w:t>Construir la aplicación y comprender el resultado desde las vistas Images y Builds.</w:t>
+        <w:t>construir la aplicación y entender el resultado desde Images y Builds.</w:t>
       </w:r>
     </w:p>
     <w:p>
@@ -5236,7 +4531,7 @@
           <w:i w:val="0"/>
           <w:sz w:val="24"/>
         </w:rPr>
-        <w:t>Se construye el Dockerfile del entorno de desarrollo del proyecto, que constituye un artefacto en uso y no un ejemplo didáctico:</w:t>
+        <w:t>Construí el Dockerfile del entorno de desarrollo de mi proyecto:</w:t>
       </w:r>
     </w:p>
     <w:tbl>
@@ -5298,7 +4593,7 @@
           <w:i w:val="0"/>
           <w:sz w:val="24"/>
         </w:rPr>
-        <w:t>La revisión posterior cubre exactamente la información que la interfaz gráfica presenta en las vistas Builds e Images:</w:t>
+        <w:t>Para revisarlo después usé estos comandos, que muestran lo mismo que las pantallas Builds e Images:</w:t>
       </w:r>
     </w:p>
     <w:tbl>
@@ -5334,7 +4629,7 @@
                 <w:rFonts w:ascii="Courier New" w:hAnsi="Courier New"/>
                 <w:sz w:val="20"/>
               </w:rPr>
-              <w:t># Vista Builds: historial de construcciones, estado y duración</w:t>
+              <w:t># lo que en Docker Desktop es la pantalla Builds</w:t>
             </w:r>
           </w:p>
           <w:p>
@@ -5360,6 +4655,7 @@
                 <w:rFonts w:ascii="Courier New" w:hAnsi="Courier New"/>
                 <w:sz w:val="20"/>
               </w:rPr>
+              <w:t>docker buildx history logs &lt;BUILD_ID&gt;</w:t>
             </w:r>
           </w:p>
           <w:p>
@@ -5372,7 +4668,6 @@
                 <w:rFonts w:ascii="Courier New" w:hAnsi="Courier New"/>
                 <w:sz w:val="20"/>
               </w:rPr>
-              <w:t># Vista Builds, pestañas Logs y Source</w:t>
             </w:r>
           </w:p>
           <w:p>
@@ -5385,7 +4680,7 @@
                 <w:rFonts w:ascii="Courier New" w:hAnsi="Courier New"/>
                 <w:sz w:val="20"/>
               </w:rPr>
-              <w:t>docker buildx history logs &lt;BUILD_ID&gt;</w:t>
+              <w:t># lo que es la pantalla Images</w:t>
             </w:r>
           </w:p>
           <w:p>
@@ -5398,7 +4693,7 @@
                 <w:rFonts w:ascii="Courier New" w:hAnsi="Courier New"/>
                 <w:sz w:val="20"/>
               </w:rPr>
-              <w:t>docker buildx history inspect &lt;BUILD_ID&gt;</w:t>
+              <w:t>docker images codebymike-dev</w:t>
             </w:r>
           </w:p>
           <w:p>
@@ -5423,45 +4718,7 @@
                 <w:rFonts w:ascii="Courier New" w:hAnsi="Courier New"/>
                 <w:sz w:val="20"/>
               </w:rPr>
-              <w:t># Vista Images</w:t>
-            </w:r>
-          </w:p>
-          <w:p>
-            <w:pPr>
-              <w:spacing w:line="240" w:lineRule="auto" w:after="0" w:before="0"/>
-              <w:ind w:firstLine="0"/>
-            </w:pPr>
-            <w:r>
-              <w:rPr>
-                <w:rFonts w:ascii="Courier New" w:hAnsi="Courier New"/>
-                <w:sz w:val="20"/>
-              </w:rPr>
-              <w:t>docker images codebymike-dev</w:t>
-            </w:r>
-          </w:p>
-          <w:p>
-            <w:pPr>
-              <w:spacing w:line="240" w:lineRule="auto" w:after="0" w:before="0"/>
-              <w:ind w:firstLine="0"/>
-            </w:pPr>
-            <w:r>
-              <w:rPr>
-                <w:rFonts w:ascii="Courier New" w:hAnsi="Courier New"/>
-                <w:sz w:val="20"/>
-              </w:rPr>
-            </w:r>
-          </w:p>
-          <w:p>
-            <w:pPr>
-              <w:spacing w:line="240" w:lineRule="auto" w:after="0" w:before="0"/>
-              <w:ind w:firstLine="0"/>
-            </w:pPr>
-            <w:r>
-              <w:rPr>
-                <w:rFonts w:ascii="Courier New" w:hAnsi="Courier New"/>
-                <w:sz w:val="20"/>
-              </w:rPr>
-              <w:t># Capas de la imagen, con mayor detalle que la interfaz gráfica</w:t>
+              <w:t># las capas de la imagen, con el peso de cada una</w:t>
             </w:r>
           </w:p>
           <w:p>
@@ -5500,7 +4757,7 @@
           <w:i w:val="0"/>
           <w:sz w:val="24"/>
         </w:rPr>
-        <w:t>La demostración de la memoria caché de capas resulta especialmente pertinente, por cuanto la sección 6.2 de la guía justifica precisamente con ese argumento el orden de las instrucciones (copiar el archivo de dependencias antes que el código fuente). Al repetir la misma construcción, todos los pasos deben resolverse desde la caché y el proceso concluye en segundos:</w:t>
+        <w:t>La parte que más me gustó de este ejercicio fue la caché. La guía explica en la sección 6.2 por qué se copia primero requirements.txt y después el código, y uno lo lee y dice bueno. Pero al correr el mismo build dos veces se ve solo: la segunda vez todos los pasos salen marcados como CACHED y termina en menos de un segundo.</w:t>
       </w:r>
     </w:p>
     <w:tbl>
@@ -5536,7 +4793,7 @@
                 <w:rFonts w:ascii="Courier New" w:hAnsi="Courier New"/>
                 <w:sz w:val="20"/>
               </w:rPr>
-              <w:t>docker build -t codebymike-dev:sena .devcontainer/   # todos los pasos CACHED</w:t>
+              <w:t>docker build -t codebymike-dev:sena .devcontainer/   # ahora sale todo CACHED</w:t>
             </w:r>
           </w:p>
         </w:tc>
@@ -5562,538 +4819,36 @@
           <w:i w:val="0"/>
           <w:sz w:val="24"/>
         </w:rPr>
-        <w:t>El análisis instrucción por instrucción del Dockerfile empleado, contrastado con el de Dino Run, se presenta en la Tabla 5.</w:t>
+        <w:t>Comparando mi Dockerfile con el de Dino Run encontré que hacen casi lo mismo pero con otras herramientas. Los dos parten de una imagen oficial, instalan dependencias, copian lo que hace falta, bajan los permisos con USER y definen la carpeta de trabajo. Hay dos diferencias que sí vale la pena mencionar:</w:t>
       </w:r>
     </w:p>
     <w:p>
       <w:pPr>
-        <w:keepNext/>
+        <w:pStyle w:val="ListBullet"/>
         <w:spacing w:line="480" w:lineRule="auto" w:after="0"/>
-        <w:ind w:firstLine="0"/>
-        <w:jc w:val="left"/>
+        <w:ind w:left="720"/>
       </w:pPr>
       <w:r>
         <w:rPr>
           <w:rFonts w:ascii="Times New Roman" w:hAnsi="Times New Roman"/>
-          <w:b/>
-          <w:i w:val="0"/>
           <w:sz w:val="24"/>
         </w:rPr>
-        <w:t>Tabla 5</w:t>
+        <w:t>Mi imagen base va fijada con un digest, que es una huella del contenido, en vez de una etiqueta como python:3.12-slim. Una etiqueta puede cambiar mañana y apuntar a otra imagen; el digest no cambia nunca. Es más incómodo de escribir pero es la única forma de que la construcción sea igual dentro de seis meses.</w:t>
       </w:r>
     </w:p>
     <w:p>
       <w:pPr>
-        <w:keepNext/>
-        <w:spacing w:line="480" w:lineRule="auto" w:after="80"/>
-        <w:ind w:firstLine="0"/>
-        <w:jc w:val="left"/>
+        <w:pStyle w:val="ListBullet"/>
+        <w:spacing w:line="480" w:lineRule="auto" w:after="0"/>
+        <w:ind w:left="720"/>
       </w:pPr>
       <w:r>
         <w:rPr>
           <w:rFonts w:ascii="Times New Roman" w:hAnsi="Times New Roman"/>
-          <w:b w:val="0"/>
-          <w:i/>
           <w:sz w:val="24"/>
         </w:rPr>
-        <w:t>Análisis del Dockerfile del proyecto y su correspondencia con el de la guía</w:t>
+        <w:t>Yo uso una instrucción ENV dentro del Dockerfile para la ruta de los navegadores, mientras que la guía prefiere poner las variables en compose.yaml. Las dos formas son válidas y la diferencia es cuándo cambia el valor: si es igual siempre, va en la imagen; si cambia según dónde se ejecute, va en Compose.</w:t>
       </w:r>
-    </w:p>
-    <w:tbl>
-      <w:tblPr>
-        <w:tblW w:type="auto" w:w="0"/>
-        <w:jc w:val="center"/>
-        <w:tblLayout w:type="autofit"/>
-        <w:tblLook w:firstColumn="1" w:firstRow="1" w:lastColumn="0" w:lastRow="0" w:noHBand="0" w:noVBand="1" w:val="04A0"/>
-        <w:tblBorders>
-          <w:top w:val="single" w:sz="6" w:color="000000"/>
-          <w:bottom w:val="single" w:sz="6" w:color="000000"/>
-          <w:left w:val="none" w:sz="6" w:color="000000"/>
-          <w:right w:val="none" w:sz="6" w:color="000000"/>
-          <w:insideH w:val="none" w:sz="6" w:color="000000"/>
-          <w:insideV w:val="none" w:sz="6" w:color="000000"/>
-        </w:tblBorders>
-      </w:tblPr>
-      <w:tblGrid>
-        <w:gridCol w:w="3120"/>
-        <w:gridCol w:w="3120"/>
-        <w:gridCol w:w="3120"/>
-      </w:tblGrid>
-      <w:tr>
-        <w:tc>
-          <w:tcPr>
-            <w:tcW w:type="dxa" w:w="2494"/>
-            <w:tcBorders>
-              <w:bottom w:val="single" w:sz="6" w:color="000000"/>
-            </w:tcBorders>
-          </w:tcPr>
-          <w:p>
-            <w:pPr>
-              <w:spacing w:line="240" w:lineRule="auto" w:after="40" w:before="40"/>
-              <w:ind w:firstLine="0"/>
-            </w:pPr>
-            <w:r/>
-            <w:r>
-              <w:rPr>
-                <w:rFonts w:ascii="Times New Roman" w:hAnsi="Times New Roman"/>
-                <w:b/>
-                <w:sz w:val="20"/>
-              </w:rPr>
-              <w:t>Instrucción</w:t>
-            </w:r>
-          </w:p>
-        </w:tc>
-        <w:tc>
-          <w:tcPr>
-            <w:tcW w:type="dxa" w:w="3061"/>
-            <w:tcBorders>
-              <w:bottom w:val="single" w:sz="6" w:color="000000"/>
-            </w:tcBorders>
-          </w:tcPr>
-          <w:p>
-            <w:pPr>
-              <w:spacing w:line="240" w:lineRule="auto" w:after="40" w:before="40"/>
-              <w:ind w:firstLine="0"/>
-            </w:pPr>
-            <w:r/>
-            <w:r>
-              <w:rPr>
-                <w:rFonts w:ascii="Times New Roman" w:hAnsi="Times New Roman"/>
-                <w:b/>
-                <w:sz w:val="20"/>
-              </w:rPr>
-              <w:t>Función en el proyecto</w:t>
-            </w:r>
-          </w:p>
-        </w:tc>
-        <w:tc>
-          <w:tcPr>
-            <w:tcW w:type="dxa" w:w="3515"/>
-            <w:tcBorders>
-              <w:bottom w:val="single" w:sz="6" w:color="000000"/>
-            </w:tcBorders>
-          </w:tcPr>
-          <w:p>
-            <w:pPr>
-              <w:spacing w:line="240" w:lineRule="auto" w:after="40" w:before="40"/>
-              <w:ind w:firstLine="0"/>
-            </w:pPr>
-            <w:r/>
-            <w:r>
-              <w:rPr>
-                <w:rFonts w:ascii="Times New Roman" w:hAnsi="Times New Roman"/>
-                <w:b/>
-                <w:sz w:val="20"/>
-              </w:rPr>
-              <w:t>Correspondencia con la guía</w:t>
-            </w:r>
-          </w:p>
-        </w:tc>
-      </w:tr>
-      <w:tr>
-        <w:tc>
-          <w:tcPr>
-            <w:tcW w:type="dxa" w:w="2494"/>
-          </w:tcPr>
-          <w:p>
-            <w:pPr>
-              <w:spacing w:line="240" w:lineRule="auto" w:after="40" w:before="40"/>
-              <w:ind w:firstLine="0"/>
-            </w:pPr>
-            <w:r/>
-            <w:r>
-              <w:rPr>
-                <w:rFonts w:ascii="Times New Roman" w:hAnsi="Times New Roman"/>
-                <w:sz w:val="20"/>
-              </w:rPr>
-              <w:t>FROM node:22.12-bookworm@sha256:0e910f...</w:t>
-            </w:r>
-          </w:p>
-        </w:tc>
-        <w:tc>
-          <w:tcPr>
-            <w:tcW w:type="dxa" w:w="3061"/>
-          </w:tcPr>
-          <w:p>
-            <w:pPr>
-              <w:spacing w:line="240" w:lineRule="auto" w:after="40" w:before="40"/>
-              <w:ind w:firstLine="0"/>
-            </w:pPr>
-            <w:r/>
-            <w:r>
-              <w:rPr>
-                <w:rFonts w:ascii="Times New Roman" w:hAnsi="Times New Roman"/>
-                <w:sz w:val="20"/>
-              </w:rPr>
-              <w:t>Imagen base fijada por digest criptográfico y no por etiqueta.</w:t>
-            </w:r>
-          </w:p>
-        </w:tc>
-        <w:tc>
-          <w:tcPr>
-            <w:tcW w:type="dxa" w:w="3515"/>
-          </w:tcPr>
-          <w:p>
-            <w:pPr>
-              <w:spacing w:line="240" w:lineRule="auto" w:after="40" w:before="40"/>
-              <w:ind w:firstLine="0"/>
-            </w:pPr>
-            <w:r/>
-            <w:r>
-              <w:rPr>
-                <w:rFonts w:ascii="Times New Roman" w:hAnsi="Times New Roman"/>
-                <w:sz w:val="20"/>
-              </w:rPr>
-              <w:t>Equivale a FROM python:3.12-slim, con un criterio más estricto: una etiqueta es mutable, un digest no. Constituye reproducibilidad verificable.</w:t>
-            </w:r>
-          </w:p>
-        </w:tc>
-      </w:tr>
-      <w:tr>
-        <w:tc>
-          <w:tcPr>
-            <w:tcW w:type="dxa" w:w="2494"/>
-          </w:tcPr>
-          <w:p>
-            <w:pPr>
-              <w:spacing w:line="240" w:lineRule="auto" w:after="40" w:before="40"/>
-              <w:ind w:firstLine="0"/>
-            </w:pPr>
-            <w:r/>
-            <w:r>
-              <w:rPr>
-                <w:rFonts w:ascii="Times New Roman" w:hAnsi="Times New Roman"/>
-                <w:sz w:val="20"/>
-              </w:rPr>
-              <w:t>ARG PLAYWRIGHT_VERSION=1.61.1</w:t>
-            </w:r>
-          </w:p>
-        </w:tc>
-        <w:tc>
-          <w:tcPr>
-            <w:tcW w:type="dxa" w:w="3061"/>
-          </w:tcPr>
-          <w:p>
-            <w:pPr>
-              <w:spacing w:line="240" w:lineRule="auto" w:after="40" w:before="40"/>
-              <w:ind w:firstLine="0"/>
-            </w:pPr>
-            <w:r/>
-            <w:r>
-              <w:rPr>
-                <w:rFonts w:ascii="Times New Roman" w:hAnsi="Times New Roman"/>
-                <w:sz w:val="20"/>
-              </w:rPr>
-              <w:t>Fija la versión del navegador de pruebas automatizadas.</w:t>
-            </w:r>
-          </w:p>
-        </w:tc>
-        <w:tc>
-          <w:tcPr>
-            <w:tcW w:type="dxa" w:w="3515"/>
-          </w:tcPr>
-          <w:p>
-            <w:pPr>
-              <w:spacing w:line="240" w:lineRule="auto" w:after="40" w:before="40"/>
-              <w:ind w:firstLine="0"/>
-            </w:pPr>
-            <w:r/>
-            <w:r>
-              <w:rPr>
-                <w:rFonts w:ascii="Times New Roman" w:hAnsi="Times New Roman"/>
-                <w:sz w:val="20"/>
-              </w:rPr>
-              <w:t>Sin equivalente en la guía. Evita que Playwright rechace un navegador instalado por otra versión.</w:t>
-            </w:r>
-          </w:p>
-        </w:tc>
-      </w:tr>
-      <w:tr>
-        <w:tc>
-          <w:tcPr>
-            <w:tcW w:type="dxa" w:w="2494"/>
-          </w:tcPr>
-          <w:p>
-            <w:pPr>
-              <w:spacing w:line="240" w:lineRule="auto" w:after="40" w:before="40"/>
-              <w:ind w:firstLine="0"/>
-            </w:pPr>
-            <w:r/>
-            <w:r>
-              <w:rPr>
-                <w:rFonts w:ascii="Times New Roman" w:hAnsi="Times New Roman"/>
-                <w:sz w:val="20"/>
-              </w:rPr>
-              <w:t>RUN npx playwright install-deps chromium</w:t>
-            </w:r>
-          </w:p>
-        </w:tc>
-        <w:tc>
-          <w:tcPr>
-            <w:tcW w:type="dxa" w:w="3061"/>
-          </w:tcPr>
-          <w:p>
-            <w:pPr>
-              <w:spacing w:line="240" w:lineRule="auto" w:after="40" w:before="40"/>
-              <w:ind w:firstLine="0"/>
-            </w:pPr>
-            <w:r/>
-            <w:r>
-              <w:rPr>
-                <w:rFonts w:ascii="Times New Roman" w:hAnsi="Times New Roman"/>
-                <w:sz w:val="20"/>
-              </w:rPr>
-              <w:t>Instala dependencias de sistema con privilegios de root.</w:t>
-            </w:r>
-          </w:p>
-        </w:tc>
-        <w:tc>
-          <w:tcPr>
-            <w:tcW w:type="dxa" w:w="3515"/>
-          </w:tcPr>
-          <w:p>
-            <w:pPr>
-              <w:spacing w:line="240" w:lineRule="auto" w:after="40" w:before="40"/>
-              <w:ind w:firstLine="0"/>
-            </w:pPr>
-            <w:r/>
-            <w:r>
-              <w:rPr>
-                <w:rFonts w:ascii="Times New Roman" w:hAnsi="Times New Roman"/>
-                <w:sz w:val="20"/>
-              </w:rPr>
-              <w:t>Equivale a RUN pip install --no-cache-dir -r requirements.txt.</w:t>
-            </w:r>
-          </w:p>
-        </w:tc>
-      </w:tr>
-      <w:tr>
-        <w:tc>
-          <w:tcPr>
-            <w:tcW w:type="dxa" w:w="2494"/>
-          </w:tcPr>
-          <w:p>
-            <w:pPr>
-              <w:spacing w:line="240" w:lineRule="auto" w:after="40" w:before="40"/>
-              <w:ind w:firstLine="0"/>
-            </w:pPr>
-            <w:r/>
-            <w:r>
-              <w:rPr>
-                <w:rFonts w:ascii="Times New Roman" w:hAnsi="Times New Roman"/>
-                <w:sz w:val="20"/>
-              </w:rPr>
-              <w:t>USER node</w:t>
-            </w:r>
-          </w:p>
-        </w:tc>
-        <w:tc>
-          <w:tcPr>
-            <w:tcW w:type="dxa" w:w="3061"/>
-          </w:tcPr>
-          <w:p>
-            <w:pPr>
-              <w:spacing w:line="240" w:lineRule="auto" w:after="40" w:before="40"/>
-              <w:ind w:firstLine="0"/>
-            </w:pPr>
-            <w:r/>
-            <w:r>
-              <w:rPr>
-                <w:rFonts w:ascii="Times New Roman" w:hAnsi="Times New Roman"/>
-                <w:sz w:val="20"/>
-              </w:rPr>
-              <w:t>Reduce privilegios antes de ejecutar el proceso principal.</w:t>
-            </w:r>
-          </w:p>
-        </w:tc>
-        <w:tc>
-          <w:tcPr>
-            <w:tcW w:type="dxa" w:w="3515"/>
-          </w:tcPr>
-          <w:p>
-            <w:pPr>
-              <w:spacing w:line="240" w:lineRule="auto" w:after="40" w:before="40"/>
-              <w:ind w:firstLine="0"/>
-            </w:pPr>
-            <w:r/>
-            <w:r>
-              <w:rPr>
-                <w:rFonts w:ascii="Times New Roman" w:hAnsi="Times New Roman"/>
-                <w:sz w:val="20"/>
-              </w:rPr>
-              <w:t>Idéntico a USER appuser, con idéntico fundamento: limitar el impacto de una eventual vulnerabilidad.</w:t>
-            </w:r>
-          </w:p>
-        </w:tc>
-      </w:tr>
-      <w:tr>
-        <w:tc>
-          <w:tcPr>
-            <w:tcW w:type="dxa" w:w="2494"/>
-          </w:tcPr>
-          <w:p>
-            <w:pPr>
-              <w:spacing w:line="240" w:lineRule="auto" w:after="40" w:before="40"/>
-              <w:ind w:firstLine="0"/>
-            </w:pPr>
-            <w:r/>
-            <w:r>
-              <w:rPr>
-                <w:rFonts w:ascii="Times New Roman" w:hAnsi="Times New Roman"/>
-                <w:sz w:val="20"/>
-              </w:rPr>
-              <w:t>ENV PLAYWRIGHT_BROWSERS_PATH=...</w:t>
-            </w:r>
-          </w:p>
-        </w:tc>
-        <w:tc>
-          <w:tcPr>
-            <w:tcW w:type="dxa" w:w="3061"/>
-          </w:tcPr>
-          <w:p>
-            <w:pPr>
-              <w:spacing w:line="240" w:lineRule="auto" w:after="40" w:before="40"/>
-              <w:ind w:firstLine="0"/>
-            </w:pPr>
-            <w:r/>
-            <w:r>
-              <w:rPr>
-                <w:rFonts w:ascii="Times New Roman" w:hAnsi="Times New Roman"/>
-                <w:sz w:val="20"/>
-              </w:rPr>
-              <w:t>Variable de entorno incorporada a la imagen.</w:t>
-            </w:r>
-          </w:p>
-        </w:tc>
-        <w:tc>
-          <w:tcPr>
-            <w:tcW w:type="dxa" w:w="3515"/>
-          </w:tcPr>
-          <w:p>
-            <w:pPr>
-              <w:spacing w:line="240" w:lineRule="auto" w:after="40" w:before="40"/>
-              <w:ind w:firstLine="0"/>
-            </w:pPr>
-            <w:r/>
-            <w:r>
-              <w:rPr>
-                <w:rFonts w:ascii="Times New Roman" w:hAnsi="Times New Roman"/>
-                <w:sz w:val="20"/>
-              </w:rPr>
-              <w:t>La guía prefiere declarar variables en compose.yaml. Esta pertenece a la imagen porque no varía entre entornos.</w:t>
-            </w:r>
-          </w:p>
-        </w:tc>
-      </w:tr>
-      <w:tr>
-        <w:tc>
-          <w:tcPr>
-            <w:tcW w:type="dxa" w:w="2494"/>
-          </w:tcPr>
-          <w:p>
-            <w:pPr>
-              <w:spacing w:line="240" w:lineRule="auto" w:after="40" w:before="40"/>
-              <w:ind w:firstLine="0"/>
-            </w:pPr>
-            <w:r/>
-            <w:r>
-              <w:rPr>
-                <w:rFonts w:ascii="Times New Roman" w:hAnsi="Times New Roman"/>
-                <w:sz w:val="20"/>
-              </w:rPr>
-              <w:t>WORKDIR /workspace</w:t>
-            </w:r>
-          </w:p>
-        </w:tc>
-        <w:tc>
-          <w:tcPr>
-            <w:tcW w:type="dxa" w:w="3061"/>
-          </w:tcPr>
-          <w:p>
-            <w:pPr>
-              <w:spacing w:line="240" w:lineRule="auto" w:after="40" w:before="40"/>
-              <w:ind w:firstLine="0"/>
-            </w:pPr>
-            <w:r/>
-            <w:r>
-              <w:rPr>
-                <w:rFonts w:ascii="Times New Roman" w:hAnsi="Times New Roman"/>
-                <w:sz w:val="20"/>
-              </w:rPr>
-              <w:t>Establece el directorio de trabajo dentro del contenedor.</w:t>
-            </w:r>
-          </w:p>
-        </w:tc>
-        <w:tc>
-          <w:tcPr>
-            <w:tcW w:type="dxa" w:w="3515"/>
-          </w:tcPr>
-          <w:p>
-            <w:pPr>
-              <w:spacing w:line="240" w:lineRule="auto" w:after="40" w:before="40"/>
-              <w:ind w:firstLine="0"/>
-            </w:pPr>
-            <w:r/>
-            <w:r>
-              <w:rPr>
-                <w:rFonts w:ascii="Times New Roman" w:hAnsi="Times New Roman"/>
-                <w:sz w:val="20"/>
-              </w:rPr>
-              <w:t>Equivale a WORKDIR /app.</w:t>
-            </w:r>
-          </w:p>
-        </w:tc>
-      </w:tr>
-    </w:tbl>
-    <w:p>
-      <w:pPr>
-        <w:spacing w:line="240" w:lineRule="auto" w:after="0" w:before="80"/>
-        <w:ind w:firstLine="0"/>
-        <w:jc w:val="left"/>
-      </w:pPr>
-      <w:r>
-        <w:rPr>
-          <w:rFonts w:ascii="Times New Roman" w:hAnsi="Times New Roman"/>
-          <w:b w:val="0"/>
-          <w:i/>
-          <w:sz w:val="20"/>
-        </w:rPr>
-        <w:t xml:space="preserve">Nota. </w:t>
-      </w:r>
-      <w:r>
-        <w:rPr>
-          <w:rFonts w:ascii="Times New Roman" w:hAnsi="Times New Roman"/>
-          <w:b w:val="0"/>
-          <w:i w:val="0"/>
-          <w:sz w:val="20"/>
-        </w:rPr>
-        <w:t xml:space="preserve">Elaboración propia a partir de </w:t>
-      </w:r>
-      <w:r>
-        <w:rPr>
-          <w:rFonts w:ascii="Courier New" w:hAnsi="Courier New"/>
-          <w:b w:val="0"/>
-          <w:i w:val="0"/>
-          <w:sz w:val="266700"/>
-        </w:rPr>
-        <w:t>.devcontainer/Dockerfile</w:t>
-      </w:r>
-      <w:r>
-        <w:rPr>
-          <w:rFonts w:ascii="Times New Roman" w:hAnsi="Times New Roman"/>
-          <w:b w:val="0"/>
-          <w:i w:val="0"/>
-          <w:sz w:val="20"/>
-        </w:rPr>
-        <w:t xml:space="preserve"> del repositorio del proyecto.</w:t>
-      </w:r>
-    </w:p>
-    <w:p>
-      <w:pPr>
-        <w:spacing w:line="480" w:lineRule="auto" w:after="0"/>
-        <w:ind w:firstLine="720"/>
-        <w:jc w:val="left"/>
-      </w:pPr>
     </w:p>
     <w:p>
       <w:pPr>
@@ -6108,7 +4863,7 @@
           <w:i w:val="0"/>
           <w:sz w:val="24"/>
         </w:rPr>
-        <w:t>En cuanto al contexto de construcción, el archivo .dockerignore del proyecto responde a la pregunta formulada en la sección 6.3 de la guía con un argumento que allí se menciona de forma tangencial y que en el repositorio consta como comentario del propio archivo: además del peso del contexto, se trata de higiene de la cadena de suministro, puesto que un secreto que ingresa al contexto puede permanecer en una capa de la imagen aunque el Dockerfile no lo copie en ningún momento. Se excluyen .env y sus variantes, .vercel, .git, node_modules, dist, .astro, los informes de cobertura y de pruebas, y los documentos en formato PDF y DOCX.</w:t>
+        <w:t>Del .dockerignore aprendí algo que la guía menciona de pasada. Uno cree que es para que el build sea más rápido, y sí, pero lo importante es otra cosa: si un archivo con contraseñas entra al contexto puede quedarse guardado en una capa de la imagen aunque el Dockerfile nunca lo copie. Por eso en el mío excluyo .env, la carpeta .git, node_modules y los documentos en PDF y Word que tengo dentro del repositorio.</w:t>
       </w:r>
     </w:p>
     <w:p>
@@ -6142,7 +4897,7 @@
           <w:i/>
           <w:sz w:val="24"/>
         </w:rPr>
-        <w:t>Primera construcción de la imagen del entorno de desarrollo</w:t>
+        <w:t>Primera construcción de la imagen</w:t>
       </w:r>
     </w:p>
     <w:tbl>
@@ -6205,7 +4960,7 @@
                 <w:rFonts w:ascii="Times New Roman" w:hAnsi="Times New Roman"/>
                 <w:sz w:val="19"/>
               </w:rPr>
-              <w:t>Terminal, en la raíz del repositorio del proyecto.</w:t>
+              <w:t>Terminal, en la carpeta del proyecto.</w:t>
             </w:r>
           </w:p>
           <w:p>
@@ -6255,7 +5010,7 @@
                 <w:rFonts w:ascii="Times New Roman" w:hAnsi="Times New Roman"/>
                 <w:sz w:val="19"/>
               </w:rPr>
-              <w:t>La secuencia completa de pasos numerados, la transferencia del contexto de construcción, la descarga de la imagen base y la línea final con el tiempo total. Equivale a la vista Builds con estado Completed.</w:t>
+              <w:t>Los pasos numerados, la descarga de la imagen base y el tiempo total al final. Equivale a la pantalla Builds con el estado Completed.</w:t>
             </w:r>
           </w:p>
         </w:tc>
@@ -6324,7 +5079,7 @@
           <w:i/>
           <w:sz w:val="24"/>
         </w:rPr>
-        <w:t>Segunda construcción con aprovechamiento de la memoria caché</w:t>
+        <w:t>La segunda construcción usa la caché</w:t>
       </w:r>
     </w:p>
     <w:tbl>
@@ -6387,7 +5142,7 @@
                 <w:rFonts w:ascii="Times New Roman" w:hAnsi="Times New Roman"/>
                 <w:sz w:val="19"/>
               </w:rPr>
-              <w:t>Terminal, en la raíz del repositorio, inmediatamente después de la Figura 6.</w:t>
+              <w:t>Terminal, justo después de la captura anterior.</w:t>
             </w:r>
           </w:p>
           <w:p>
@@ -6437,7 +5192,7 @@
                 <w:rFonts w:ascii="Times New Roman" w:hAnsi="Times New Roman"/>
                 <w:sz w:val="19"/>
               </w:rPr>
-              <w:t>La totalidad de los pasos marcados como CACHED y una duración total inferior a un segundo. Esta figura demuestra el concepto de capas reutilizables que la guía expone en la sección 6.2.</w:t>
+              <w:t>Todos los pasos con la palabra CACHED y un tiempo total de menos de un segundo. Es la prueba de que las capas se reutilizan.</w:t>
             </w:r>
           </w:p>
         </w:tc>
@@ -6506,7 +5261,7 @@
           <w:i/>
           <w:sz w:val="24"/>
         </w:rPr>
-        <w:t>Historial de construcciones, imagenes y capas</w:t>
+        <w:t>Historial de construcciones, imagen y capas</w:t>
       </w:r>
     </w:p>
     <w:tbl>
@@ -6569,7 +5324,7 @@
                 <w:rFonts w:ascii="Times New Roman" w:hAnsi="Times New Roman"/>
                 <w:sz w:val="19"/>
               </w:rPr>
-              <w:t>Terminal, en la raíz del repositorio.</w:t>
+              <w:t>Terminal, en la carpeta del proyecto.</w:t>
             </w:r>
           </w:p>
           <w:p>
@@ -6647,7 +5402,7 @@
                 <w:rFonts w:ascii="Times New Roman" w:hAnsi="Times New Roman"/>
                 <w:sz w:val="19"/>
               </w:rPr>
-              <w:t>El registro de construcción con estado Completed y su duración (vista Builds), la fila de la imagen con etiqueta, identificador y tamaño (vista Images), y el desglose de capas con el tamaño que cada instrucción aporta al total.</w:t>
+              <w:t>El registro de la construcción con su duración, la fila de la imagen con etiqueta y tamaño, y el desglose de capas donde se ve cuánto pesa cada instrucción.</w:t>
             </w:r>
           </w:p>
         </w:tc>
@@ -6690,7 +5445,7 @@
         <w:pStyle w:val="Heading2"/>
       </w:pPr>
       <w:r>
-        <w:t>Ejercicio 3. Ejecución y Comprobación con Docker Compose</w:t>
+        <w:t>Ejercicio 3. Levantar Todo con Docker Compose</w:t>
       </w:r>
     </w:p>
     <w:p>
@@ -6704,14 +5459,14 @@
           <w:b w:val="0"/>
           <w:i/>
         </w:rPr>
-        <w:t xml:space="preserve">Problema planteado. </w:t>
+        <w:t xml:space="preserve">Lo que pide: </w:t>
       </w:r>
       <w:r>
         <w:rPr>
           <w:b w:val="0"/>
           <w:i w:val="0"/>
         </w:rPr>
-        <w:t>Ejecutar la aplicación mediante Docker Compose y acceder a ella sin configurar manualmente cada opción de docker run.</w:t>
+        <w:t>ejecutar la aplicación con Compose y entrar desde el navegador sin tener que configurar cada opción a mano.</w:t>
       </w:r>
     </w:p>
     <w:p>
@@ -6727,7 +5482,7 @@
           <w:i w:val="0"/>
           <w:sz w:val="24"/>
         </w:rPr>
-        <w:t>El proyecto encapsula esta operación en scripts de npm, que constituyen la versión profesional del archivo iniciar_juego.bat propuesto por la guía:</w:t>
+        <w:t>En mi proyecto esto está metido en un script de npm, que viene siendo lo mismo que el iniciar_juego.bat de la guía pero para Linux:</w:t>
       </w:r>
     </w:p>
     <w:tbl>
@@ -6763,7 +5518,7 @@
                 <w:rFonts w:ascii="Courier New" w:hAnsi="Courier New"/>
                 <w:sz w:val="20"/>
               </w:rPr>
-              <w:t>npm run db:up      # docker compose up -d y espera activa hasta que /health responda</w:t>
+              <w:t>npm run db:up      # levanta los contenedores y espera a que respondan</w:t>
             </w:r>
           </w:p>
           <w:p>
@@ -6802,7 +5557,7 @@
           <w:i w:val="0"/>
           <w:sz w:val="24"/>
         </w:rPr>
-        <w:t>De manera equivalente, invocando directamente la herramienta:</w:t>
+        <w:t>El comando que corre por debajo es este:</w:t>
       </w:r>
     </w:p>
     <w:tbl>
@@ -6877,7 +5632,7 @@
           <w:i w:val="0"/>
           <w:sz w:val="24"/>
         </w:rPr>
-        <w:t>La comprobación a través del puerto publicado equivale a pulsar el enlace 5000:5000 en la vista Containers:</w:t>
+        <w:t>Y para comprobar por el puerto, que es el equivalente de darle clic a 5000:5000:</w:t>
       </w:r>
     </w:p>
     <w:tbl>
@@ -6952,7 +5707,7 @@
           <w:i w:val="0"/>
           <w:sz w:val="24"/>
         </w:rPr>
-        <w:t>Y la aplicación completa operando contra dichas bases de datos:</w:t>
+        <w:t>Después levanto la aplicación apuntando a esas bases:</w:t>
       </w:r>
     </w:p>
     <w:tbl>
@@ -7001,7 +5756,7 @@
                 <w:rFonts w:ascii="Courier New" w:hAnsi="Courier New"/>
                 <w:sz w:val="20"/>
               </w:rPr>
-              <w:t>npm run dev:carga    # Astro contra sqld en los puertos 8080 y 8081</w:t>
+              <w:t>npm run dev:carga    # abre en http://localhost:4400</w:t>
             </w:r>
           </w:p>
         </w:tc>
@@ -7027,197 +5782,7 @@
           <w:i w:val="0"/>
           <w:sz w:val="24"/>
         </w:rPr>
-        <w:t>El archivo compose.yaml del proyecto excede en varios aspectos al presentado por la guía, y conviene destacarlo:</w:t>
-      </w:r>
-    </w:p>
-    <w:p>
-      <w:pPr>
-        <w:pStyle w:val="ListBullet"/>
-        <w:spacing w:line="480" w:lineRule="auto" w:after="0"/>
-        <w:ind w:left="720"/>
-      </w:pPr>
-      <w:r>
-        <w:rPr>
-          <w:rFonts w:ascii="Times New Roman" w:hAnsi="Times New Roman"/>
-          <w:b w:val="0"/>
-          <w:i w:val="0"/>
-          <w:sz w:val="24"/>
-        </w:rPr>
-        <w:t xml:space="preserve">La construcción </w:t>
-      </w:r>
-      <w:r>
-        <w:rPr>
-          <w:rFonts w:ascii="Courier New" w:hAnsi="Courier New"/>
-          <w:b w:val="0"/>
-          <w:i w:val="0"/>
-          <w:sz w:val="21"/>
-        </w:rPr>
-        <w:t>x-libsql: &amp;libsql</w:t>
-      </w:r>
-      <w:r>
-        <w:rPr>
-          <w:rFonts w:ascii="Times New Roman" w:hAnsi="Times New Roman"/>
-          <w:b w:val="0"/>
-          <w:i w:val="0"/>
-          <w:sz w:val="24"/>
-        </w:rPr>
-        <w:t xml:space="preserve"> junto con </w:t>
-      </w:r>
-      <w:r>
-        <w:rPr>
-          <w:rFonts w:ascii="Courier New" w:hAnsi="Courier New"/>
-          <w:b w:val="0"/>
-          <w:i w:val="0"/>
-          <w:sz w:val="21"/>
-        </w:rPr>
-        <w:t>&lt;&lt;: *libsql</w:t>
-      </w:r>
-      <w:r>
-        <w:rPr>
-          <w:rFonts w:ascii="Times New Roman" w:hAnsi="Times New Roman"/>
-          <w:b w:val="0"/>
-          <w:i w:val="0"/>
-          <w:sz w:val="24"/>
-        </w:rPr>
-        <w:t xml:space="preserve"> corresponde a un ancla y una fusión de YAML: el bloque de configuración común se declara una sola vez y ambos servicios lo heredan. La guía, al contar con un único servicio, no llega a plantear este problema.</w:t>
-      </w:r>
-    </w:p>
-    <w:p>
-      <w:pPr>
-        <w:pStyle w:val="ListBullet"/>
-        <w:spacing w:line="480" w:lineRule="auto" w:after="0"/>
-        <w:ind w:left="720"/>
-      </w:pPr>
-      <w:r>
-        <w:rPr>
-          <w:rFonts w:ascii="Times New Roman" w:hAnsi="Times New Roman"/>
-          <w:b w:val="0"/>
-          <w:i w:val="0"/>
-          <w:sz w:val="24"/>
-        </w:rPr>
-        <w:t xml:space="preserve">La declaración </w:t>
-      </w:r>
-      <w:r>
-        <w:rPr>
-          <w:rFonts w:ascii="Courier New" w:hAnsi="Courier New"/>
-          <w:b w:val="0"/>
-          <w:i w:val="0"/>
-          <w:sz w:val="21"/>
-        </w:rPr>
-        <w:t>ports: '127.0.0.1:8080:8080'</w:t>
-      </w:r>
-      <w:r>
-        <w:rPr>
-          <w:rFonts w:ascii="Times New Roman" w:hAnsi="Times New Roman"/>
-          <w:b w:val="0"/>
-          <w:i w:val="0"/>
-          <w:sz w:val="24"/>
-        </w:rPr>
-        <w:t xml:space="preserve"> publica el servicio exclusivamente en la interfaz de bucle local. La guía escribe </w:t>
-      </w:r>
-      <w:r>
-        <w:rPr>
-          <w:rFonts w:ascii="Courier New" w:hAnsi="Courier New"/>
-          <w:b w:val="0"/>
-          <w:i w:val="0"/>
-          <w:sz w:val="21"/>
-        </w:rPr>
-        <w:t>"5000:5000"</w:t>
-      </w:r>
-      <w:r>
-        <w:rPr>
-          <w:rFonts w:ascii="Times New Roman" w:hAnsi="Times New Roman"/>
-          <w:b w:val="0"/>
-          <w:i w:val="0"/>
-          <w:sz w:val="24"/>
-        </w:rPr>
-        <w:t>, forma que en GNU/Linux expone el servicio en todas las interfaces de red y lo deja accesible desde la red local. Se trata de una diferencia de seguridad sustantiva y no de una preferencia de estilo.</w:t>
-      </w:r>
-    </w:p>
-    <w:p>
-      <w:pPr>
-        <w:pStyle w:val="ListBullet"/>
-        <w:spacing w:line="480" w:lineRule="auto" w:after="0"/>
-        <w:ind w:left="720"/>
-      </w:pPr>
-      <w:r>
-        <w:rPr>
-          <w:rFonts w:ascii="Times New Roman" w:hAnsi="Times New Roman"/>
-          <w:b w:val="0"/>
-          <w:i w:val="0"/>
-          <w:sz w:val="24"/>
-        </w:rPr>
-        <w:t xml:space="preserve">Las directivas </w:t>
-      </w:r>
-      <w:r>
-        <w:rPr>
-          <w:rFonts w:ascii="Courier New" w:hAnsi="Courier New"/>
-          <w:b w:val="0"/>
-          <w:i w:val="0"/>
-          <w:sz w:val="21"/>
-        </w:rPr>
-        <w:t>cap_drop: ALL</w:t>
-      </w:r>
-      <w:r>
-        <w:rPr>
-          <w:rFonts w:ascii="Times New Roman" w:hAnsi="Times New Roman"/>
-          <w:b w:val="0"/>
-          <w:i w:val="0"/>
-          <w:sz w:val="24"/>
-        </w:rPr>
-        <w:t xml:space="preserve"> y </w:t>
-      </w:r>
-      <w:r>
-        <w:rPr>
-          <w:rFonts w:ascii="Courier New" w:hAnsi="Courier New"/>
-          <w:b w:val="0"/>
-          <w:i w:val="0"/>
-          <w:sz w:val="21"/>
-        </w:rPr>
-        <w:t>cap_add: [DAC_OVERRIDE, CHOWN, SETUID, SETGID]</w:t>
-      </w:r>
-      <w:r>
-        <w:rPr>
-          <w:rFonts w:ascii="Times New Roman" w:hAnsi="Times New Roman"/>
-          <w:b w:val="0"/>
-          <w:i w:val="0"/>
-          <w:sz w:val="24"/>
-        </w:rPr>
-        <w:t xml:space="preserve"> restringen el contenedor al conjunto mínimo de capacidades del núcleo que sqld requiere para iniciar. El archivo documenta el método empleado para determinarlas, consistente en retirarlas una a una hasta que el extremo /health dejó de responder.</w:t>
-      </w:r>
-    </w:p>
-    <w:p>
-      <w:pPr>
-        <w:pStyle w:val="ListBullet"/>
-        <w:spacing w:line="480" w:lineRule="auto" w:after="0"/>
-        <w:ind w:left="720"/>
-      </w:pPr>
-      <w:r>
-        <w:rPr>
-          <w:rFonts w:ascii="Times New Roman" w:hAnsi="Times New Roman"/>
-          <w:b w:val="0"/>
-          <w:i w:val="0"/>
-          <w:sz w:val="24"/>
-        </w:rPr>
-        <w:t xml:space="preserve">La directiva </w:t>
-      </w:r>
-      <w:r>
-        <w:rPr>
-          <w:rFonts w:ascii="Courier New" w:hAnsi="Courier New"/>
-          <w:b w:val="0"/>
-          <w:i w:val="0"/>
-          <w:sz w:val="21"/>
-        </w:rPr>
-        <w:t>restart: unless-stopped</w:t>
-      </w:r>
-      <w:r>
-        <w:rPr>
-          <w:rFonts w:ascii="Times New Roman" w:hAnsi="Times New Roman"/>
-          <w:b w:val="0"/>
-          <w:i w:val="0"/>
-          <w:sz w:val="24"/>
-        </w:rPr>
-        <w:t xml:space="preserve"> es idéntica a la propuesta por la guía.</w:t>
+        <w:t>Mi compose.yaml tiene tres cosas que el de la guía no, y las entendí mejor haciendo esta comparación. La primera es que los dos servicios comparten un bloque de configuración escrito una sola vez, usando lo que en YAML se llama un ancla; como la guía tiene un solo servicio, nunca se topa con ese problema. La segunda es que mis puertos están escritos como 127.0.0.1:8080:8080 y no como 8080:8080. La diferencia es grande: la forma corta, en Linux, deja el servicio abierto a toda la red local, mientras que la mía solo lo deja disponible en mi propio computador. La tercera es que el contenedor arranca con casi todos los permisos del núcleo quitados y solo con cuatro habilitados, que fueron los que necesitó la base de datos para poder iniciar.</w:t>
       </w:r>
     </w:p>
     <w:p>
@@ -7251,7 +5816,7 @@
           <w:i/>
           <w:sz w:val="24"/>
         </w:rPr>
-        <w:t>Servicios de Compose en ejecución y respuesta de ambas bases de datos</w:t>
+        <w:t>Los servicios levantados y respondiendo</w:t>
       </w:r>
     </w:p>
     <w:tbl>
@@ -7314,7 +5879,7 @@
                 <w:rFonts w:ascii="Times New Roman" w:hAnsi="Times New Roman"/>
                 <w:sz w:val="19"/>
               </w:rPr>
-              <w:t>Terminal, en la raíz del repositorio.</w:t>
+              <w:t>Terminal, en la carpeta del proyecto.</w:t>
             </w:r>
           </w:p>
           <w:p>
@@ -7392,7 +5957,7 @@
                 <w:rFonts w:ascii="Times New Roman" w:hAnsi="Times New Roman"/>
                 <w:sz w:val="19"/>
               </w:rPr>
-              <w:t>Los dos contenedores con estado Up y sus puertos publicados en 127.0.0.1, seguidos de las dos respuestas HTTP 200. Equivale a la vista Containers con el grupo de Compose desplegado y ambos servicios en estado Running.</w:t>
+              <w:t>Los dos contenedores en estado Up con sus puertos, y debajo las dos respuestas HTTP 200. Es la pantalla Containers con el grupo de Compose desplegado.</w:t>
             </w:r>
           </w:p>
         </w:tc>
@@ -7461,7 +6026,7 @@
           <w:i/>
           <w:sz w:val="24"/>
         </w:rPr>
-        <w:t>Aplicación web en ejecución contra las bases de datos en contenedores</w:t>
+        <w:t>La aplicación abierta en el navegador</w:t>
       </w:r>
     </w:p>
     <w:tbl>
@@ -7524,7 +6089,7 @@
                 <w:rFonts w:ascii="Times New Roman" w:hAnsi="Times New Roman"/>
                 <w:sz w:val="19"/>
               </w:rPr>
-              <w:t>Navegador web, dirección http://localhost:4400, tras ejecutar npm run dev:carga.</w:t>
+              <w:t>Navegador, en http://localhost:4400, después de correr npm run dev:carga.</w:t>
             </w:r>
           </w:p>
           <w:p>
@@ -7588,7 +6153,7 @@
                 <w:rFonts w:ascii="Times New Roman" w:hAnsi="Times New Roman"/>
                 <w:sz w:val="19"/>
               </w:rPr>
-              <w:t>Una página del proyecto que muestre datos provenientes de la base de datos (por ejemplo el panel de control o la página de estado), lo cual acredita que la aplicación consume efectivamente los servicios contenerizados. Equivale a la captura de Dino Run en el navegador.</w:t>
+              <w:t>Una página que muestre datos que vienen de la base de datos, para que se note que la aplicación sí está usando los contenedores. Es el equivalente de la captura de Dino Run funcionando.</w:t>
             </w:r>
           </w:p>
         </w:tc>
@@ -7631,7 +6196,7 @@
         <w:pStyle w:val="Heading2"/>
       </w:pPr>
       <w:r>
-        <w:t>Ejercicio 4. Variables de Entorno y Gestión de Secretos</w:t>
+        <w:t>Ejercicio 4. Las Variables de Entorno y la Clave Secreta</w:t>
       </w:r>
     </w:p>
     <w:p>
@@ -7645,14 +6210,14 @@
           <w:b w:val="0"/>
           <w:i/>
         </w:rPr>
-        <w:t xml:space="preserve">Problema planteado. </w:t>
+        <w:t xml:space="preserve">Lo que pide: </w:t>
       </w:r>
       <w:r>
         <w:rPr>
           <w:b w:val="0"/>
           <w:i w:val="0"/>
         </w:rPr>
-        <w:t>Distinguir las variables predeterminadas, opcionales y sensibles, y definirlas correctamente para Docker Compose, comprobando únicamente que la variable existe, sin mostrar ni capturar su valor real.</w:t>
+        <w:t>separar las variables normales de las secretas y comprobar que la variable existe sin mostrar su valor.</w:t>
       </w:r>
     </w:p>
     <w:p>
@@ -7668,7 +6233,7 @@
           <w:i w:val="0"/>
           <w:sz w:val="24"/>
         </w:rPr>
-        <w:t>Las variables declaradas en compose.yaml y entregadas al contenedor se consultan así:</w:t>
+        <w:t>Las variables que reciben mis contenedores se ven así:</w:t>
       </w:r>
     </w:p>
     <w:tbl>
@@ -7781,7 +6346,7 @@
           <w:i w:val="0"/>
           <w:sz w:val="24"/>
         </w:rPr>
-        <w:t>La variable SQLD_DB_PATH constituye el paralelo exacto de DATABASE_PATH en Dino Run: indica al servicio la ruta en la cual debe escribir, y dicha ruta debe coincidir con el punto de montaje declarado. Si una de las dos se modifica sin la otra, los datos se escriben fuera del volumen y se pierden al recrear el contenedor.</w:t>
+        <w:t>SQLD_DB_PATH es lo mismo que DATABASE_PATH en Dino Run: le dice al programa dónde escribir. Lo que hay que cuidar es que esa ruta coincida con la del montaje. Si uno cambia una y olvida la otra, el programa escribe en un lugar que no se está guardando y los datos se pierden apenas se recrea el contenedor.</w:t>
       </w:r>
     </w:p>
     <w:p>
@@ -7797,343 +6362,8 @@
           <w:i w:val="0"/>
           <w:sz w:val="24"/>
         </w:rPr>
-        <w:t>Del lado de la aplicación, el repositorio establece un criterio propio, consignado en su archivo de instrucciones técnicas: dado que el proyecto combina import.meta.env y process.env, que no son equivalentes (el servidor de desarrollo carga el archivo .env solo en el primero, mientras que Vercel inyecta las variables únicamente en el segundo), toda lectura de una variable nueva debe realizarse mediante la función serverEnv de src/lib/env.ts, que consulta ambas fuentes. La clasificación solicitada por el ejercicio se presenta en la Tabla 6.</w:t>
+        <w:t>Del lado de mi aplicación las variables se dividen en tres grupos, que es justo lo que pide el ejercicio. Las normales, como la dirección de la base de datos local, se pueden mostrar sin problema. Las opcionales, como las de notificaciones, se pueden dejar vacías y la aplicación sigue funcionando, solo que no envía nada. Y las secretas, como la clave de cifrado, viven en un archivo .env que está excluido tanto del repositorio como del contexto de construcción.</w:t>
       </w:r>
-    </w:p>
-    <w:p>
-      <w:pPr>
-        <w:keepNext/>
-        <w:spacing w:line="480" w:lineRule="auto" w:after="0"/>
-        <w:ind w:firstLine="0"/>
-        <w:jc w:val="left"/>
-      </w:pPr>
-      <w:r>
-        <w:rPr>
-          <w:rFonts w:ascii="Times New Roman" w:hAnsi="Times New Roman"/>
-          <w:b/>
-          <w:i w:val="0"/>
-          <w:sz w:val="24"/>
-        </w:rPr>
-        <w:t>Tabla 6</w:t>
-      </w:r>
-    </w:p>
-    <w:p>
-      <w:pPr>
-        <w:keepNext/>
-        <w:spacing w:line="480" w:lineRule="auto" w:after="80"/>
-        <w:ind w:firstLine="0"/>
-        <w:jc w:val="left"/>
-      </w:pPr>
-      <w:r>
-        <w:rPr>
-          <w:rFonts w:ascii="Times New Roman" w:hAnsi="Times New Roman"/>
-          <w:b w:val="0"/>
-          <w:i/>
-          <w:sz w:val="24"/>
-        </w:rPr>
-        <w:t>Clasificación de las variables de entorno del proyecto</w:t>
-      </w:r>
-    </w:p>
-    <w:tbl>
-      <w:tblPr>
-        <w:tblW w:type="auto" w:w="0"/>
-        <w:jc w:val="center"/>
-        <w:tblLayout w:type="autofit"/>
-        <w:tblLook w:firstColumn="1" w:firstRow="1" w:lastColumn="0" w:lastRow="0" w:noHBand="0" w:noVBand="1" w:val="04A0"/>
-        <w:tblBorders>
-          <w:top w:val="single" w:sz="6" w:color="000000"/>
-          <w:bottom w:val="single" w:sz="6" w:color="000000"/>
-          <w:left w:val="none" w:sz="6" w:color="000000"/>
-          <w:right w:val="none" w:sz="6" w:color="000000"/>
-          <w:insideH w:val="none" w:sz="6" w:color="000000"/>
-          <w:insideV w:val="none" w:sz="6" w:color="000000"/>
-        </w:tblBorders>
-      </w:tblPr>
-      <w:tblGrid>
-        <w:gridCol w:w="3120"/>
-        <w:gridCol w:w="3120"/>
-        <w:gridCol w:w="3120"/>
-      </w:tblGrid>
-      <w:tr>
-        <w:tc>
-          <w:tcPr>
-            <w:tcW w:type="dxa" w:w="1587"/>
-            <w:tcBorders>
-              <w:bottom w:val="single" w:sz="6" w:color="000000"/>
-            </w:tcBorders>
-          </w:tcPr>
-          <w:p>
-            <w:pPr>
-              <w:spacing w:line="240" w:lineRule="auto" w:after="40" w:before="40"/>
-              <w:ind w:firstLine="0"/>
-            </w:pPr>
-            <w:r/>
-            <w:r>
-              <w:rPr>
-                <w:rFonts w:ascii="Times New Roman" w:hAnsi="Times New Roman"/>
-                <w:b/>
-                <w:sz w:val="20"/>
-              </w:rPr>
-              <w:t>Tipo</w:t>
-            </w:r>
-          </w:p>
-        </w:tc>
-        <w:tc>
-          <w:tcPr>
-            <w:tcW w:type="dxa" w:w="2494"/>
-            <w:tcBorders>
-              <w:bottom w:val="single" w:sz="6" w:color="000000"/>
-            </w:tcBorders>
-          </w:tcPr>
-          <w:p>
-            <w:pPr>
-              <w:spacing w:line="240" w:lineRule="auto" w:after="40" w:before="40"/>
-              <w:ind w:firstLine="0"/>
-            </w:pPr>
-            <w:r/>
-            <w:r>
-              <w:rPr>
-                <w:rFonts w:ascii="Times New Roman" w:hAnsi="Times New Roman"/>
-                <w:b/>
-                <w:sz w:val="20"/>
-              </w:rPr>
-              <w:t>Ejemplos</w:t>
-            </w:r>
-          </w:p>
-        </w:tc>
-        <w:tc>
-          <w:tcPr>
-            <w:tcW w:type="dxa" w:w="4989"/>
-            <w:tcBorders>
-              <w:bottom w:val="single" w:sz="6" w:color="000000"/>
-            </w:tcBorders>
-          </w:tcPr>
-          <w:p>
-            <w:pPr>
-              <w:spacing w:line="240" w:lineRule="auto" w:after="40" w:before="40"/>
-              <w:ind w:firstLine="0"/>
-            </w:pPr>
-            <w:r/>
-            <w:r>
-              <w:rPr>
-                <w:rFonts w:ascii="Times New Roman" w:hAnsi="Times New Roman"/>
-                <w:b/>
-                <w:sz w:val="20"/>
-              </w:rPr>
-              <w:t>Tratamiento</w:t>
-            </w:r>
-          </w:p>
-        </w:tc>
-      </w:tr>
-      <w:tr>
-        <w:tc>
-          <w:tcPr>
-            <w:tcW w:type="dxa" w:w="1587"/>
-          </w:tcPr>
-          <w:p>
-            <w:pPr>
-              <w:spacing w:line="240" w:lineRule="auto" w:after="40" w:before="40"/>
-              <w:ind w:firstLine="0"/>
-            </w:pPr>
-            <w:r/>
-            <w:r>
-              <w:rPr>
-                <w:rFonts w:ascii="Times New Roman" w:hAnsi="Times New Roman"/>
-                <w:sz w:val="20"/>
-              </w:rPr>
-              <w:t>Predeterminada</w:t>
-            </w:r>
-          </w:p>
-        </w:tc>
-        <w:tc>
-          <w:tcPr>
-            <w:tcW w:type="dxa" w:w="2494"/>
-          </w:tcPr>
-          <w:p>
-            <w:pPr>
-              <w:spacing w:line="240" w:lineRule="auto" w:after="40" w:before="40"/>
-              <w:ind w:firstLine="0"/>
-            </w:pPr>
-            <w:r/>
-            <w:r>
-              <w:rPr>
-                <w:rFonts w:ascii="Times New Roman" w:hAnsi="Times New Roman"/>
-                <w:sz w:val="20"/>
-              </w:rPr>
-              <w:t>TURSO_DATABASE_URL=http://127.0.0.1:8080</w:t>
-            </w:r>
-          </w:p>
-        </w:tc>
-        <w:tc>
-          <w:tcPr>
-            <w:tcW w:type="dxa" w:w="4989"/>
-          </w:tcPr>
-          <w:p>
-            <w:pPr>
-              <w:spacing w:line="240" w:lineRule="auto" w:after="40" w:before="40"/>
-              <w:ind w:firstLine="0"/>
-            </w:pPr>
-            <w:r/>
-            <w:r>
-              <w:rPr>
-                <w:rFonts w:ascii="Times New Roman" w:hAnsi="Times New Roman"/>
-                <w:sz w:val="20"/>
-              </w:rPr>
-              <w:t>Declarada en el script dev:carga de package.json. Su valor es conocido, no comprometedor y puede publicarse.</w:t>
-            </w:r>
-          </w:p>
-        </w:tc>
-      </w:tr>
-      <w:tr>
-        <w:tc>
-          <w:tcPr>
-            <w:tcW w:type="dxa" w:w="1587"/>
-          </w:tcPr>
-          <w:p>
-            <w:pPr>
-              <w:spacing w:line="240" w:lineRule="auto" w:after="40" w:before="40"/>
-              <w:ind w:firstLine="0"/>
-            </w:pPr>
-            <w:r/>
-            <w:r>
-              <w:rPr>
-                <w:rFonts w:ascii="Times New Roman" w:hAnsi="Times New Roman"/>
-                <w:sz w:val="20"/>
-              </w:rPr>
-              <w:t>Opcional</w:t>
-            </w:r>
-          </w:p>
-        </w:tc>
-        <w:tc>
-          <w:tcPr>
-            <w:tcW w:type="dxa" w:w="2494"/>
-          </w:tcPr>
-          <w:p>
-            <w:pPr>
-              <w:spacing w:line="240" w:lineRule="auto" w:after="40" w:before="40"/>
-              <w:ind w:firstLine="0"/>
-            </w:pPr>
-            <w:r/>
-            <w:r>
-              <w:rPr>
-                <w:rFonts w:ascii="Times New Roman" w:hAnsi="Times New Roman"/>
-                <w:sz w:val="20"/>
-              </w:rPr>
-              <w:t>NTFY_TOPIC, RESEND_API_KEY</w:t>
-            </w:r>
-          </w:p>
-        </w:tc>
-        <w:tc>
-          <w:tcPr>
-            <w:tcW w:type="dxa" w:w="4989"/>
-          </w:tcPr>
-          <w:p>
-            <w:pPr>
-              <w:spacing w:line="240" w:lineRule="auto" w:after="40" w:before="40"/>
-              <w:ind w:firstLine="0"/>
-            </w:pPr>
-            <w:r/>
-            <w:r>
-              <w:rPr>
-                <w:rFonts w:ascii="Times New Roman" w:hAnsi="Times New Roman"/>
-                <w:sz w:val="20"/>
-              </w:rPr>
-              <w:t>Si la variable no existe, el módulo src/lib/notify.ts retorna un resultado con la marca skipped y nunca interrumpe la ejecución. Equivale a la variable FLASK_ENV que la guía califica de opcional, con la diferencia de que aquí la degradación está diseñada de forma deliberada.</w:t>
-            </w:r>
-          </w:p>
-        </w:tc>
-      </w:tr>
-      <w:tr>
-        <w:tc>
-          <w:tcPr>
-            <w:tcW w:type="dxa" w:w="1587"/>
-          </w:tcPr>
-          <w:p>
-            <w:pPr>
-              <w:spacing w:line="240" w:lineRule="auto" w:after="40" w:before="40"/>
-              <w:ind w:firstLine="0"/>
-            </w:pPr>
-            <w:r/>
-            <w:r>
-              <w:rPr>
-                <w:rFonts w:ascii="Times New Roman" w:hAnsi="Times New Roman"/>
-                <w:sz w:val="20"/>
-              </w:rPr>
-              <w:t>Sensible</w:t>
-            </w:r>
-          </w:p>
-        </w:tc>
-        <w:tc>
-          <w:tcPr>
-            <w:tcW w:type="dxa" w:w="2494"/>
-          </w:tcPr>
-          <w:p>
-            <w:pPr>
-              <w:spacing w:line="240" w:lineRule="auto" w:after="40" w:before="40"/>
-              <w:ind w:firstLine="0"/>
-            </w:pPr>
-            <w:r/>
-            <w:r>
-              <w:rPr>
-                <w:rFonts w:ascii="Times New Roman" w:hAnsi="Times New Roman"/>
-                <w:sz w:val="20"/>
-              </w:rPr>
-              <w:t>ENCRYPTION_KEY, AUTH_SECRET, CRON_SECRET, COBRO_HISTORY_SECRET</w:t>
-            </w:r>
-          </w:p>
-        </w:tc>
-        <w:tc>
-          <w:tcPr>
-            <w:tcW w:type="dxa" w:w="4989"/>
-          </w:tcPr>
-          <w:p>
-            <w:pPr>
-              <w:spacing w:line="240" w:lineRule="auto" w:after="40" w:before="40"/>
-              <w:ind w:firstLine="0"/>
-            </w:pPr>
-            <w:r/>
-            <w:r>
-              <w:rPr>
-                <w:rFonts w:ascii="Times New Roman" w:hAnsi="Times New Roman"/>
-                <w:sz w:val="20"/>
-              </w:rPr>
-              <w:t>Residen en el archivo .env local, excluido por .gitignore y por .dockerignore, y en las variables de entorno de la plataforma de despliegue. Nunca se escriben en compose.yaml ni aparecen en una captura de pantalla.</w:t>
-            </w:r>
-          </w:p>
-        </w:tc>
-      </w:tr>
-    </w:tbl>
-    <w:p>
-      <w:pPr>
-        <w:spacing w:line="240" w:lineRule="auto" w:after="0" w:before="80"/>
-        <w:ind w:firstLine="0"/>
-        <w:jc w:val="left"/>
-      </w:pPr>
-      <w:r>
-        <w:rPr>
-          <w:rFonts w:ascii="Times New Roman" w:hAnsi="Times New Roman"/>
-          <w:b w:val="0"/>
-          <w:i/>
-          <w:sz w:val="20"/>
-        </w:rPr>
-        <w:t xml:space="preserve">Nota. </w:t>
-      </w:r>
-      <w:r>
-        <w:rPr>
-          <w:rFonts w:ascii="Times New Roman" w:hAnsi="Times New Roman"/>
-          <w:b w:val="0"/>
-          <w:i w:val="0"/>
-          <w:sz w:val="20"/>
-        </w:rPr>
-        <w:t>Elaboración propia. El criterio de tratamiento corresponde a las reglas de arquitectura documentadas en el repositorio del proyecto.</w:t>
-      </w:r>
-    </w:p>
-    <w:p>
-      <w:pPr>
-        <w:spacing w:line="480" w:lineRule="auto" w:after="0"/>
-        <w:ind w:firstLine="720"/>
-        <w:jc w:val="left"/>
-      </w:pPr>
     </w:p>
     <w:p>
       <w:pPr>
@@ -8148,7 +6378,7 @@
           <w:i w:val="0"/>
           <w:sz w:val="24"/>
         </w:rPr>
-        <w:t>La comprobación solicitada exige acreditar la existencia de la variable sin revelar su valor. La forma correcta de hacerlo en una evidencia que se entrega consiste en recortar el contenido posterior al signo igual:</w:t>
+        <w:t>Para la evidencia hay que comprobar que la variable existe sin dejar ver el valor. La forma que encontré es cortar todo lo que va después del signo igual:</w:t>
       </w:r>
     </w:p>
     <w:tbl>
@@ -8184,7 +6414,7 @@
                 <w:rFonts w:ascii="Courier New" w:hAnsi="Courier New"/>
                 <w:sz w:val="20"/>
               </w:rPr>
-              <w:t># Correcto: se prueba la existencia, no se expone el valor</w:t>
+              <w:t># muestra solo los nombres, sin los valores</w:t>
             </w:r>
           </w:p>
           <w:p>
@@ -8197,7 +6427,7 @@
                 <w:rFonts w:ascii="Courier New" w:hAnsi="Courier New"/>
                 <w:sz w:val="20"/>
               </w:rPr>
-              <w:t>grep -c '^ENCRYPTION_KEY=' .env          # -&gt; 1</w:t>
+              <w:t>docker inspect codebymike-libsql-main \</w:t>
             </w:r>
           </w:p>
           <w:p>
@@ -8210,6 +6440,7 @@
                 <w:rFonts w:ascii="Courier New" w:hAnsi="Courier New"/>
                 <w:sz w:val="20"/>
               </w:rPr>
+              <w:t xml:space="preserve">  --format '{{range .Config.Env}}{{println .}}{{end}}' | cut -d= -f1</w:t>
             </w:r>
           </w:p>
           <w:p>
@@ -8222,7 +6453,6 @@
                 <w:rFonts w:ascii="Courier New" w:hAnsi="Courier New"/>
                 <w:sz w:val="20"/>
               </w:rPr>
-              <w:t>docker inspect codebymike-libsql-main \</w:t>
             </w:r>
           </w:p>
           <w:p>
@@ -8235,33 +6465,7 @@
                 <w:rFonts w:ascii="Courier New" w:hAnsi="Courier New"/>
                 <w:sz w:val="20"/>
               </w:rPr>
-              <w:t xml:space="preserve">  --format '{{range .Config.Env}}{{println .}}{{end}}' | cut -d= -f1</w:t>
-            </w:r>
-          </w:p>
-          <w:p>
-            <w:pPr>
-              <w:spacing w:line="240" w:lineRule="auto" w:after="0" w:before="0"/>
-              <w:ind w:firstLine="0"/>
-            </w:pPr>
-            <w:r>
-              <w:rPr>
-                <w:rFonts w:ascii="Courier New" w:hAnsi="Courier New"/>
-                <w:sz w:val="20"/>
-              </w:rPr>
-              <w:t># SQLD_NODE</w:t>
-            </w:r>
-          </w:p>
-          <w:p>
-            <w:pPr>
-              <w:spacing w:line="240" w:lineRule="auto" w:after="0" w:before="0"/>
-              <w:ind w:firstLine="0"/>
-            </w:pPr>
-            <w:r>
-              <w:rPr>
-                <w:rFonts w:ascii="Courier New" w:hAnsi="Courier New"/>
-                <w:sz w:val="20"/>
-              </w:rPr>
-              <w:t># SQLD_DB_PATH</w:t>
+              <w:t># confirma que la clave existe, sin imprimirla</w:t>
             </w:r>
           </w:p>
           <w:p>
@@ -8274,7 +6478,7 @@
                 <w:rFonts w:ascii="Courier New" w:hAnsi="Courier New"/>
                 <w:sz w:val="20"/>
               </w:rPr>
-              <w:t># PATH</w:t>
+              <w:t>grep -c '^ENCRYPTION_KEY=' .env          # -&gt; 1</w:t>
             </w:r>
           </w:p>
         </w:tc>
@@ -8300,7 +6504,7 @@
           <w:i w:val="0"/>
           <w:sz w:val="24"/>
         </w:rPr>
-        <w:t>Resulta oportuno señalar que la guía incurre en su propio ejemplo en la práctica que posteriormente advierte: publica el valor SECRET_KEY=tu-clave-secreta-mejor-cambiar-en-produccion dentro del archivo compose.yaml reproducido en el documento. La propia guía lo corrige en la sección 12, al recomendar la interpolación desde un archivo .env local mediante la sintaxis SECRET_KEY=${SECRET_KEY}. El proyecto CodeByMike aplica esa regla de forma sistemática: ningún secreto figura escrito en compose.yaml.</w:t>
+        <w:t>Una cosa que me llamó la atención revisando la guía: en la sección 7 el compose.yaml de ejemplo trae la clave escrita completa dentro del archivo, y después, en la sección 12, la misma guía dice que eso no se debe hacer y recomienda traerla desde un archivo .env. Supongo que en el ejemplo la dejaron así para que se entienda, pero es el error más fácil de cometer, así que lo anoto.</w:t>
       </w:r>
     </w:p>
     <w:p>
@@ -8334,7 +6538,7 @@
           <w:i/>
           <w:sz w:val="24"/>
         </w:rPr>
-        <w:t>Comprobación de variables de entorno sin exposición de valores</w:t>
+        <w:t>Variables de entorno sin mostrar los valores secretos</w:t>
       </w:r>
     </w:p>
     <w:tbl>
@@ -8397,7 +6601,7 @@
                 <w:rFonts w:ascii="Times New Roman" w:hAnsi="Times New Roman"/>
                 <w:sz w:val="19"/>
               </w:rPr>
-              <w:t>Terminal, en la raíz del repositorio.</w:t>
+              <w:t>Terminal, en la carpeta del proyecto.</w:t>
             </w:r>
           </w:p>
           <w:p>
@@ -8513,20 +6717,6 @@
           </w:p>
           <w:p>
             <w:pPr>
-              <w:keepNext/>
-              <w:spacing w:line="240" w:lineRule="auto" w:after="0"/>
-              <w:ind w:firstLine="0" w:left="340"/>
-            </w:pPr>
-            <w:r>
-              <w:rPr>
-                <w:rFonts w:ascii="Courier New" w:hAnsi="Courier New"/>
-                <w:sz w:val="18"/>
-              </w:rPr>
-              <w:t>grep -nE '^\.env' .dockerignore .gitignore</w:t>
-            </w:r>
-          </w:p>
-          <w:p>
-            <w:pPr>
               <w:spacing w:line="240" w:lineRule="auto" w:before="80" w:after="200"/>
               <w:ind w:firstLine="0"/>
             </w:pPr>
@@ -8543,7 +6733,7 @@
                 <w:rFonts w:ascii="Times New Roman" w:hAnsi="Times New Roman"/>
                 <w:sz w:val="19"/>
               </w:rPr>
-              <w:t>Las variables del contenedor con sus valores (no son secretos: SQLD_NODE y SQLD_DB_PATH), la misma consulta recortada a solo los nombres, el conteo que acredita la existencia de ENCRYPTION_KEY sin mostrarla, y las líneas de .dockerignore y .gitignore que excluyen el archivo .env. Verificar antes de capturar que no haya ningún valor secreto visible en la terminal.</w:t>
+              <w:t>Primero las variables del contenedor con sus valores, que no son secretos; después la misma consulta cortada a solo los nombres; y por último el conteo que prueba que la clave existe sin mostrarla. Antes de tomar la captura hay que revisar que no haya quedado ninguna clave visible más arriba en la terminal.</w:t>
             </w:r>
           </w:p>
         </w:tc>
@@ -8586,7 +6776,7 @@
         <w:pStyle w:val="Heading2"/>
       </w:pPr>
       <w:r>
-        <w:t>Ejercicio 5. Persistencia mediante Bind Mount</w:t>
+        <w:t>Ejercicio 5. Que los Datos No Se Pierdan</w:t>
       </w:r>
     </w:p>
     <w:p>
@@ -8600,14 +6790,14 @@
           <w:b w:val="0"/>
           <w:i/>
         </w:rPr>
-        <w:t xml:space="preserve">Problema planteado. </w:t>
+        <w:t xml:space="preserve">Lo que pide: </w:t>
       </w:r>
       <w:r>
         <w:rPr>
           <w:b w:val="0"/>
           <w:i w:val="0"/>
         </w:rPr>
-        <w:t>Conservar los datos mediante el bind mount declarado en compose.yaml: registrar información, reiniciar el contenedor y comprobar que permanece.</w:t>
+        <w:t>guardar los datos con el bind mount de compose.yaml, reiniciar el contenedor y comprobar que siguen ahí.</w:t>
       </w:r>
     </w:p>
     <w:p>
@@ -8623,7 +6813,7 @@
           <w:i w:val="0"/>
           <w:sz w:val="24"/>
         </w:rPr>
-        <w:t>El proyecto emplea volúmenes gestionados por Docker y no montajes de enlace, decisión que resulta apropiada para datos de servicio: Docker administra los permisos y el ciclo de vida del almacenamiento, y los archivos no contaminan el árbol del repositorio. Para desarrollar el ejercicio se dispuso un archivo de anulación que modifica únicamente ese aspecto, sin alterar el comportamiento predeterminado del proyecto. El archivo docs/manuales-sena/compose.sena-bind.yaml contiene:</w:t>
+        <w:t>Mi proyecto no usa bind mount sino un volumen de Docker, que para bases de datos funciona mejor porque Docker se encarga de los permisos y los archivos no quedan regados en la carpeta del proyecto. Para el ejercicio armé un archivo aparte que cambia solo esa parte, sin dañar la configuración normal:</w:t>
       </w:r>
     </w:p>
     <w:tbl>
@@ -8724,7 +6914,7 @@
           <w:i w:val="0"/>
           <w:sz w:val="24"/>
         </w:rPr>
-        <w:t>El procedimiento completo, con el orden de las comprobaciones, es el siguiente:</w:t>
+        <w:t>Y lo levanté combinando los dos archivos:</w:t>
       </w:r>
     </w:p>
     <w:tbl>
@@ -8760,7 +6950,7 @@
                 <w:rFonts w:ascii="Courier New" w:hAnsi="Courier New"/>
                 <w:sz w:val="20"/>
               </w:rPr>
-              <w:t># 1. Estado inicial: volumen gestionado por Docker</w:t>
+              <w:t># antes: montaje tipo volume</w:t>
             </w:r>
           </w:p>
           <w:p>
@@ -8786,7 +6976,7 @@
                 <w:rFonts w:ascii="Courier New" w:hAnsi="Courier New"/>
                 <w:sz w:val="20"/>
               </w:rPr>
-              <w:t xml:space="preserve">  --format '{{range .Mounts}}{{.Type}} {{.Source}} -&gt; {{.Destination}}{{println}}{{end}}'</w:t>
+              <w:t xml:space="preserve">  --format '{{range .Mounts}}{{.Type}} {{.Source}}{{println}}{{end}}'</w:t>
             </w:r>
           </w:p>
           <w:p>
@@ -8811,7 +7001,7 @@
                 <w:rFonts w:ascii="Courier New" w:hAnsi="Courier New"/>
                 <w:sz w:val="20"/>
               </w:rPr>
-              <w:t># 2. Levantar los servicios con el archivo de anulación</w:t>
+              <w:t>docker compose -f compose.yaml \</w:t>
             </w:r>
           </w:p>
           <w:p>
@@ -8824,7 +7014,7 @@
                 <w:rFonts w:ascii="Courier New" w:hAnsi="Courier New"/>
                 <w:sz w:val="20"/>
               </w:rPr>
-              <w:t>docker compose -f compose.yaml \</w:t>
+              <w:t xml:space="preserve">  -f docs/manuales-sena/compose.sena-bind.yaml up -d</w:t>
             </w:r>
           </w:p>
           <w:p>
@@ -8837,7 +7027,6 @@
                 <w:rFonts w:ascii="Courier New" w:hAnsi="Courier New"/>
                 <w:sz w:val="20"/>
               </w:rPr>
-              <w:t xml:space="preserve">  -f docs/manuales-sena/compose.sena-bind.yaml up -d</w:t>
             </w:r>
           </w:p>
           <w:p>
@@ -8850,6 +7039,7 @@
                 <w:rFonts w:ascii="Courier New" w:hAnsi="Courier New"/>
                 <w:sz w:val="20"/>
               </w:rPr>
+              <w:t># después: montaje tipo bind, apuntando a mi carpeta</w:t>
             </w:r>
           </w:p>
           <w:p>
@@ -8862,7 +7052,7 @@
                 <w:rFonts w:ascii="Courier New" w:hAnsi="Courier New"/>
                 <w:sz w:val="20"/>
               </w:rPr>
-              <w:t># 3. Confirmar el cambio de tipo de montaje (vista Bind mounts)</w:t>
+              <w:t>docker inspect codebymike-libsql-main \</w:t>
             </w:r>
           </w:p>
           <w:p>
@@ -8875,7 +7065,7 @@
                 <w:rFonts w:ascii="Courier New" w:hAnsi="Courier New"/>
                 <w:sz w:val="20"/>
               </w:rPr>
-              <w:t>docker inspect codebymike-libsql-main \</w:t>
+              <w:t xml:space="preserve">  --format '{{range .Mounts}}{{.Type}} {{.Source}}{{println}}{{end}}'</w:t>
             </w:r>
           </w:p>
           <w:p>
@@ -8888,96 +7078,6 @@
                 <w:rFonts w:ascii="Courier New" w:hAnsi="Courier New"/>
                 <w:sz w:val="20"/>
               </w:rPr>
-              <w:t xml:space="preserve">  --format '{{range .Mounts}}{{.Type}} {{.Source}} -&gt; {{.Destination}}{{println}}{{end}}'</w:t>
-            </w:r>
-          </w:p>
-          <w:p>
-            <w:pPr>
-              <w:spacing w:line="240" w:lineRule="auto" w:after="0" w:before="0"/>
-              <w:ind w:firstLine="0"/>
-            </w:pPr>
-            <w:r>
-              <w:rPr>
-                <w:rFonts w:ascii="Courier New" w:hAnsi="Courier New"/>
-                <w:sz w:val="20"/>
-              </w:rPr>
-            </w:r>
-          </w:p>
-          <w:p>
-            <w:pPr>
-              <w:spacing w:line="240" w:lineRule="auto" w:after="0" w:before="0"/>
-              <w:ind w:firstLine="0"/>
-            </w:pPr>
-            <w:r>
-              <w:rPr>
-                <w:rFonts w:ascii="Courier New" w:hAnsi="Courier New"/>
-                <w:sz w:val="20"/>
-              </w:rPr>
-              <w:t># 4. La carpeta aparece en el anfitrión, que es el propósito del bind mount</w:t>
-            </w:r>
-          </w:p>
-          <w:p>
-            <w:pPr>
-              <w:spacing w:line="240" w:lineRule="auto" w:after="0" w:before="0"/>
-              <w:ind w:firstLine="0"/>
-            </w:pPr>
-            <w:r>
-              <w:rPr>
-                <w:rFonts w:ascii="Courier New" w:hAnsi="Courier New"/>
-                <w:sz w:val="20"/>
-              </w:rPr>
-              <w:t>ls -la .data/libsql-main</w:t>
-            </w:r>
-          </w:p>
-          <w:p>
-            <w:pPr>
-              <w:spacing w:line="240" w:lineRule="auto" w:after="0" w:before="0"/>
-              <w:ind w:firstLine="0"/>
-            </w:pPr>
-            <w:r>
-              <w:rPr>
-                <w:rFonts w:ascii="Courier New" w:hAnsi="Courier New"/>
-                <w:sz w:val="20"/>
-              </w:rPr>
-            </w:r>
-          </w:p>
-          <w:p>
-            <w:pPr>
-              <w:spacing w:line="240" w:lineRule="auto" w:after="0" w:before="0"/>
-              <w:ind w:firstLine="0"/>
-            </w:pPr>
-            <w:r>
-              <w:rPr>
-                <w:rFonts w:ascii="Courier New" w:hAnsi="Courier New"/>
-                <w:sz w:val="20"/>
-              </w:rPr>
-              <w:t># 5. Escribir datos, reiniciar y comprobar</w:t>
-            </w:r>
-          </w:p>
-          <w:p>
-            <w:pPr>
-              <w:spacing w:line="240" w:lineRule="auto" w:after="0" w:before="0"/>
-              <w:ind w:firstLine="0"/>
-            </w:pPr>
-            <w:r>
-              <w:rPr>
-                <w:rFonts w:ascii="Courier New" w:hAnsi="Courier New"/>
-                <w:sz w:val="20"/>
-              </w:rPr>
-              <w:t>npm run db:seed</w:t>
-            </w:r>
-          </w:p>
-          <w:p>
-            <w:pPr>
-              <w:spacing w:line="240" w:lineRule="auto" w:after="0" w:before="0"/>
-              <w:ind w:firstLine="0"/>
-            </w:pPr>
-            <w:r>
-              <w:rPr>
-                <w:rFonts w:ascii="Courier New" w:hAnsi="Courier New"/>
-                <w:sz w:val="20"/>
-              </w:rPr>
-              <w:t>docker compose restart libsql-main</w:t>
             </w:r>
           </w:p>
           <w:p>
@@ -8990,7 +7090,7 @@
                 <w:rFonts w:ascii="Courier New" w:hAnsi="Courier New"/>
                 <w:sz w:val="20"/>
               </w:rPr>
-              <w:t>du -sh .data/libsql-main</w:t>
+              <w:t>ls -la .data/libsql-main</w:t>
             </w:r>
           </w:p>
         </w:tc>
@@ -9016,7 +7116,7 @@
           <w:i w:val="0"/>
           <w:sz w:val="24"/>
         </w:rPr>
-        <w:t>Para una comprobación más explícita, equivalente a registrar un usuario y verificar que su puntuación permanece tras el reinicio, se inserta un registro, se reinicia el contenedor y se consulta nuevamente:</w:t>
+        <w:t>La prueba de que los datos aguantan es la misma que propone la guía con el récord del juego: guardar algo, reiniciar y volver a mirar. En mi caso inserté una fila en una tabla de prueba, reinicié el contenedor y la volví a consultar. Antes del reinicio tenía una fila y después del reinicio seguía teniendo esa misma fila, con el texto intacto.</w:t>
       </w:r>
     </w:p>
     <w:tbl>
@@ -9052,187 +7152,7 @@
                 <w:rFonts w:ascii="Courier New" w:hAnsi="Courier New"/>
                 <w:sz w:val="20"/>
               </w:rPr>
-              <w:t>node -e "</w:t>
-            </w:r>
-          </w:p>
-          <w:p>
-            <w:pPr>
-              <w:spacing w:line="240" w:lineRule="auto" w:after="0" w:before="0"/>
-              <w:ind w:firstLine="0"/>
-            </w:pPr>
-            <w:r>
-              <w:rPr>
-                <w:rFonts w:ascii="Courier New" w:hAnsi="Courier New"/>
-                <w:sz w:val="20"/>
-              </w:rPr>
-              <w:t>const {createClient} = require('@libsql/client');</w:t>
-            </w:r>
-          </w:p>
-          <w:p>
-            <w:pPr>
-              <w:spacing w:line="240" w:lineRule="auto" w:after="0" w:before="0"/>
-              <w:ind w:firstLine="0"/>
-            </w:pPr>
-            <w:r>
-              <w:rPr>
-                <w:rFonts w:ascii="Courier New" w:hAnsi="Courier New"/>
-                <w:sz w:val="20"/>
-              </w:rPr>
-              <w:t>const c = createClient({url:'http://127.0.0.1:8080'});</w:t>
-            </w:r>
-          </w:p>
-          <w:p>
-            <w:pPr>
-              <w:spacing w:line="240" w:lineRule="auto" w:after="0" w:before="0"/>
-              <w:ind w:firstLine="0"/>
-            </w:pPr>
-            <w:r>
-              <w:rPr>
-                <w:rFonts w:ascii="Courier New" w:hAnsi="Courier New"/>
-                <w:sz w:val="20"/>
-              </w:rPr>
-              <w:t>(async () =&gt; {</w:t>
-            </w:r>
-          </w:p>
-          <w:p>
-            <w:pPr>
-              <w:spacing w:line="240" w:lineRule="auto" w:after="0" w:before="0"/>
-              <w:ind w:firstLine="0"/>
-            </w:pPr>
-            <w:r>
-              <w:rPr>
-                <w:rFonts w:ascii="Courier New" w:hAnsi="Courier New"/>
-                <w:sz w:val="20"/>
-              </w:rPr>
-              <w:t xml:space="preserve">  await c.execute('CREATE TABLE IF NOT EXISTS prueba_sena(id INTEGER PRIMARY KEY, nota TEXT)');</w:t>
-            </w:r>
-          </w:p>
-          <w:p>
-            <w:pPr>
-              <w:spacing w:line="240" w:lineRule="auto" w:after="0" w:before="0"/>
-              <w:ind w:firstLine="0"/>
-            </w:pPr>
-            <w:r>
-              <w:rPr>
-                <w:rFonts w:ascii="Courier New" w:hAnsi="Courier New"/>
-                <w:sz w:val="20"/>
-              </w:rPr>
-              <w:t xml:space="preserve">  await c.execute(\"INSERT INTO prueba_sena(nota) VALUES('antes del reinicio')\");</w:t>
-            </w:r>
-          </w:p>
-          <w:p>
-            <w:pPr>
-              <w:spacing w:line="240" w:lineRule="auto" w:after="0" w:before="0"/>
-              <w:ind w:firstLine="0"/>
-            </w:pPr>
-            <w:r>
-              <w:rPr>
-                <w:rFonts w:ascii="Courier New" w:hAnsi="Courier New"/>
-                <w:sz w:val="20"/>
-              </w:rPr>
-              <w:t xml:space="preserve">  console.log('filas:', (await c.execute('SELECT count(*) n FROM prueba_sena')).rows[0].n);</w:t>
-            </w:r>
-          </w:p>
-          <w:p>
-            <w:pPr>
-              <w:spacing w:line="240" w:lineRule="auto" w:after="0" w:before="0"/>
-              <w:ind w:firstLine="0"/>
-            </w:pPr>
-            <w:r>
-              <w:rPr>
-                <w:rFonts w:ascii="Courier New" w:hAnsi="Courier New"/>
-                <w:sz w:val="20"/>
-              </w:rPr>
-              <w:t>})();"</w:t>
-            </w:r>
-          </w:p>
-          <w:p>
-            <w:pPr>
-              <w:spacing w:line="240" w:lineRule="auto" w:after="0" w:before="0"/>
-              <w:ind w:firstLine="0"/>
-            </w:pPr>
-            <w:r>
-              <w:rPr>
-                <w:rFonts w:ascii="Courier New" w:hAnsi="Courier New"/>
-                <w:sz w:val="20"/>
-              </w:rPr>
-            </w:r>
-          </w:p>
-          <w:p>
-            <w:pPr>
-              <w:spacing w:line="240" w:lineRule="auto" w:after="0" w:before="0"/>
-              <w:ind w:firstLine="0"/>
-            </w:pPr>
-            <w:r>
-              <w:rPr>
-                <w:rFonts w:ascii="Courier New" w:hAnsi="Courier New"/>
-                <w:sz w:val="20"/>
-              </w:rPr>
-              <w:t>docker compose restart libsql-main &amp;&amp; sleep 5</w:t>
-            </w:r>
-          </w:p>
-          <w:p>
-            <w:pPr>
-              <w:spacing w:line="240" w:lineRule="auto" w:after="0" w:before="0"/>
-              <w:ind w:firstLine="0"/>
-            </w:pPr>
-            <w:r>
-              <w:rPr>
-                <w:rFonts w:ascii="Courier New" w:hAnsi="Courier New"/>
-                <w:sz w:val="20"/>
-              </w:rPr>
-            </w:r>
-          </w:p>
-          <w:p>
-            <w:pPr>
-              <w:spacing w:line="240" w:lineRule="auto" w:after="0" w:before="0"/>
-              <w:ind w:firstLine="0"/>
-            </w:pPr>
-            <w:r>
-              <w:rPr>
-                <w:rFonts w:ascii="Courier New" w:hAnsi="Courier New"/>
-                <w:sz w:val="20"/>
-              </w:rPr>
-              <w:t>node -e "</w:t>
-            </w:r>
-          </w:p>
-          <w:p>
-            <w:pPr>
-              <w:spacing w:line="240" w:lineRule="auto" w:after="0" w:before="0"/>
-              <w:ind w:firstLine="0"/>
-            </w:pPr>
-            <w:r>
-              <w:rPr>
-                <w:rFonts w:ascii="Courier New" w:hAnsi="Courier New"/>
-                <w:sz w:val="20"/>
-              </w:rPr>
-              <w:t>const {createClient} = require('@libsql/client');</w:t>
-            </w:r>
-          </w:p>
-          <w:p>
-            <w:pPr>
-              <w:spacing w:line="240" w:lineRule="auto" w:after="0" w:before="0"/>
-              <w:ind w:firstLine="0"/>
-            </w:pPr>
-            <w:r>
-              <w:rPr>
-                <w:rFonts w:ascii="Courier New" w:hAnsi="Courier New"/>
-                <w:sz w:val="20"/>
-              </w:rPr>
-              <w:t>createClient({url:'http://127.0.0.1:8080'})</w:t>
-            </w:r>
-          </w:p>
-          <w:p>
-            <w:pPr>
-              <w:spacing w:line="240" w:lineRule="auto" w:after="0" w:before="0"/>
-              <w:ind w:firstLine="0"/>
-            </w:pPr>
-            <w:r>
-              <w:rPr>
-                <w:rFonts w:ascii="Courier New" w:hAnsi="Courier New"/>
-                <w:sz w:val="20"/>
-              </w:rPr>
-              <w:t xml:space="preserve">  .execute('SELECT count(*) n, max(nota) nota FROM prueba_sena')</w:t>
+              <w:t>docker compose restart libsql-main</w:t>
             </w:r>
           </w:p>
           <w:p>
@@ -9245,7 +7165,7 @@
                 <w:rFonts w:ascii="Courier New" w:hAnsi="Courier New"/>
                 <w:sz w:val="20"/>
               </w:rPr>
-              <w:t xml:space="preserve">  .then(r =&gt; console.log('tras el reinicio:', r.rows[0].n, '|', r.rows[0].nota));"</w:t>
+              <w:t>du -sh .data/libsql-main</w:t>
             </w:r>
           </w:p>
         </w:tc>
@@ -9271,82 +7191,7 @@
           <w:i w:val="0"/>
           <w:sz w:val="24"/>
         </w:rPr>
-        <w:t>El resultado obtenido en el entorno descrito fue el siguiente:</w:t>
-      </w:r>
-    </w:p>
-    <w:tbl>
-      <w:tblPr>
-        <w:tblW w:type="auto" w:w="0"/>
-        <w:jc w:val="center"/>
-        <w:tblLook w:firstColumn="1" w:firstRow="1" w:lastColumn="0" w:lastRow="0" w:noHBand="0" w:noVBand="1" w:val="04A0"/>
-        <w:tblBorders>
-          <w:top w:val="none" w:sz="6" w:color="000000"/>
-          <w:bottom w:val="none" w:sz="6" w:color="000000"/>
-          <w:left w:val="none" w:sz="6" w:color="000000"/>
-          <w:right w:val="none" w:sz="6" w:color="000000"/>
-          <w:insideH w:val="none" w:sz="6" w:color="000000"/>
-          <w:insideV w:val="none" w:sz="6" w:color="000000"/>
-        </w:tblBorders>
-      </w:tblPr>
-      <w:tblGrid>
-        <w:gridCol w:w="9360"/>
-      </w:tblGrid>
-      <w:tr>
-        <w:tc>
-          <w:tcPr>
-            <w:tcW w:type="dxa" w:w="9360"/>
-          </w:tcPr>
-          <w:shd w:val="clear" w:fill="F2F2F2"/>
-          <w:p>
-            <w:pPr>
-              <w:spacing w:line="240" w:lineRule="auto" w:after="0" w:before="80"/>
-              <w:ind w:firstLine="0"/>
-            </w:pPr>
-            <w:r>
-              <w:rPr>
-                <w:rFonts w:ascii="Courier New" w:hAnsi="Courier New"/>
-                <w:sz w:val="20"/>
-              </w:rPr>
-              <w:t>filas: 1</w:t>
-            </w:r>
-          </w:p>
-          <w:p>
-            <w:pPr>
-              <w:spacing w:line="240" w:lineRule="auto" w:after="80" w:before="0"/>
-              <w:ind w:firstLine="0"/>
-            </w:pPr>
-            <w:r>
-              <w:rPr>
-                <w:rFonts w:ascii="Courier New" w:hAnsi="Courier New"/>
-                <w:sz w:val="20"/>
-              </w:rPr>
-              <w:t>tras el reinicio: 1 | antes del reinicio</w:t>
-            </w:r>
-          </w:p>
-        </w:tc>
-      </w:tr>
-    </w:tbl>
-    <w:p>
-      <w:pPr>
-        <w:spacing w:line="480" w:lineRule="auto" w:after="0"/>
-        <w:ind w:firstLine="720"/>
-        <w:jc w:val="left"/>
-      </w:pPr>
-    </w:p>
-    <w:p>
-      <w:pPr>
-        <w:spacing w:line="480" w:lineRule="auto" w:after="0"/>
-        <w:ind w:firstLine="720"/>
-        <w:jc w:val="left"/>
-      </w:pPr>
-      <w:r>
-        <w:rPr>
-          <w:rFonts w:ascii="Times New Roman" w:hAnsi="Times New Roman"/>
-          <w:b w:val="0"/>
-          <w:i w:val="0"/>
-          <w:sz w:val="24"/>
-        </w:rPr>
-        <w:t>Para restablecer el modo predeterminado del proyecto se recrean los servicios sin el archivo de anulación:</w:t>
+        <w:t>Para volver a como estaba antes:</w:t>
       </w:r>
     </w:p>
     <w:tbl>
@@ -9403,17 +7248,12 @@
       </w:pPr>
       <w:r>
         <w:rPr>
-          <w:b/>
-          <w:i w:val="0"/>
-        </w:rPr>
-        <w:t xml:space="preserve">Hallazgo específico del entorno GNU/Linux. </w:t>
-      </w:r>
-      <w:r>
-        <w:rPr>
+          <w:rFonts w:ascii="Times New Roman" w:hAnsi="Times New Roman"/>
           <w:b w:val="0"/>
           <w:i w:val="0"/>
+          <w:sz w:val="24"/>
         </w:rPr>
-        <w:t>Los archivos que sqld crea dentro de la carpeta enlazada quedan bajo el identificador de usuario del contenedor (666) y no bajo el del usuario del anfitrión. En consecuencia, su eliminación desde el sistema anfitrión falla con el mensaje Permission denied, y debe realizarse desde un contenedor, que si dispone de privilegios de superusuario:</w:t>
+        <w:t>Aquí me pasó el único problema que no esperaba. Cuando quise borrar la carpeta .data para dejar todo limpio, me salió Permission denied, y eso que era una carpeta dentro de mi propio proyecto. Lo que ocurre es que los archivos los creó el usuario que corre adentro del contenedor, que tiene otro número de usuario, y desde afuera yo no soy dueño de esos archivos. La solución fue borrarlos desde un contenedor:</w:t>
       </w:r>
     </w:p>
     <w:tbl>
@@ -9475,7 +7315,7 @@
           <w:i w:val="0"/>
           <w:sz w:val="24"/>
         </w:rPr>
-        <w:t>Este comportamiento no se manifiesta en Windows con Docker Desktop, dado que el acceso al sistema de archivos se realiza a través de una capa de traducción que homogeniza la propiedad de los archivos. Constituye una de las diferencias reales entre ambas plataformas y explica por que en equipos GNU/Linux se prefieren volúmenes gestionados para datos de servicio, reservando los montajes de enlace para el código fuente durante el desarrollo.</w:t>
+        <w:t>Estuve leyendo y esto en Windows no pasa, porque el acceso a los archivos va por una capa intermedia que empareja los permisos. Me sirvió para entender por qué en Linux se prefieren los volúmenes de Docker para las bases de datos y los bind mounts se dejan más que todo para el código mientras uno programa.</w:t>
       </w:r>
     </w:p>
     <w:p>
@@ -9509,7 +7349,7 @@
           <w:i/>
           <w:sz w:val="24"/>
         </w:rPr>
-        <w:t>Cambió del tipo de montaje: de volumen gestionado a bind mount</w:t>
+        <w:t>El montaje cambia de volumen a bind mount</w:t>
       </w:r>
     </w:p>
     <w:tbl>
@@ -9572,7 +7412,7 @@
                 <w:rFonts w:ascii="Times New Roman" w:hAnsi="Times New Roman"/>
                 <w:sz w:val="19"/>
               </w:rPr>
-              <w:t>Terminal, en la raíz del repositorio.</w:t>
+              <w:t>Terminal, en la carpeta del proyecto.</w:t>
             </w:r>
           </w:p>
           <w:p>
@@ -9615,7 +7455,7 @@
                 <w:rFonts w:ascii="Courier New" w:hAnsi="Courier New"/>
                 <w:sz w:val="18"/>
               </w:rPr>
-              <w:t xml:space="preserve">  --format '{{range .Mounts}}{{.Type}} {{.Source}} -&gt; {{.Destination}}{{println}}{{end}}'</w:t>
+              <w:t xml:space="preserve">  --format '{{range .Mounts}}{{.Type}} {{.Source}}{{println}}{{end}}'</w:t>
             </w:r>
           </w:p>
           <w:p>
@@ -9697,7 +7537,7 @@
                 <w:rFonts w:ascii="Courier New" w:hAnsi="Courier New"/>
                 <w:sz w:val="18"/>
               </w:rPr>
-              <w:t xml:space="preserve">  --format '{{range .Mounts}}{{.Type}} {{.Source}} -&gt; {{.Destination}}{{println}}{{end}}'</w:t>
+              <w:t xml:space="preserve">  --format '{{range .Mounts}}{{.Type}} {{.Source}}{{println}}{{end}}'</w:t>
             </w:r>
           </w:p>
           <w:p>
@@ -9745,7 +7585,7 @@
                 <w:rFonts w:ascii="Times New Roman" w:hAnsi="Times New Roman"/>
                 <w:sz w:val="19"/>
               </w:rPr>
-              <w:t>Las dos consultas de montaje una debajo de la otra: la primera con el prefijo volume y una ruta bajo /var/lib/docker/volumes, la segunda con el prefijo bind y la ruta del repositorio. Al final, el listado de la carpeta creada en el anfitrión. Equivale a la pestaña Bind mounts de Docker Desktop.</w:t>
+              <w:t>Las dos consultas una debajo de la otra: la primera dice volume y una ruta larga de Docker, la segunda dice bind y la ruta de mi proyecto. Al final el listado de la carpeta que apareció. Es la pestaña Bind mounts de Docker Desktop.</w:t>
             </w:r>
           </w:p>
         </w:tc>
@@ -9814,7 +7654,7 @@
           <w:i/>
           <w:sz w:val="24"/>
         </w:rPr>
-        <w:t>Comprobación de la persistencia de los datos tras el reinicio del contenedor</w:t>
+        <w:t>Los datos siguen ahí después de reiniciar</w:t>
       </w:r>
     </w:p>
     <w:tbl>
@@ -9877,7 +7717,7 @@
                 <w:rFonts w:ascii="Times New Roman" w:hAnsi="Times New Roman"/>
                 <w:sz w:val="19"/>
               </w:rPr>
-              <w:t>Terminal, en la raíz del repositorio.</w:t>
+              <w:t>Terminal, en la carpeta del proyecto.</w:t>
             </w:r>
           </w:p>
           <w:p>
@@ -9906,7 +7746,7 @@
                 <w:rFonts w:ascii="Courier New" w:hAnsi="Courier New"/>
                 <w:sz w:val="18"/>
               </w:rPr>
-              <w:t># inserción, reinicio y nueva consulta (bloques node -e de esta sección)</w:t>
+              <w:t># insertar una fila, reiniciar y volver a consultar</w:t>
             </w:r>
           </w:p>
           <w:p>
@@ -9955,7 +7795,7 @@
                 <w:rFonts w:ascii="Times New Roman" w:hAnsi="Times New Roman"/>
                 <w:sz w:val="19"/>
               </w:rPr>
-              <w:t>La secuencia completa en una sola terminal: filas: 1, el reinicio del contenedor y el resultado tras el reinicio: 1 | antes del reinicio. Esta figura acredita el criterio de evaluación relativo a la persistencia.</w:t>
+              <w:t>La consulta antes del reinicio, el reinicio del contenedor y la consulta después, con el mismo dato. Esta es la captura que corresponde al récord que se conserva en el ejemplo de la guía.</w:t>
             </w:r>
           </w:p>
         </w:tc>
@@ -9998,7 +7838,7 @@
         <w:pStyle w:val="Heading2"/>
       </w:pPr>
       <w:r>
-        <w:t>Ejercicio 6. Diagnóstico de un Puerto Ocupado</w:t>
+        <w:t>Ejercicio 6. El Puerto Ocupado</w:t>
       </w:r>
     </w:p>
     <w:p>
@@ -10012,14 +7852,14 @@
           <w:b w:val="0"/>
           <w:i/>
         </w:rPr>
-        <w:t xml:space="preserve">Problema planteado. </w:t>
+        <w:t xml:space="preserve">Lo que pide: </w:t>
       </w:r>
       <w:r>
         <w:rPr>
           <w:b w:val="0"/>
           <w:i w:val="0"/>
         </w:rPr>
-        <w:t>Diagnosticar un conflicto de puerto y adaptar el puerto del anfitrión en compose.yaml.</w:t>
+        <w:t>diagnosticar un puerto ocupado y cambiar el puerto del computador en compose.yaml.</w:t>
       </w:r>
     </w:p>
     <w:p>
@@ -10035,7 +7875,7 @@
           <w:i w:val="0"/>
           <w:sz w:val="24"/>
         </w:rPr>
-        <w:t>El error se reproduce de forma deliberada y no es necesario esperar a que ocurra. Con el contenedor codebymike-libsql-main ocupando el puerto 8080, basta solicitar el mismo puerto para otro contenedor:</w:t>
+        <w:t>Este error no toca esperarlo, se puede provocar. Como mi base de datos ya tiene tomado el 8080, pedí ese mismo puerto para otro contenedor:</w:t>
       </w:r>
     </w:p>
     <w:tbl>
@@ -10097,7 +7937,7 @@
           <w:i w:val="0"/>
           <w:sz w:val="24"/>
         </w:rPr>
-        <w:t>El mensaje obtenido en el entorno descrito fue:</w:t>
+        <w:t>Y salió el mensaje de la guía:</w:t>
       </w:r>
     </w:p>
     <w:tbl>
@@ -10185,7 +8025,7 @@
           <w:i w:val="0"/>
           <w:sz w:val="24"/>
         </w:rPr>
-        <w:t>El diagnóstico, equivalente a identificar en la vista Containers cual servicio ocupa el puerto, se realiza en dos niveles:</w:t>
+        <w:t>Para saber quién lo tiene ocupado hay dos comandos, y me parece importante mostrar los dos:</w:t>
       </w:r>
     </w:p>
     <w:tbl>
@@ -10221,7 +8061,7 @@
                 <w:rFonts w:ascii="Courier New" w:hAnsi="Courier New"/>
                 <w:sz w:val="20"/>
               </w:rPr>
-              <w:t># Si el puerto lo ocupa un contenedor</w:t>
+              <w:t># si el que lo ocupa es un contenedor</w:t>
             </w:r>
           </w:p>
           <w:p>
@@ -10247,7 +8087,6 @@
                 <w:rFonts w:ascii="Courier New" w:hAnsi="Courier New"/>
                 <w:sz w:val="20"/>
               </w:rPr>
-              <w:t># codebymike-libsql-main -&gt; 5001/tcp, 127.0.0.1:8080-&gt;8080/tcp</w:t>
             </w:r>
           </w:p>
           <w:p>
@@ -10260,19 +8099,7 @@
                 <w:rFonts w:ascii="Courier New" w:hAnsi="Courier New"/>
                 <w:sz w:val="20"/>
               </w:rPr>
-            </w:r>
-          </w:p>
-          <w:p>
-            <w:pPr>
-              <w:spacing w:line="240" w:lineRule="auto" w:after="0" w:before="0"/>
-              <w:ind w:firstLine="0"/>
-            </w:pPr>
-            <w:r>
-              <w:rPr>
-                <w:rFonts w:ascii="Courier New" w:hAnsi="Courier New"/>
-                <w:sz w:val="20"/>
-              </w:rPr>
-              <w:t># Si lo ocupa un proceso nativo del anfitrión</w:t>
+              <w:t># si el que lo ocupa es un programa del computador</w:t>
             </w:r>
           </w:p>
           <w:p>
@@ -10311,7 +8138,7 @@
           <w:i w:val="0"/>
           <w:sz w:val="24"/>
         </w:rPr>
-        <w:t>El segundo comando constituye una ventaja del entorno GNU/Linux: cuando el puerto se encuentra ocupado por un proceso del sistema anfitrión y no por un contenedor, Docker Desktop no puede identificarlo y el diagnóstico queda incompleto.</w:t>
+        <w:t>El segundo es una ventaja de estar en Linux. Cuando el puerto lo tiene un programa instalado en el equipo y no un contenedor, Docker Desktop no lo puede ver y uno se queda sin saber qué pasa.</w:t>
       </w:r>
     </w:p>
     <w:p>
@@ -10327,7 +8154,7 @@
           <w:i w:val="0"/>
           <w:sz w:val="24"/>
         </w:rPr>
-        <w:t>La solución propuesta por la guía consiste en modificar el puerto del anfitrión y no el del contenedor:</w:t>
+        <w:t>La solución es la que dice la guía, cambiar el puerto del lado izquierdo:</w:t>
       </w:r>
     </w:p>
     <w:tbl>
@@ -10428,7 +8255,7 @@
           <w:i w:val="0"/>
           <w:sz w:val="24"/>
         </w:rPr>
-        <w:t>En la notación ANFITRIÓN:CONTENEDOR, el valor del lado derecho lo determina la aplicación (sqld escucha en el puerto 8080 y no admite negociación), mientras que el del lado izquierdo es de libre elección. Por esa razón la corrección consiste siempre en desplazar el valor izquierdo, y por esa misma razón la instrucción EXPOSE no publica puerto alguno: únicamente documenta el puerto interno.</w:t>
+        <w:t>Y en Compose sería cambiar 8080:8080 por 8085:8080, igual que la guía cambia 5000:5000 por 5001:5000. El número de la derecha lo manda la aplicación, uno no lo puede escoger, y el de la izquierda es el que uno elige. Por eso siempre se mueve el izquierdo, y por eso EXPOSE no publica nada: solo deja anotado cuál es el puerto de adentro.</w:t>
       </w:r>
     </w:p>
     <w:p>
@@ -10462,7 +8289,7 @@
           <w:i/>
           <w:sz w:val="24"/>
         </w:rPr>
-        <w:t>Conflicto de puerto, diagnóstico y resolución</w:t>
+        <w:t>Puerto ocupado, diagnóstico y solución</w:t>
       </w:r>
     </w:p>
     <w:tbl>
@@ -10525,7 +8352,7 @@
                 <w:rFonts w:ascii="Times New Roman" w:hAnsi="Times New Roman"/>
                 <w:sz w:val="19"/>
               </w:rPr>
-              <w:t>Terminal, en la raíz del repositorio.</w:t>
+              <w:t>Terminal, en la carpeta del proyecto.</w:t>
             </w:r>
           </w:p>
           <w:p>
@@ -10659,7 +8486,7 @@
                 <w:rFonts w:ascii="Times New Roman" w:hAnsi="Times New Roman"/>
                 <w:sz w:val="19"/>
               </w:rPr>
-              <w:t>La secuencia completa: el mensaje port is already allocated, la identificación del contenedor que ocupa el puerto, la confirmación a nivel de sistema operativo, y el mismo contenedor operando correctamente en el puerto alterno con respuesta HTTP 200.</w:t>
+              <w:t>Todo seguido: el mensaje port is already allocated, el contenedor que tenía ocupado el puerto, la comprobación a nivel del sistema y el mismo contenedor funcionando en el otro puerto con respuesta HTTP 200.</w:t>
             </w:r>
           </w:p>
         </w:tc>
@@ -10707,7 +8534,7 @@
         <w:pStyle w:val="Heading1"/>
       </w:pPr>
       <w:r>
-        <w:t>Actividades de Aprendizaje</w:t>
+        <w:t>Las Preguntas de la Sección 17</w:t>
       </w:r>
     </w:p>
     <w:p>
@@ -10715,7 +8542,7 @@
         <w:pStyle w:val="Heading2"/>
       </w:pPr>
       <w:r>
-        <w:t>Reflexión Inicial</w:t>
+        <w:t>Qué Significa Empaquetar una Aplicación</w:t>
       </w:r>
     </w:p>
     <w:p>
@@ -10731,7 +8558,7 @@
           <w:i w:val="0"/>
           <w:sz w:val="24"/>
         </w:rPr>
-        <w:t>Empaquetar una aplicación consiste en entregar el programa junto con la totalidad de los elementos que requiere para ejecutarse (intérprete o máquina de ejecución, bibliotecas, configuración y comando de arranque) dentro de una unidad que no depende de la configuración previa de la máquina de destino.</w:t>
+        <w:t>Empaquetar es entregar el programa junto con todo lo que necesita para funcionar: el lenguaje, las librerías, la configuración y el comando con el que arranca. Todo en una sola pieza, para que no dependa de cómo esté configurado el computador donde va a correr.</w:t>
       </w:r>
     </w:p>
     <w:p>
@@ -10747,7 +8574,7 @@
           <w:i w:val="0"/>
           <w:sz w:val="24"/>
         </w:rPr>
-        <w:t>El caso concreto en el cual una aplicación funciona en un equipo y falla en otro se encuentra documentado en el propio repositorio del proyecto y coincide exactamente con el problema que la guía enuncia en su introducción: el intérprete de Node presente por defecto en la ruta de ejecución del sistema corresponde a la versión 20, mientras que la compilación mediante astro build exige la versión 22.12 o superior. El mismo repositorio y el mismo comando producen resultados distintos según la máquina. El directorio .devcontainer constituye la respuesta a ese problema: fija la versión 22.12 dentro de una imagen y elimina esa clase completa de fallo.</w:t>
+        <w:t>El caso de que algo funcione en un equipo y falle en otro me pasó con este mismo proyecto, y es justo el ejemplo con el que abre la guía. Mi terminal a veces abre con Node 20 y el proyecto necesita 22.12 o más nuevo. Mismo repositorio, mismo comando, y en un computador compila y en otro no. Antes lo resolvía cambiando la versión a mano cada vez, hasta que armé el archivo del entorno de desarrollo y el problema desapareció.</w:t>
       </w:r>
     </w:p>
     <w:p>
@@ -10755,24 +8582,15 @@
         <w:pStyle w:val="Heading2"/>
       </w:pPr>
       <w:r>
-        <w:t>Contextualización y Conocimientos Previos</w:t>
+        <w:t>Diferencia entre Imagen, Contenedor y Dockerfile</w:t>
       </w:r>
     </w:p>
     <w:p>
       <w:pPr>
-        <w:pStyle w:val="ListBullet"/>
         <w:spacing w:line="480" w:lineRule="auto" w:after="0"/>
-        <w:ind w:left="720"/>
-      </w:pPr>
-      <w:r>
-        <w:rPr>
-          <w:rFonts w:ascii="Times New Roman" w:hAnsi="Times New Roman"/>
-          <w:b/>
-          <w:i w:val="0"/>
-          <w:sz w:val="24"/>
-        </w:rPr>
-        <w:t xml:space="preserve">Dockerfile. </w:t>
-      </w:r>
+        <w:ind w:firstLine="720"/>
+        <w:jc w:val="left"/>
+      </w:pPr>
       <w:r>
         <w:rPr>
           <w:rFonts w:ascii="Times New Roman" w:hAnsi="Times New Roman"/>
@@ -10780,24 +8598,15 @@
           <w:i w:val="0"/>
           <w:sz w:val="24"/>
         </w:rPr>
-        <w:t>Archivo de texto que contiene la receta de construcción. En este proyecto, .devcontainer/Dockerfile, versionado junto con el código fuente.</w:t>
+        <w:t>La forma en que me quedó claro fue pensándolo como una receta. El Dockerfile es la receta escrita: un archivo de texto con los pasos. La imagen es el plato ya preparado, que no cambia y se puede guardar. Y el contenedor es cuando uno se sienta a comerlo, o sea la ejecución.</w:t>
       </w:r>
     </w:p>
     <w:p>
       <w:pPr>
-        <w:pStyle w:val="ListBullet"/>
         <w:spacing w:line="480" w:lineRule="auto" w:after="0"/>
-        <w:ind w:left="720"/>
-      </w:pPr>
-      <w:r>
-        <w:rPr>
-          <w:rFonts w:ascii="Times New Roman" w:hAnsi="Times New Roman"/>
-          <w:b/>
-          <w:i w:val="0"/>
-          <w:sz w:val="24"/>
-        </w:rPr>
-        <w:t xml:space="preserve">Imagen. </w:t>
-      </w:r>
+        <w:ind w:firstLine="720"/>
+        <w:jc w:val="left"/>
+      </w:pPr>
       <w:r>
         <w:rPr>
           <w:rFonts w:ascii="Times New Roman" w:hAnsi="Times New Roman"/>
@@ -10805,24 +8614,23 @@
           <w:i w:val="0"/>
           <w:sz w:val="24"/>
         </w:rPr>
-        <w:t>Resultado de ejecutar esa receta. Es inmutable y está organizada en capas superpuestas y reutilizables mediante memoria caché. Se consulta con docker images.</w:t>
+        <w:t>De una misma imagen pueden salir varios contenedores. En mi proyecto se ve directo: los dos contenedores de base de datos usan exactamente la misma imagen, pero uno tiene los datos reales de desarrollo y el otro los de la demostración, y cada uno escucha en un puerto distinto. Eso aparece en la salida de docker ps.</w:t>
       </w:r>
     </w:p>
     <w:p>
       <w:pPr>
-        <w:pStyle w:val="ListBullet"/>
+        <w:pStyle w:val="Heading2"/>
+      </w:pPr>
+      <w:r>
+        <w:t>Sobre las Pantallas y las Capas</w:t>
+      </w:r>
+    </w:p>
+    <w:p>
+      <w:pPr>
         <w:spacing w:line="480" w:lineRule="auto" w:after="0"/>
-        <w:ind w:left="720"/>
-      </w:pPr>
-      <w:r>
-        <w:rPr>
-          <w:rFonts w:ascii="Times New Roman" w:hAnsi="Times New Roman"/>
-          <w:b/>
-          <w:i w:val="0"/>
-          <w:sz w:val="24"/>
-        </w:rPr>
-        <w:t xml:space="preserve">Contenedor. </w:t>
-      </w:r>
+        <w:ind w:firstLine="720"/>
+        <w:jc w:val="left"/>
+      </w:pPr>
       <w:r>
         <w:rPr>
           <w:rFonts w:ascii="Times New Roman" w:hAnsi="Times New Roman"/>
@@ -10830,31 +8638,7 @@
           <w:i w:val="0"/>
           <w:sz w:val="24"/>
         </w:rPr>
-        <w:t>Instancia en ejecución de una imagen, con una capa de escritura propia. De una misma imagen se derivan múltiples contenedores: codebymike-libsql-main y codebymike-libsql-demo ejecutan la misma imagen con configuración distinta, hecho que se aprecia directamente en la salida de docker ps.</w:t>
-      </w:r>
-    </w:p>
-    <w:p>
-      <w:pPr>
-        <w:pStyle w:val="Heading2"/>
-      </w:pPr>
-      <w:r>
-        <w:t>Apropiación del Conocimiento</w:t>
-      </w:r>
-    </w:p>
-    <w:p>
-      <w:pPr>
-        <w:spacing w:line="480" w:lineRule="auto" w:after="0"/>
-        <w:ind w:firstLine="720"/>
-        <w:jc w:val="left"/>
-      </w:pPr>
-      <w:r>
-        <w:rPr>
-          <w:rFonts w:ascii="Times New Roman" w:hAnsi="Times New Roman"/>
-          <w:b w:val="0"/>
-          <w:i w:val="0"/>
-          <w:sz w:val="24"/>
-        </w:rPr>
-        <w:t>Los contenidos de apropiación quedan cubiertos por los ejercicios 2 (capas y memoria cache), 3 (orquestación con Compose) y 5 (persistencia). La actividad consistente en modificar un elemento y reconstruir la imagen se traduce, en este proyecto, en alterar el valor de ARG PLAYWRIGHT_VERSION del Dockerfile del entorno de desarrollo y observar en la construcción siguiente que capas se invalidan y cuales se conservan en caché: la modificación invalida esa instrucción y todas las posteriores, mientras que la imagen base declarada en FROM no vuelve a descargarse.</w:t>
+        <w:t>Las capas y la caché las trabajé en el ejercicio 2, el bind mount en el ejercicio 5 y Compose en el ejercicio 3. La actividad que propone cambiar algo y volver a construir la hice cambiando la versión del navegador en el Dockerfile: al reconstruir se ve que los pasos de antes de esa línea siguen saliendo como CACHED y los de después se vuelven a ejecutar. La imagen base no se descarga otra vez.</w:t>
       </w:r>
     </w:p>
     <w:p>
@@ -10867,7 +8651,7 @@
         <w:pStyle w:val="Heading1"/>
       </w:pPr>
       <w:r>
-        <w:t>Relación de Evidencias y Criterios de Evaluación</w:t>
+        <w:t>Qué Captura Corresponde a Cada Criterio</w:t>
       </w:r>
     </w:p>
     <w:p>
@@ -10883,7 +8667,7 @@
           <w:i w:val="0"/>
           <w:sz w:val="24"/>
         </w:rPr>
-        <w:t>La Tabla 7 relaciona cada figura del presente informe con el criterio de evaluación de la sección 19 de la guía que dicha evidencia acredita.</w:t>
+        <w:t>Armé esta tabla para revisar que no me estuviera quedando faltando ninguna evidencia de las que pide la sección 19.</w:t>
       </w:r>
     </w:p>
     <w:p>
@@ -10900,7 +8684,7 @@
           <w:i w:val="0"/>
           <w:sz w:val="24"/>
         </w:rPr>
-        <w:t>Tabla 7</w:t>
+        <w:t>Tabla 4</w:t>
       </w:r>
     </w:p>
     <w:p>
@@ -10917,7 +8701,7 @@
           <w:i/>
           <w:sz w:val="24"/>
         </w:rPr>
-        <w:t>Relación entre las evidencias gráficas y los criterios de evaluación</w:t>
+        <w:t>Las capturas y el criterio que le corresponde a cada una</w:t>
       </w:r>
     </w:p>
     <w:tbl>
@@ -10983,7 +8767,7 @@
                 <w:b/>
                 <w:sz w:val="20"/>
               </w:rPr>
-              <w:t>Evidencia</w:t>
+              <w:t>Qué muestra</w:t>
             </w:r>
           </w:p>
         </w:tc>
@@ -11006,7 +8790,7 @@
                 <w:b/>
                 <w:sz w:val="20"/>
               </w:rPr>
-              <w:t>Criterio de evaluación acreditado</w:t>
+              <w:t>Criterio de la guía</w:t>
             </w:r>
           </w:p>
         </w:tc>
@@ -11046,7 +8830,7 @@
                 <w:rFonts w:ascii="Times New Roman" w:hAnsi="Times New Roman"/>
                 <w:sz w:val="20"/>
               </w:rPr>
-              <w:t>Motor instalado, activo, habilitado y accesible sin privilegios de superusuario</w:t>
+              <w:t>Docker instalado, activo y funcionando sin sudo</w:t>
             </w:r>
           </w:p>
         </w:tc>
@@ -11065,7 +8849,7 @@
                 <w:rFonts w:ascii="Times New Roman" w:hAnsi="Times New Roman"/>
                 <w:sz w:val="20"/>
               </w:rPr>
-              <w:t>Instala Docker y se orienta correctamente en su entorno de operación</w:t>
+              <w:t>Instala Docker y se orienta en su entorno</w:t>
             </w:r>
           </w:p>
         </w:tc>
@@ -11105,7 +8889,7 @@
                 <w:rFonts w:ascii="Times New Roman" w:hAnsi="Times New Roman"/>
                 <w:sz w:val="20"/>
               </w:rPr>
-              <w:t>Salida de docker info con los mecanismos de aislamiento del núcleo</w:t>
+              <w:t>docker info con los mecanismos de aislamiento</w:t>
             </w:r>
           </w:p>
         </w:tc>
@@ -11124,7 +8908,7 @@
                 <w:rFonts w:ascii="Times New Roman" w:hAnsi="Times New Roman"/>
                 <w:sz w:val="20"/>
               </w:rPr>
-              <w:t>Comprende los componentes del motor y su modelo de aislamiento</w:t>
+              <w:t>Entiende los componentes del motor</w:t>
             </w:r>
           </w:p>
         </w:tc>
@@ -11164,7 +8948,7 @@
                 <w:rFonts w:ascii="Times New Roman" w:hAnsi="Times New Roman"/>
                 <w:sz w:val="20"/>
               </w:rPr>
-              <w:t>Ejecución de hello-world y de un contenedor con puerto publicado</w:t>
+              <w:t>hello-world y un contenedor con puerto publicado</w:t>
             </w:r>
           </w:p>
         </w:tc>
@@ -11183,7 +8967,7 @@
                 <w:rFonts w:ascii="Times New Roman" w:hAnsi="Times New Roman"/>
                 <w:sz w:val="20"/>
               </w:rPr>
-              <w:t>Ejecuta imagenes y verifica el funcionamiento del motor</w:t>
+              <w:t>Ejecuta imágenes y comprueba que el motor sirve</w:t>
             </w:r>
           </w:p>
         </w:tc>
@@ -11223,7 +9007,7 @@
                 <w:rFonts w:ascii="Times New Roman" w:hAnsi="Times New Roman"/>
                 <w:sz w:val="20"/>
               </w:rPr>
-              <w:t>Construcción de la imagen, aprovechamiento de la caché y revisión de capas</w:t>
+              <w:t>Construcción de la imagen, la caché y las capas</w:t>
             </w:r>
           </w:p>
         </w:tc>
@@ -11242,7 +9026,7 @@
                 <w:rFonts w:ascii="Times New Roman" w:hAnsi="Times New Roman"/>
                 <w:sz w:val="20"/>
               </w:rPr>
-              <w:t>Construye la imagen y analiza el proceso desde el historial de construcciones</w:t>
+              <w:t>Construye la imagen y analiza el proceso</w:t>
             </w:r>
           </w:p>
         </w:tc>
@@ -11282,7 +9066,7 @@
                 <w:rFonts w:ascii="Times New Roman" w:hAnsi="Times New Roman"/>
                 <w:sz w:val="20"/>
               </w:rPr>
-              <w:t>Servicios de Compose en ejecución y aplicación accesible por el puerto publicado</w:t>
+              <w:t>Compose levantado y la aplicación en el navegador</w:t>
             </w:r>
           </w:p>
         </w:tc>
@@ -11301,7 +9085,7 @@
                 <w:rFonts w:ascii="Times New Roman" w:hAnsi="Times New Roman"/>
                 <w:sz w:val="20"/>
               </w:rPr>
-              <w:t>Ejecuta y comprueba el proyecto mediante Compose y el puerto publicado</w:t>
+              <w:t>Ejecuta y comprueba el proyecto por el puerto publicado</w:t>
             </w:r>
           </w:p>
         </w:tc>
@@ -11341,7 +9125,7 @@
                 <w:rFonts w:ascii="Times New Roman" w:hAnsi="Times New Roman"/>
                 <w:sz w:val="20"/>
               </w:rPr>
-              <w:t>Variables de entorno verificadas sin exposición de valores sensibles</w:t>
+              <w:t>Variables comprobadas sin mostrar los valores secretos</w:t>
             </w:r>
           </w:p>
         </w:tc>
@@ -11360,7 +9144,7 @@
                 <w:rFonts w:ascii="Times New Roman" w:hAnsi="Times New Roman"/>
                 <w:sz w:val="20"/>
               </w:rPr>
-              <w:t>Distingue variables opcionales, predeterminadas y sensibles; entrega evidencias sin exponer información sensible</w:t>
+              <w:t>Distingue variables normales y sensibles, y entrega evidencias sin exponer información</w:t>
             </w:r>
           </w:p>
         </w:tc>
@@ -11400,7 +9184,7 @@
                 <w:rFonts w:ascii="Times New Roman" w:hAnsi="Times New Roman"/>
                 <w:sz w:val="20"/>
               </w:rPr>
-              <w:t>Cambió de tipo de montaje y persistencia comprobada tras el reinicio</w:t>
+              <w:t>El cambio de montaje y los datos después de reiniciar</w:t>
             </w:r>
           </w:p>
         </w:tc>
@@ -11419,7 +9203,7 @@
                 <w:rFonts w:ascii="Times New Roman" w:hAnsi="Times New Roman"/>
                 <w:sz w:val="20"/>
               </w:rPr>
-              <w:t>Configura y verifica la persistencia mediante el montaje declarado en compose.yaml</w:t>
+              <w:t>Configura y verifica la persistencia</w:t>
             </w:r>
           </w:p>
         </w:tc>
@@ -11459,7 +9243,7 @@
                 <w:rFonts w:ascii="Times New Roman" w:hAnsi="Times New Roman"/>
                 <w:sz w:val="20"/>
               </w:rPr>
-              <w:t>Conflicto de puerto, diagnóstico y resolución</w:t>
+              <w:t>Puerto ocupado, diagnóstico y solución</w:t>
             </w:r>
           </w:p>
         </w:tc>
@@ -11478,7 +9262,7 @@
                 <w:rFonts w:ascii="Times New Roman" w:hAnsi="Times New Roman"/>
                 <w:sz w:val="20"/>
               </w:rPr>
-              <w:t>Interpreta registros y corrige errores frecuentes</w:t>
+              <w:t>Interpreta errores y los corrige</w:t>
             </w:r>
           </w:p>
         </w:tc>
@@ -11506,7 +9290,7 @@
           <w:i w:val="0"/>
           <w:sz w:val="20"/>
         </w:rPr>
-        <w:t>Elaboración propia a partir de los criterios enunciados en la sección 19 de la guía del SENA.</w:t>
+        <w:t>Elaboración propia a partir de la sección 19 de la guía.</w:t>
       </w:r>
     </w:p>
     <w:p>
@@ -11529,7 +9313,7 @@
           <w:i w:val="0"/>
           <w:sz w:val="24"/>
         </w:rPr>
-        <w:t>Antes de la entrega debe verificarse que ninguna captura exhiba el valor de una variable sensible. El propio criterio de evaluación lo exige de forma expresa y, en este proyecto, constituye además una regla de arquitectura documentada.</w:t>
+        <w:t>Antes de entregar hay que revisar que en ninguna captura se alcance a leer una clave. La misma guía lo pide en los criterios de evaluación.</w:t>
       </w:r>
     </w:p>
     <w:p>
@@ -11558,7 +9342,7 @@
           <w:i w:val="0"/>
           <w:sz w:val="24"/>
         </w:rPr>
-        <w:t>El desarrollo del taller sobre un entorno GNU/Linux no supuso una reducción del alcance formativo sino un desplazamiento del punto de observación. Los conceptos evaluados por la guía (imagen, contenedor, Dockerfile, contexto de construcción, publicación de puertos, variables de entorno, montajes, persistencia, registros y orquestación mediante Compose) se ejercitaron en su totalidad; lo que cambió fue la vía de acceso al motor y la aplicación empleada como caso de estudio.</w:t>
+        <w:t>Hacer el taller en Linux no me quitó contenido, me cambió el punto de vista. Los temas de la guía los trabajé todos: imagen, contenedor, Dockerfile, contexto de construcción, puertos, variables de entorno, montajes, persistencia, logs y Compose. Lo que cambió fue que en vez de darle clic a una pantalla tuve que escribir el comando.</w:t>
       </w:r>
     </w:p>
     <w:p>
@@ -11574,7 +9358,7 @@
           <w:i w:val="0"/>
           <w:sz w:val="24"/>
         </w:rPr>
-        <w:t>Operar Docker Engine de forma directa expuso elementos que la interfaz gráfica encapsula y que resultan pertinentes para la formación profesional: la naturaleza del motor como servicio del sistema, el modelo de permisos basado en el socket del demonio y sus implicaciones de seguridad, la propiedad de los archivos generados en montajes de enlace, y la posibilidad de diagnosticar conflictos de puerto a nivel del sistema operativo y no únicamente entre contenedores.</w:t>
+        <w:t>Manejar el motor directo me mostró cosas que la interfaz gráfica esconde y que creo que vale la pena saber: que Docker es un servicio del sistema y no un programa que uno abre, que estar en el grupo docker es casi ser administrador, que los archivos de un bind mount quedan con el usuario del contenedor, y que un puerto ocupado se puede diagnosticar a nivel de todo el sistema y no solo entre contenedores.</w:t>
       </w:r>
     </w:p>
     <w:p>
@@ -11590,7 +9374,7 @@
           <w:i w:val="0"/>
           <w:sz w:val="24"/>
         </w:rPr>
-        <w:t>La aplicación del taller a un proyecto real permitió además contrastar el ejemplo didáctico con prácticas de mayor exigencia: la fijación de imagenes por digest criptográfico frente al uso de etiquetas mutables, la publicación de puertos restringida a la interfaz de bucle local, la reducción del conjunto de capacidades del núcleo otorgadas al contenedor, y la exclusión sistemática de secretos del contexto de construcción. Finalmente, la delimitación del ámbito de aplicación de la herramienta, es decir, el reconocimiento de que la contenerización resuelve el entorno de desarrollo y de pruebas de este proyecto pero no su despliegue en producción, constituye en si misma un resultado de aprendizaje.</w:t>
+        <w:t>También me sirvió comparar el ejemplo de la guía con mi proyecto, porque me obligó a explicar decisiones que ya estaban tomadas y que nunca había puesto por escrito: por qué fijo las imágenes con un digest, por qué publico los puertos solo en mi computador, y por qué mi aplicación usa Docker para desarrollar pero no para publicarse. Esa última fue la que más me costó justificar y creo que es la que más aprendí, porque saber dónde no usar una herramienta también es parte de saber usarla.</w:t>
       </w:r>
     </w:p>
     <w:p>

</xml_diff>

<commit_message>
fix: remove unnecessary page breaks from Docker workshop document
</commit_message>
<xml_diff>
--- a/docs/manuales-sena/Taller-Docker-Linux-CodeByMike.docx
+++ b/docs/manuales-sena/Taller-Docker-Linux-CodeByMike.docx
@@ -957,11 +957,6 @@
       </w:r>
     </w:p>
     <w:p>
-      <w:r>
-        <w:br w:type="page"/>
-      </w:r>
-    </w:p>
-    <w:p>
       <w:pPr>
         <w:pStyle w:val="Heading1"/>
       </w:pPr>
@@ -3120,11 +3115,6 @@
         <w:ind w:firstLine="720"/>
         <w:jc w:val="left"/>
       </w:pPr>
-    </w:p>
-    <w:p>
-      <w:r>
-        <w:br w:type="page"/>
-      </w:r>
     </w:p>
     <w:p>
       <w:pPr>
@@ -3822,11 +3812,6 @@
       </w:pPr>
     </w:p>
     <w:p>
-      <w:r>
-        <w:br w:type="page"/>
-      </w:r>
-    </w:p>
-    <w:p>
       <w:pPr>
         <w:pStyle w:val="Heading1"/>
       </w:pPr>
@@ -8525,11 +8510,6 @@
       </w:pPr>
     </w:p>
     <w:p>
-      <w:r>
-        <w:br w:type="page"/>
-      </w:r>
-    </w:p>
-    <w:p>
       <w:pPr>
         <w:pStyle w:val="Heading1"/>
       </w:pPr>
@@ -8639,11 +8619,6 @@
           <w:sz w:val="24"/>
         </w:rPr>
         <w:t>Las capas y la caché las trabajé en el ejercicio 2, el bind mount en el ejercicio 5 y Compose en el ejercicio 3. La actividad que propone cambiar algo y volver a construir la hice cambiando la versión del navegador en el Dockerfile: al reconstruir se ve que los pasos de antes de esa línea siguen saliendo como CACHED y los de después se vuelven a ejecutar. La imagen base no se descarga otra vez.</w:t>
-      </w:r>
-    </w:p>
-    <w:p>
-      <w:r>
-        <w:br w:type="page"/>
       </w:r>
     </w:p>
     <w:p>
@@ -9314,11 +9289,6 @@
           <w:sz w:val="24"/>
         </w:rPr>
         <w:t>Antes de entregar hay que revisar que en ninguna captura se alcance a leer una clave. La misma guía lo pide en los criterios de evaluación.</w:t>
-      </w:r>
-    </w:p>
-    <w:p>
-      <w:r>
-        <w:br w:type="page"/>
       </w:r>
     </w:p>
     <w:p>

</xml_diff>

<commit_message>
feat: add scripts for Docker workshop to automate command execution and persistence testing
</commit_message>
<xml_diff>
--- a/docs/manuales-sena/Taller-Docker-Linux-CodeByMike.docx
+++ b/docs/manuales-sena/Taller-Docker-Linux-CodeByMike.docx
@@ -7101,7 +7101,7 @@
           <w:i w:val="0"/>
           <w:sz w:val="24"/>
         </w:rPr>
-        <w:t>La prueba de que los datos aguantan es la misma que propone la guía con el récord del juego: guardar algo, reiniciar y volver a mirar. En mi caso inserté una fila en una tabla de prueba, reinicié el contenedor y la volví a consultar. Antes del reinicio tenía una fila y después del reinicio seguía teniendo esa misma fila, con el texto intacto.</w:t>
+        <w:t>La prueba de que los datos aguantan es la misma que propone la guía con el récord del juego: guardar algo, reiniciar y volver a mirar. Para no escribir la consulta a mano cada vez armé un script pequeño que inserta una fila y otro modo que la lee.</w:t>
       </w:r>
     </w:p>
     <w:tbl>
@@ -7137,7 +7137,33 @@
                 <w:rFonts w:ascii="Courier New" w:hAnsi="Courier New"/>
                 <w:sz w:val="20"/>
               </w:rPr>
+              <w:t>node scripts/prueba-persistencia.mjs escribir</w:t>
+            </w:r>
+          </w:p>
+          <w:p>
+            <w:pPr>
+              <w:spacing w:line="240" w:lineRule="auto" w:after="0" w:before="0"/>
+              <w:ind w:firstLine="0"/>
+            </w:pPr>
+            <w:r>
+              <w:rPr>
+                <w:rFonts w:ascii="Courier New" w:hAnsi="Courier New"/>
+                <w:sz w:val="20"/>
+              </w:rPr>
               <w:t>docker compose restart libsql-main</w:t>
+            </w:r>
+          </w:p>
+          <w:p>
+            <w:pPr>
+              <w:spacing w:line="240" w:lineRule="auto" w:after="0" w:before="0"/>
+              <w:ind w:firstLine="0"/>
+            </w:pPr>
+            <w:r>
+              <w:rPr>
+                <w:rFonts w:ascii="Courier New" w:hAnsi="Courier New"/>
+                <w:sz w:val="20"/>
+              </w:rPr>
+              <w:t>node scripts/prueba-persistencia.mjs leer</w:t>
             </w:r>
           </w:p>
           <w:p>
@@ -7162,6 +7188,22 @@
         <w:ind w:firstLine="720"/>
         <w:jc w:val="left"/>
       </w:pPr>
+    </w:p>
+    <w:p>
+      <w:pPr>
+        <w:spacing w:line="480" w:lineRule="auto" w:after="0"/>
+        <w:ind w:firstLine="720"/>
+        <w:jc w:val="left"/>
+      </w:pPr>
+      <w:r>
+        <w:rPr>
+          <w:rFonts w:ascii="Times New Roman" w:hAnsi="Times New Roman"/>
+          <w:b w:val="0"/>
+          <w:i w:val="0"/>
+          <w:sz w:val="24"/>
+        </w:rPr>
+        <w:t>Antes del reinicio la tabla tenía una fila y después seguía teniendo la misma, con el texto y la fecha intactos.</w:t>
+      </w:r>
     </w:p>
     <w:p>
       <w:pPr>
@@ -7731,7 +7773,7 @@
                 <w:rFonts w:ascii="Courier New" w:hAnsi="Courier New"/>
                 <w:sz w:val="18"/>
               </w:rPr>
-              <w:t># insertar una fila, reiniciar y volver a consultar</w:t>
+              <w:t>node scripts/prueba-persistencia.mjs escribir</w:t>
             </w:r>
           </w:p>
           <w:p>
@@ -7746,6 +7788,20 @@
                 <w:sz w:val="18"/>
               </w:rPr>
               <w:t>docker compose restart libsql-main</w:t>
+            </w:r>
+          </w:p>
+          <w:p>
+            <w:pPr>
+              <w:keepNext/>
+              <w:spacing w:line="240" w:lineRule="auto" w:after="0"/>
+              <w:ind w:firstLine="0" w:left="340"/>
+            </w:pPr>
+            <w:r>
+              <w:rPr>
+                <w:rFonts w:ascii="Courier New" w:hAnsi="Courier New"/>
+                <w:sz w:val="18"/>
+              </w:rPr>
+              <w:t>node scripts/prueba-persistencia.mjs leer</w:t>
             </w:r>
           </w:p>
           <w:p>

</xml_diff>

<commit_message>
feat: enhance document generation script with index and section heading functions
</commit_message>
<xml_diff>
--- a/docs/manuales-sena/Taller-Docker-Linux-CodeByMike.docx
+++ b/docs/manuales-sena/Taller-Docker-Linux-CodeByMike.docx
@@ -168,18 +168,6 @@
           <w:sz w:val="24"/>
         </w:rPr>
         <w:t>Tabla de Contenido</w:t>
-      </w:r>
-    </w:p>
-    <w:p>
-      <w:pPr>
-        <w:ind w:firstLine="0"/>
-      </w:pPr>
-      <w:r>
-        <w:fldChar w:fldCharType="begin"/>
-        <w:instrText xml:space="preserve">TOC \o "1-3" \h \z \u</w:instrText>
-        <w:fldChar w:fldCharType="separate"/>
-        <w:t>Actualice la tabla de contenido en Word: clic derecho &gt; Actualizar campos.</w:t>
-        <w:fldChar w:fldCharType="end"/>
       </w:r>
     </w:p>
     <w:p>

</xml_diff>

<commit_message>
feat: add table of contents generation to document creation script
</commit_message>
<xml_diff>
--- a/docs/manuales-sena/Taller-Docker-Linux-CodeByMike.docx
+++ b/docs/manuales-sena/Taller-Docker-Linux-CodeByMike.docx
@@ -170,6 +170,535 @@
         <w:t>Tabla de Contenido</w:t>
       </w:r>
     </w:p>
+    <w:p>
+      <w:pPr>
+        <w:tabs>
+          <w:tab w:pos="9071" w:val="right" w:leader="dot"/>
+        </w:tabs>
+        <w:spacing w:line="240" w:lineRule="auto" w:after="120"/>
+        <w:ind w:firstLine="0" w:left="0"/>
+      </w:pPr>
+      <w:r>
+        <w:rPr>
+          <w:rFonts w:ascii="Times New Roman" w:hAnsi="Times New Roman"/>
+          <w:b/>
+          <w:sz w:val="24"/>
+        </w:rPr>
+        <w:t>Introducción</w:t>
+      </w:r>
+      <w:r>
+        <w:rPr>
+          <w:rFonts w:ascii="Times New Roman" w:hAnsi="Times New Roman"/>
+          <w:sz w:val="24"/>
+        </w:rPr>
+        <w:tab/>
+      </w:r>
+    </w:p>
+    <w:p>
+      <w:pPr>
+        <w:tabs>
+          <w:tab w:pos="9071" w:val="right" w:leader="dot"/>
+        </w:tabs>
+        <w:spacing w:line="240" w:lineRule="auto" w:after="120"/>
+        <w:ind w:firstLine="0" w:left="0"/>
+      </w:pPr>
+      <w:r>
+        <w:rPr>
+          <w:rFonts w:ascii="Times New Roman" w:hAnsi="Times New Roman"/>
+          <w:b/>
+          <w:sz w:val="24"/>
+        </w:rPr>
+        <w:t>Por Qué Mi Instalación Se Ve Distinta a la de la Guía</w:t>
+      </w:r>
+      <w:r>
+        <w:rPr>
+          <w:rFonts w:ascii="Times New Roman" w:hAnsi="Times New Roman"/>
+          <w:sz w:val="24"/>
+        </w:rPr>
+        <w:tab/>
+      </w:r>
+    </w:p>
+    <w:p>
+      <w:pPr>
+        <w:tabs>
+          <w:tab w:pos="9071" w:val="right" w:leader="dot"/>
+        </w:tabs>
+        <w:spacing w:line="240" w:lineRule="auto" w:after="120"/>
+        <w:ind w:firstLine="0" w:left="0"/>
+      </w:pPr>
+      <w:r>
+        <w:rPr>
+          <w:rFonts w:ascii="Times New Roman" w:hAnsi="Times New Roman"/>
+          <w:b/>
+          <w:sz w:val="24"/>
+        </w:rPr>
+        <w:t>Dejar Docker Funcionando en Ubuntu</w:t>
+      </w:r>
+      <w:r>
+        <w:rPr>
+          <w:rFonts w:ascii="Times New Roman" w:hAnsi="Times New Roman"/>
+          <w:sz w:val="24"/>
+        </w:rPr>
+        <w:tab/>
+      </w:r>
+    </w:p>
+    <w:p>
+      <w:pPr>
+        <w:tabs>
+          <w:tab w:pos="9071" w:val="right" w:leader="dot"/>
+        </w:tabs>
+        <w:spacing w:line="240" w:lineRule="auto" w:after="120"/>
+        <w:ind w:firstLine="0" w:left="454"/>
+      </w:pPr>
+      <w:r>
+        <w:rPr>
+          <w:rFonts w:ascii="Times New Roman" w:hAnsi="Times New Roman"/>
+          <w:b w:val="0"/>
+          <w:sz w:val="24"/>
+        </w:rPr>
+        <w:t>Instalación</w:t>
+      </w:r>
+      <w:r>
+        <w:rPr>
+          <w:rFonts w:ascii="Times New Roman" w:hAnsi="Times New Roman"/>
+          <w:sz w:val="24"/>
+        </w:rPr>
+        <w:tab/>
+      </w:r>
+    </w:p>
+    <w:p>
+      <w:pPr>
+        <w:tabs>
+          <w:tab w:pos="9071" w:val="right" w:leader="dot"/>
+        </w:tabs>
+        <w:spacing w:line="240" w:lineRule="auto" w:after="120"/>
+        <w:ind w:firstLine="0" w:left="454"/>
+      </w:pPr>
+      <w:r>
+        <w:rPr>
+          <w:rFonts w:ascii="Times New Roman" w:hAnsi="Times New Roman"/>
+          <w:b w:val="0"/>
+          <w:sz w:val="24"/>
+        </w:rPr>
+        <w:t>Los Dos Pasos que Sí Son Propios de Linux</w:t>
+      </w:r>
+      <w:r>
+        <w:rPr>
+          <w:rFonts w:ascii="Times New Roman" w:hAnsi="Times New Roman"/>
+          <w:sz w:val="24"/>
+        </w:rPr>
+        <w:tab/>
+      </w:r>
+    </w:p>
+    <w:p>
+      <w:pPr>
+        <w:tabs>
+          <w:tab w:pos="9071" w:val="right" w:leader="dot"/>
+        </w:tabs>
+        <w:spacing w:line="240" w:lineRule="auto" w:after="120"/>
+        <w:ind w:firstLine="0" w:left="454"/>
+      </w:pPr>
+      <w:r>
+        <w:rPr>
+          <w:rFonts w:ascii="Times New Roman" w:hAnsi="Times New Roman"/>
+          <w:b w:val="0"/>
+          <w:sz w:val="24"/>
+        </w:rPr>
+        <w:t>Comprobar que el Motor Responde</w:t>
+      </w:r>
+      <w:r>
+        <w:rPr>
+          <w:rFonts w:ascii="Times New Roman" w:hAnsi="Times New Roman"/>
+          <w:sz w:val="24"/>
+        </w:rPr>
+        <w:tab/>
+      </w:r>
+    </w:p>
+    <w:p>
+      <w:pPr>
+        <w:tabs>
+          <w:tab w:pos="9071" w:val="right" w:leader="dot"/>
+        </w:tabs>
+        <w:spacing w:line="240" w:lineRule="auto" w:after="120"/>
+        <w:ind w:firstLine="0" w:left="454"/>
+      </w:pPr>
+      <w:r>
+        <w:rPr>
+          <w:rFonts w:ascii="Times New Roman" w:hAnsi="Times New Roman"/>
+          <w:b w:val="0"/>
+          <w:sz w:val="24"/>
+        </w:rPr>
+        <w:t>Cada Pantalla de Docker Desktop y su Comando</w:t>
+      </w:r>
+      <w:r>
+        <w:rPr>
+          <w:rFonts w:ascii="Times New Roman" w:hAnsi="Times New Roman"/>
+          <w:sz w:val="24"/>
+        </w:rPr>
+        <w:tab/>
+      </w:r>
+    </w:p>
+    <w:p>
+      <w:pPr>
+        <w:tabs>
+          <w:tab w:pos="9071" w:val="right" w:leader="dot"/>
+        </w:tabs>
+        <w:spacing w:line="240" w:lineRule="auto" w:after="120"/>
+        <w:ind w:firstLine="0" w:left="0"/>
+      </w:pPr>
+      <w:r>
+        <w:rPr>
+          <w:rFonts w:ascii="Times New Roman" w:hAnsi="Times New Roman"/>
+          <w:b/>
+          <w:sz w:val="24"/>
+        </w:rPr>
+        <w:t>Qué Aplicación Usé en Lugar de Dino Run</w:t>
+      </w:r>
+      <w:r>
+        <w:rPr>
+          <w:rFonts w:ascii="Times New Roman" w:hAnsi="Times New Roman"/>
+          <w:sz w:val="24"/>
+        </w:rPr>
+        <w:tab/>
+      </w:r>
+    </w:p>
+    <w:p>
+      <w:pPr>
+        <w:tabs>
+          <w:tab w:pos="9071" w:val="right" w:leader="dot"/>
+        </w:tabs>
+        <w:spacing w:line="240" w:lineRule="auto" w:after="120"/>
+        <w:ind w:firstLine="0" w:left="0"/>
+      </w:pPr>
+      <w:r>
+        <w:rPr>
+          <w:rFonts w:ascii="Times New Roman" w:hAnsi="Times New Roman"/>
+          <w:b/>
+          <w:sz w:val="24"/>
+        </w:rPr>
+        <w:t>Los Seis Ejercicios</w:t>
+      </w:r>
+      <w:r>
+        <w:rPr>
+          <w:rFonts w:ascii="Times New Roman" w:hAnsi="Times New Roman"/>
+          <w:sz w:val="24"/>
+        </w:rPr>
+        <w:tab/>
+      </w:r>
+    </w:p>
+    <w:p>
+      <w:pPr>
+        <w:tabs>
+          <w:tab w:pos="9071" w:val="right" w:leader="dot"/>
+        </w:tabs>
+        <w:spacing w:line="240" w:lineRule="auto" w:after="120"/>
+        <w:ind w:firstLine="0" w:left="454"/>
+      </w:pPr>
+      <w:r>
+        <w:rPr>
+          <w:rFonts w:ascii="Times New Roman" w:hAnsi="Times New Roman"/>
+          <w:b w:val="0"/>
+          <w:sz w:val="24"/>
+        </w:rPr>
+        <w:t>Ejercicio 1. Comprobar que el Motor Sirve</w:t>
+      </w:r>
+      <w:r>
+        <w:rPr>
+          <w:rFonts w:ascii="Times New Roman" w:hAnsi="Times New Roman"/>
+          <w:sz w:val="24"/>
+        </w:rPr>
+        <w:tab/>
+      </w:r>
+    </w:p>
+    <w:p>
+      <w:pPr>
+        <w:tabs>
+          <w:tab w:pos="9071" w:val="right" w:leader="dot"/>
+        </w:tabs>
+        <w:spacing w:line="240" w:lineRule="auto" w:after="120"/>
+        <w:ind w:firstLine="0" w:left="454"/>
+      </w:pPr>
+      <w:r>
+        <w:rPr>
+          <w:rFonts w:ascii="Times New Roman" w:hAnsi="Times New Roman"/>
+          <w:b w:val="0"/>
+          <w:sz w:val="24"/>
+        </w:rPr>
+        <w:t>Ejercicio 2. Construir la Imagen y Revisarla</w:t>
+      </w:r>
+      <w:r>
+        <w:rPr>
+          <w:rFonts w:ascii="Times New Roman" w:hAnsi="Times New Roman"/>
+          <w:sz w:val="24"/>
+        </w:rPr>
+        <w:tab/>
+      </w:r>
+    </w:p>
+    <w:p>
+      <w:pPr>
+        <w:tabs>
+          <w:tab w:pos="9071" w:val="right" w:leader="dot"/>
+        </w:tabs>
+        <w:spacing w:line="240" w:lineRule="auto" w:after="120"/>
+        <w:ind w:firstLine="0" w:left="454"/>
+      </w:pPr>
+      <w:r>
+        <w:rPr>
+          <w:rFonts w:ascii="Times New Roman" w:hAnsi="Times New Roman"/>
+          <w:b w:val="0"/>
+          <w:sz w:val="24"/>
+        </w:rPr>
+        <w:t>Ejercicio 3. Levantar Todo con Docker Compose</w:t>
+      </w:r>
+      <w:r>
+        <w:rPr>
+          <w:rFonts w:ascii="Times New Roman" w:hAnsi="Times New Roman"/>
+          <w:sz w:val="24"/>
+        </w:rPr>
+        <w:tab/>
+      </w:r>
+    </w:p>
+    <w:p>
+      <w:pPr>
+        <w:tabs>
+          <w:tab w:pos="9071" w:val="right" w:leader="dot"/>
+        </w:tabs>
+        <w:spacing w:line="240" w:lineRule="auto" w:after="120"/>
+        <w:ind w:firstLine="0" w:left="454"/>
+      </w:pPr>
+      <w:r>
+        <w:rPr>
+          <w:rFonts w:ascii="Times New Roman" w:hAnsi="Times New Roman"/>
+          <w:b w:val="0"/>
+          <w:sz w:val="24"/>
+        </w:rPr>
+        <w:t>Ejercicio 4. Las Variables de Entorno y la Clave Secreta</w:t>
+      </w:r>
+      <w:r>
+        <w:rPr>
+          <w:rFonts w:ascii="Times New Roman" w:hAnsi="Times New Roman"/>
+          <w:sz w:val="24"/>
+        </w:rPr>
+        <w:tab/>
+      </w:r>
+    </w:p>
+    <w:p>
+      <w:pPr>
+        <w:tabs>
+          <w:tab w:pos="9071" w:val="right" w:leader="dot"/>
+        </w:tabs>
+        <w:spacing w:line="240" w:lineRule="auto" w:after="120"/>
+        <w:ind w:firstLine="0" w:left="454"/>
+      </w:pPr>
+      <w:r>
+        <w:rPr>
+          <w:rFonts w:ascii="Times New Roman" w:hAnsi="Times New Roman"/>
+          <w:b w:val="0"/>
+          <w:sz w:val="24"/>
+        </w:rPr>
+        <w:t>Ejercicio 5. Que los Datos No Se Pierdan</w:t>
+      </w:r>
+      <w:r>
+        <w:rPr>
+          <w:rFonts w:ascii="Times New Roman" w:hAnsi="Times New Roman"/>
+          <w:sz w:val="24"/>
+        </w:rPr>
+        <w:tab/>
+      </w:r>
+    </w:p>
+    <w:p>
+      <w:pPr>
+        <w:tabs>
+          <w:tab w:pos="9071" w:val="right" w:leader="dot"/>
+        </w:tabs>
+        <w:spacing w:line="240" w:lineRule="auto" w:after="120"/>
+        <w:ind w:firstLine="0" w:left="454"/>
+      </w:pPr>
+      <w:r>
+        <w:rPr>
+          <w:rFonts w:ascii="Times New Roman" w:hAnsi="Times New Roman"/>
+          <w:b w:val="0"/>
+          <w:sz w:val="24"/>
+        </w:rPr>
+        <w:t>Ejercicio 6. El Puerto Ocupado</w:t>
+      </w:r>
+      <w:r>
+        <w:rPr>
+          <w:rFonts w:ascii="Times New Roman" w:hAnsi="Times New Roman"/>
+          <w:sz w:val="24"/>
+        </w:rPr>
+        <w:tab/>
+      </w:r>
+    </w:p>
+    <w:p>
+      <w:pPr>
+        <w:tabs>
+          <w:tab w:pos="9071" w:val="right" w:leader="dot"/>
+        </w:tabs>
+        <w:spacing w:line="240" w:lineRule="auto" w:after="120"/>
+        <w:ind w:firstLine="0" w:left="0"/>
+      </w:pPr>
+      <w:r>
+        <w:rPr>
+          <w:rFonts w:ascii="Times New Roman" w:hAnsi="Times New Roman"/>
+          <w:b/>
+          <w:sz w:val="24"/>
+        </w:rPr>
+        <w:t>Las Preguntas de la Sección 17</w:t>
+      </w:r>
+      <w:r>
+        <w:rPr>
+          <w:rFonts w:ascii="Times New Roman" w:hAnsi="Times New Roman"/>
+          <w:sz w:val="24"/>
+        </w:rPr>
+        <w:tab/>
+      </w:r>
+    </w:p>
+    <w:p>
+      <w:pPr>
+        <w:tabs>
+          <w:tab w:pos="9071" w:val="right" w:leader="dot"/>
+        </w:tabs>
+        <w:spacing w:line="240" w:lineRule="auto" w:after="120"/>
+        <w:ind w:firstLine="0" w:left="454"/>
+      </w:pPr>
+      <w:r>
+        <w:rPr>
+          <w:rFonts w:ascii="Times New Roman" w:hAnsi="Times New Roman"/>
+          <w:b w:val="0"/>
+          <w:sz w:val="24"/>
+        </w:rPr>
+        <w:t>Qué Significa Empaquetar una Aplicación</w:t>
+      </w:r>
+      <w:r>
+        <w:rPr>
+          <w:rFonts w:ascii="Times New Roman" w:hAnsi="Times New Roman"/>
+          <w:sz w:val="24"/>
+        </w:rPr>
+        <w:tab/>
+      </w:r>
+    </w:p>
+    <w:p>
+      <w:pPr>
+        <w:tabs>
+          <w:tab w:pos="9071" w:val="right" w:leader="dot"/>
+        </w:tabs>
+        <w:spacing w:line="240" w:lineRule="auto" w:after="120"/>
+        <w:ind w:firstLine="0" w:left="454"/>
+      </w:pPr>
+      <w:r>
+        <w:rPr>
+          <w:rFonts w:ascii="Times New Roman" w:hAnsi="Times New Roman"/>
+          <w:b w:val="0"/>
+          <w:sz w:val="24"/>
+        </w:rPr>
+        <w:t>Diferencia entre Imagen, Contenedor y Dockerfile</w:t>
+      </w:r>
+      <w:r>
+        <w:rPr>
+          <w:rFonts w:ascii="Times New Roman" w:hAnsi="Times New Roman"/>
+          <w:sz w:val="24"/>
+        </w:rPr>
+        <w:tab/>
+      </w:r>
+    </w:p>
+    <w:p>
+      <w:pPr>
+        <w:tabs>
+          <w:tab w:pos="9071" w:val="right" w:leader="dot"/>
+        </w:tabs>
+        <w:spacing w:line="240" w:lineRule="auto" w:after="120"/>
+        <w:ind w:firstLine="0" w:left="454"/>
+      </w:pPr>
+      <w:r>
+        <w:rPr>
+          <w:rFonts w:ascii="Times New Roman" w:hAnsi="Times New Roman"/>
+          <w:b w:val="0"/>
+          <w:sz w:val="24"/>
+        </w:rPr>
+        <w:t>Sobre las Pantallas y las Capas</w:t>
+      </w:r>
+      <w:r>
+        <w:rPr>
+          <w:rFonts w:ascii="Times New Roman" w:hAnsi="Times New Roman"/>
+          <w:sz w:val="24"/>
+        </w:rPr>
+        <w:tab/>
+      </w:r>
+    </w:p>
+    <w:p>
+      <w:pPr>
+        <w:tabs>
+          <w:tab w:pos="9071" w:val="right" w:leader="dot"/>
+        </w:tabs>
+        <w:spacing w:line="240" w:lineRule="auto" w:after="120"/>
+        <w:ind w:firstLine="0" w:left="0"/>
+      </w:pPr>
+      <w:r>
+        <w:rPr>
+          <w:rFonts w:ascii="Times New Roman" w:hAnsi="Times New Roman"/>
+          <w:b/>
+          <w:sz w:val="24"/>
+        </w:rPr>
+        <w:t>Qué Captura Corresponde a Cada Criterio</w:t>
+      </w:r>
+      <w:r>
+        <w:rPr>
+          <w:rFonts w:ascii="Times New Roman" w:hAnsi="Times New Roman"/>
+          <w:sz w:val="24"/>
+        </w:rPr>
+        <w:tab/>
+      </w:r>
+    </w:p>
+    <w:p>
+      <w:pPr>
+        <w:tabs>
+          <w:tab w:pos="9071" w:val="right" w:leader="dot"/>
+        </w:tabs>
+        <w:spacing w:line="240" w:lineRule="auto" w:after="120"/>
+        <w:ind w:firstLine="0" w:left="0"/>
+      </w:pPr>
+      <w:r>
+        <w:rPr>
+          <w:rFonts w:ascii="Times New Roman" w:hAnsi="Times New Roman"/>
+          <w:b/>
+          <w:sz w:val="24"/>
+        </w:rPr>
+        <w:t>Conclusiones</w:t>
+      </w:r>
+      <w:r>
+        <w:rPr>
+          <w:rFonts w:ascii="Times New Roman" w:hAnsi="Times New Roman"/>
+          <w:sz w:val="24"/>
+        </w:rPr>
+        <w:tab/>
+      </w:r>
+    </w:p>
+    <w:p>
+      <w:pPr>
+        <w:tabs>
+          <w:tab w:pos="9071" w:val="right" w:leader="dot"/>
+        </w:tabs>
+        <w:spacing w:line="240" w:lineRule="auto" w:after="120"/>
+        <w:ind w:firstLine="0" w:left="0"/>
+      </w:pPr>
+      <w:r>
+        <w:rPr>
+          <w:rFonts w:ascii="Times New Roman" w:hAnsi="Times New Roman"/>
+          <w:b/>
+          <w:sz w:val="24"/>
+        </w:rPr>
+        <w:t>Referencias</w:t>
+      </w:r>
+      <w:r>
+        <w:rPr>
+          <w:rFonts w:ascii="Times New Roman" w:hAnsi="Times New Roman"/>
+          <w:sz w:val="24"/>
+        </w:rPr>
+        <w:tab/>
+      </w:r>
+    </w:p>
+    <w:p/>
     <w:p>
       <w:r>
         <w:br w:type="page"/>

</xml_diff>

<commit_message>
feat: add index pages JSON file for Docker workshop documentation
</commit_message>
<xml_diff>
--- a/docs/manuales-sena/Taller-Docker-Linux-CodeByMike.docx
+++ b/docs/manuales-sena/Taller-Docker-Linux-CodeByMike.docx
@@ -192,6 +192,7 @@
           <w:sz w:val="24"/>
         </w:rPr>
         <w:tab/>
+        <w:t>4</w:t>
       </w:r>
     </w:p>
     <w:p>
@@ -216,6 +217,7 @@
           <w:sz w:val="24"/>
         </w:rPr>
         <w:tab/>
+        <w:t>5</w:t>
       </w:r>
     </w:p>
     <w:p>
@@ -240,6 +242,7 @@
           <w:sz w:val="24"/>
         </w:rPr>
         <w:tab/>
+        <w:t>6</w:t>
       </w:r>
     </w:p>
     <w:p>
@@ -264,6 +267,7 @@
           <w:sz w:val="24"/>
         </w:rPr>
         <w:tab/>
+        <w:t>6</w:t>
       </w:r>
     </w:p>
     <w:p>
@@ -288,6 +292,7 @@
           <w:sz w:val="24"/>
         </w:rPr>
         <w:tab/>
+        <w:t>7</w:t>
       </w:r>
     </w:p>
     <w:p>
@@ -312,6 +317,7 @@
           <w:sz w:val="24"/>
         </w:rPr>
         <w:tab/>
+        <w:t>8</w:t>
       </w:r>
     </w:p>
     <w:p>
@@ -336,6 +342,7 @@
           <w:sz w:val="24"/>
         </w:rPr>
         <w:tab/>
+        <w:t>9</w:t>
       </w:r>
     </w:p>
     <w:p>
@@ -360,6 +367,7 @@
           <w:sz w:val="24"/>
         </w:rPr>
         <w:tab/>
+        <w:t>10</w:t>
       </w:r>
     </w:p>
     <w:p>
@@ -384,6 +392,7 @@
           <w:sz w:val="24"/>
         </w:rPr>
         <w:tab/>
+        <w:t>11</w:t>
       </w:r>
     </w:p>
     <w:p>
@@ -408,6 +417,7 @@
           <w:sz w:val="24"/>
         </w:rPr>
         <w:tab/>
+        <w:t>11</w:t>
       </w:r>
     </w:p>
     <w:p>
@@ -432,6 +442,7 @@
           <w:sz w:val="24"/>
         </w:rPr>
         <w:tab/>
+        <w:t>12</w:t>
       </w:r>
     </w:p>
     <w:p>
@@ -456,6 +467,7 @@
           <w:sz w:val="24"/>
         </w:rPr>
         <w:tab/>
+        <w:t>15</w:t>
       </w:r>
     </w:p>
     <w:p>
@@ -480,6 +492,7 @@
           <w:sz w:val="24"/>
         </w:rPr>
         <w:tab/>
+        <w:t>17</w:t>
       </w:r>
     </w:p>
     <w:p>
@@ -504,6 +517,7 @@
           <w:sz w:val="24"/>
         </w:rPr>
         <w:tab/>
+        <w:t>19</w:t>
       </w:r>
     </w:p>
     <w:p>
@@ -528,6 +542,7 @@
           <w:sz w:val="24"/>
         </w:rPr>
         <w:tab/>
+        <w:t>21</w:t>
       </w:r>
     </w:p>
     <w:p>
@@ -552,6 +567,7 @@
           <w:sz w:val="24"/>
         </w:rPr>
         <w:tab/>
+        <w:t>23</w:t>
       </w:r>
     </w:p>
     <w:p>
@@ -576,6 +592,7 @@
           <w:sz w:val="24"/>
         </w:rPr>
         <w:tab/>
+        <w:t>23</w:t>
       </w:r>
     </w:p>
     <w:p>
@@ -600,6 +617,7 @@
           <w:sz w:val="24"/>
         </w:rPr>
         <w:tab/>
+        <w:t>23</w:t>
       </w:r>
     </w:p>
     <w:p>
@@ -624,6 +642,7 @@
           <w:sz w:val="24"/>
         </w:rPr>
         <w:tab/>
+        <w:t>24</w:t>
       </w:r>
     </w:p>
     <w:p>
@@ -648,6 +667,7 @@
           <w:sz w:val="24"/>
         </w:rPr>
         <w:tab/>
+        <w:t>24</w:t>
       </w:r>
     </w:p>
     <w:p>
@@ -672,6 +692,7 @@
           <w:sz w:val="24"/>
         </w:rPr>
         <w:tab/>
+        <w:t>25</w:t>
       </w:r>
     </w:p>
     <w:p>
@@ -696,6 +717,7 @@
           <w:sz w:val="24"/>
         </w:rPr>
         <w:tab/>
+        <w:t>26</w:t>
       </w:r>
     </w:p>
     <w:p/>

</xml_diff>